<commit_message>
Anleitung, README und Auslieferung auf Zeitexa umgestellt
</commit_message>
<xml_diff>
--- a/ANLEITUNG.docx
+++ b/ANLEITUNG.docx
@@ -7,12 +7,21 @@
         <w:pStyle w:val="Heading1"/>
       </w:pPr>
       <w:r>
-        <w:t>Zeitrax – Installations- und Bedienungsanleitung</w:t>
+        <w:t>Zeitexa – Installations- und Bedienungsanleitung</w:t>
       </w:r>
     </w:p>
     <w:p>
       <w:r>
-        <w:t xml:space="preserve">Zeitrax ist eine Stundenerfassungs-App, die komplett </w:t>
+        <w:t xml:space="preserve">Zeitexa ist eine Stundenerfassung für </w:t>
+      </w:r>
+      <w:r>
+        <w:rPr>
+          <w:b/>
+        </w:rPr>
+        <w:t>eine Person</w:t>
+      </w:r>
+      <w:r>
+        <w:t xml:space="preserve">. Sie funktioniert komplett </w:t>
       </w:r>
       <w:r>
         <w:rPr>
@@ -21,17 +30,17 @@
         <w:t>offline</w:t>
       </w:r>
       <w:r>
-        <w:t xml:space="preserve"> funktioniert. Alle Daten bleiben auf dem jeweiligen Gerät – es gibt keinen Server und kein Benutzerkonto im Internet. Internet wird nur für den optionalen Mail-Versand des Monatsberichts gebraucht.</w:t>
+        <w:t>: Alle Daten bleiben auf dem Gerät – es gibt keinen Server und kein Benutzerkonto im Internet. Internet wird nur für den optionalen Mail-Versand des Monatsberichts gebraucht.</w:t>
       </w:r>
     </w:p>
     <w:p>
       <w:r>
-        <w:t>Die Anleitung ist so aufgebaut, dass jeder nur seinen Teil lesen muss:</w:t>
+        <w:t>Es gibt keine Anmeldung, keinen Chef-Bereich und keine Benutzerverwaltung. Alle Einstellungen treffen Sie selbst.</w:t>
       </w:r>
     </w:p>
     <w:p>
       <w:r>
-        <w:t>| Abschnitt | Für wen |</w:t>
+        <w:t>| Abschnitt | Inhalt |</w:t>
       </w:r>
     </w:p>
     <w:p>
@@ -41,37 +50,27 @@
     </w:p>
     <w:p>
       <w:r>
-        <w:t>| 1 – Installation | Alle (je nach Gerät) |</w:t>
+        <w:t>| 1 – Installation | Windows, Android, iPhone |</w:t>
       </w:r>
     </w:p>
     <w:p>
       <w:r>
-        <w:t>| 2 – Freischaltung und Ersteinrichtung | Chef (einmalig pro Gerät) |</w:t>
+        <w:t>| 2 – Freischaltung und erster Start | einmalig pro Gerät |</w:t>
       </w:r>
     </w:p>
     <w:p>
       <w:r>
-        <w:t>| 3 – Anmeldung | Alle |</w:t>
+        <w:t>| 3 – Tägliche Bedienung | Monatsansicht, Tage eintragen, Monat weitergeben |</w:t>
       </w:r>
     </w:p>
     <w:p>
       <w:r>
-        <w:t>| 4 – Tägliche Bedienung | Mitarbeiter |</w:t>
+        <w:t>| 4 – Verwaltung | Profil, Optionen, Auswertung |</w:t>
       </w:r>
     </w:p>
     <w:p>
       <w:r>
-        <w:t>| 5 – Chef-Bereich | Chef |</w:t>
-      </w:r>
-    </w:p>
-    <w:p>
-      <w:r>
-        <w:t>| 6 – Firmen-Logo und Farben | Chef (optional) |</w:t>
-      </w:r>
-    </w:p>
-    <w:p>
-      <w:r>
-        <w:t>| 7 – Häufige Fragen | Alle |</w:t>
+        <w:t>| 5 – Häufige Fragen | |</w:t>
       </w:r>
     </w:p>
     <w:p>
@@ -100,7 +99,7 @@
         <w:t>Lizenzdatei</w:t>
       </w:r>
       <w:r>
-        <w:t xml:space="preserve"> für Ihre Firma freigeschaltet werden. Beides bekommen Sie vom Entwickler. Ohne Freischaltung lässt sich die App nicht verwenden.</w:t>
+        <w:t xml:space="preserve"> freigeschaltet werden. Beides bekommen Sie vom Entwickler; die Lizenz läuft auf Ihren Namen. Ohne Freischaltung lässt sich die App nicht verwenden.</w:t>
       </w:r>
     </w:p>
     <w:p>
@@ -147,7 +146,7 @@
           <w:rFonts w:ascii="Consolas" w:hAnsi="Consolas"/>
           <w:sz w:val="20"/>
         </w:rPr>
-        <w:t>Zeitrax_Setup_v….exe</w:t>
+        <w:t>Zeitexa_Setup_v….exe</w:t>
       </w:r>
       <w:r>
         <w:t>.</w:t>
@@ -215,7 +214,7 @@
         <w:pStyle w:val="ListNumber"/>
       </w:pPr>
       <w:r>
-        <w:t>Fertig – Zeitrax startet am Ende der Installation automatisch.</w:t>
+        <w:t>Fertig – Zeitexa startet am Ende der Installation automatisch.</w:t>
       </w:r>
     </w:p>
     <w:p>
@@ -233,7 +232,7 @@
           <w:rFonts w:ascii="Consolas" w:hAnsi="Consolas"/>
           <w:sz w:val="20"/>
         </w:rPr>
-        <w:t>Zeitrax_Windows_v….zip</w:t>
+        <w:t>Zeitexa_Windows_v….zip</w:t>
       </w:r>
       <w:r>
         <w:t>.</w:t>
@@ -267,7 +266,7 @@
         <w:rPr>
           <w:b/>
         </w:rPr>
-        <w:t>„Zeitrax starten"</w:t>
+        <w:t>„Zeitexa starten"</w:t>
       </w:r>
       <w:r>
         <w:t xml:space="preserve"> doppelklicken.</w:t>
@@ -289,14 +288,14 @@
         <w:t>Wo liegen die Daten?</w:t>
       </w:r>
       <w:r>
-        <w:t xml:space="preserve"> Zeitrax speichert alles (Stundeneinträge, Benutzer, Einstellungen) in der Datei </w:t>
+        <w:t xml:space="preserve"> Zeitexa speichert alles (Stundeneinträge, Einstellungen) in der Datei </w:t>
       </w:r>
       <w:r>
         <w:rPr>
           <w:rFonts w:ascii="Consolas" w:hAnsi="Consolas"/>
           <w:sz w:val="20"/>
         </w:rPr>
-        <w:t>zeitrax.sqlite</w:t>
+        <w:t>zeitexa.sqlite</w:t>
       </w:r>
       <w:r>
         <w:t xml:space="preserve"> im </w:t>
@@ -341,7 +340,7 @@
         <w:rPr>
           <w:b/>
         </w:rPr>
-        <w:t>`Zeitrax_v….apk`</w:t>
+        <w:t>`Zeitexa_v….apk`</w:t>
       </w:r>
       <w:r>
         <w:t xml:space="preserve"> (Lieferpaket, Ordner „Android") aufs Handy übertragen – z. B. per USB-Kabel, E-Mail an sich selbst oder über einen Cloud-Speicher.</w:t>
@@ -392,7 +391,7 @@
         <w:t>Installieren</w:t>
       </w:r>
       <w:r>
-        <w:t xml:space="preserve"> antippen, fertig. Zeitrax erscheint wie jede andere App im App-Menü.</w:t>
+        <w:t xml:space="preserve"> antippen, fertig. Zeitexa erscheint wie jede andere App im App-Menü.</w:t>
       </w:r>
     </w:p>
     <w:p>
@@ -416,7 +415,7 @@
     </w:p>
     <w:p>
       <w:r>
-        <w:t xml:space="preserve">Für das iPhone gibt es keine App aus dem App Store. Stattdessen läuft Zeitrax als </w:t>
+        <w:t xml:space="preserve">Für das iPhone gibt es keine App aus dem App Store. Stattdessen läuft Zeitexa als </w:t>
       </w:r>
       <w:r>
         <w:rPr>
@@ -456,7 +455,7 @@
         <w:rPr>
           <w:b/>
         </w:rPr>
-        <w:t>https://hwgtechgrafik.github.io/zeitrax/</w:t>
+        <w:t>https://hwgtechgrafik.github.io/zeitexa/</w:t>
       </w:r>
     </w:p>
     <w:p>
@@ -504,7 +503,7 @@
         <w:pStyle w:val="ListNumber"/>
       </w:pPr>
       <w:r>
-        <w:t xml:space="preserve">Zeitrax liegt jetzt als App-Symbol am Home-Bildschirm und startet ab sofort wie eine normale App – auch </w:t>
+        <w:t xml:space="preserve">Zeitexa liegt jetzt als App-Symbol am Home-Bildschirm und startet ab sofort wie eine normale App – auch </w:t>
       </w:r>
       <w:r>
         <w:rPr>
@@ -524,7 +523,7 @@
         <w:t>Besonderheiten der Web-App</w:t>
       </w:r>
       <w:r>
-        <w:t xml:space="preserve"> (gilt auch, wenn Zeitrax am PC im Browser genutzt wird):</w:t>
+        <w:t xml:space="preserve"> (gilt auch, wenn Zeitexa am PC im Browser genutzt wird):</w:t>
       </w:r>
     </w:p>
     <w:p>
@@ -541,7 +540,7 @@
         <w:t>Browser-Speicher</w:t>
       </w:r>
       <w:r>
-        <w:t xml:space="preserve"> des Geräts. Achtung: Wer in Safari „Verlauf und Websitedaten löschen" ausführt, löscht auch die Zeitrax-Daten. Deshalb den Monatsbericht regelmäßig versenden.</w:t>
+        <w:t xml:space="preserve"> des Geräts. Achtung: Wer in Safari „Verlauf und Websitedaten löschen" ausführt, löscht auch die Zeitexa-Daten. Deshalb den Monatsbericht regelmäßig versenden.</w:t>
       </w:r>
     </w:p>
     <w:p>
@@ -575,7 +574,7 @@
         <w:rPr>
           <w:b/>
         </w:rPr>
-        <w:t>Keine Datensicherung und keine Anmeldung per Fingerabdruck/Gesicht</w:t>
+        <w:t>Keine Datensicherung und kein Entsperren per Fingerabdruck</w:t>
       </w:r>
       <w:r>
         <w:t xml:space="preserve"> – diese Funktionen gibt es nur in der Windows- und Android-Version.</w:t>
@@ -608,12 +607,12 @@
         <w:pStyle w:val="Heading2"/>
       </w:pPr>
       <w:r>
-        <w:t>2. Freischaltung und Ersteinrichtung (einmalig pro Gerät)</w:t>
+        <w:t>2. Freischaltung und erster Start</w:t>
       </w:r>
     </w:p>
     <w:p>
       <w:r>
-        <w:t>Beim allerersten Start führt Zeitrax durch zwei kurze Schritte:</w:t>
+        <w:t>Beim allerersten Start führt Zeitexa durch zwei kurze Schritte.</w:t>
       </w:r>
     </w:p>
     <w:p>
@@ -632,7 +631,7 @@
         <w:rPr>
           <w:b/>
         </w:rPr>
-        <w:t>„Zeitrax freischalten"</w:t>
+        <w:t>„Zeitexa freischalten"</w:t>
       </w:r>
       <w:r>
         <w:t>:</w:t>
@@ -646,7 +645,7 @@
         <w:rPr>
           <w:b/>
         </w:rPr>
-        <w:t>Firmenname</w:t>
+        <w:t>Name des Lizenznehmers</w:t>
       </w:r>
       <w:r>
         <w:t xml:space="preserve"> eingeben – genau der Name, für den die Freischaltung ausgestellt ist (Groß-/Kleinschreibung und Leerzeichen spielen keine Rolle).</w:t>
@@ -713,15 +712,15 @@
           <w:rFonts w:ascii="Consolas" w:hAnsi="Consolas"/>
           <w:sz w:val="20"/>
         </w:rPr>
-        <w:t>….zeitraxlizenz.json</w:t>
-      </w:r>
-      <w:r>
-        <w:t>) auswählen, falls Sie eine bekommen haben.</w:t>
+        <w:t>….zeitexalizenz.json</w:t>
+      </w:r>
+      <w:r>
+        <w:t>) auswählen.</w:t>
       </w:r>
     </w:p>
     <w:p>
       <w:r>
-        <w:t>Die Freischaltung gilt für alle Geräte Ihrer Firma – derselbe Code funktioniert auf jedem Gerät.</w:t>
+        <w:t>Dieselbe Freischaltung gilt für alle Ihre Geräte (PC, Handy, iPhone).</w:t>
       </w:r>
     </w:p>
     <w:p>
@@ -729,7 +728,7 @@
         <w:pStyle w:val="Heading3"/>
       </w:pPr>
       <w:r>
-        <w:t>Schritt 2: Einrichten</w:t>
+        <w:t>Schritt 2: Namen eintragen</w:t>
       </w:r>
     </w:p>
     <w:p>
@@ -740,10 +739,215 @@
         <w:rPr>
           <w:b/>
         </w:rPr>
-        <w:t>„Zeitrax einrichten"</w:t>
-      </w:r>
-      <w:r>
-        <w:t>:</w:t>
+        <w:t>„Willkommen bei Zeitexa"</w:t>
+      </w:r>
+      <w:r>
+        <w:t xml:space="preserve">. Gefragt wird nur </w:t>
+      </w:r>
+      <w:r>
+        <w:rPr>
+          <w:b/>
+        </w:rPr>
+        <w:t>Ihr Name</w:t>
+      </w:r>
+      <w:r>
+        <w:t xml:space="preserve"> – er steht später auf Auswertungen und Exporten. Auf </w:t>
+      </w:r>
+      <w:r>
+        <w:rPr>
+          <w:b/>
+        </w:rPr>
+        <w:t>„Los geht's"</w:t>
+      </w:r>
+      <w:r>
+        <w:t xml:space="preserve"> tippen, fertig.</w:t>
+      </w:r>
+    </w:p>
+    <w:p>
+      <w:r>
+        <w:rPr>
+          <w:b/>
+        </w:rPr>
+        <w:t>Danach unbedingt einmal die Verwaltung öffnen:</w:t>
+      </w:r>
+      <w:r>
+        <w:t xml:space="preserve"> Zeitexa rechnet zunächst mit Vorgabewerten (8 Stunden Mo–Do, 5 Stunden Freitag, Urlaubsstände auf 0). Solange Sie diese Werte nicht bestätigt haben, steht in der Monatsansicht ein Hinweisbalken mit dem Knopf </w:t>
+      </w:r>
+      <w:r>
+        <w:rPr>
+          <w:b/>
+        </w:rPr>
+        <w:t>„Jetzt einstellen"</w:t>
+      </w:r>
+      <w:r>
+        <w:t>. Ein Klick darauf führt direkt an die richtige Stelle (siehe Abschnitt 4.1). Der Balken verschwindet, sobald Sie dort einmal gespeichert haben.</w:t>
+      </w:r>
+    </w:p>
+    <w:p>
+      <w:r>
+        <w:t>Die Werte lassen sich jederzeit ändern – Zeitexa rechnet immer mit den aktuellen Einstellungen, auch rückwirkend.</w:t>
+      </w:r>
+    </w:p>
+    <w:p>
+      <w:pPr>
+        <w:jc w:val="center"/>
+      </w:pPr>
+      <w:r>
+        <w:t>· · ·</w:t>
+      </w:r>
+    </w:p>
+    <w:p>
+      <w:pPr>
+        <w:pStyle w:val="Heading2"/>
+      </w:pPr>
+      <w:r>
+        <w:t>3. Tägliche Bedienung</w:t>
+      </w:r>
+    </w:p>
+    <w:p>
+      <w:pPr>
+        <w:pStyle w:val="Heading3"/>
+      </w:pPr>
+      <w:r>
+        <w:t>3.1 Die Monatsansicht</w:t>
+      </w:r>
+    </w:p>
+    <w:p>
+      <w:r>
+        <w:t>Nach dem Start sehen Sie den aktuellen Monat:</w:t>
+      </w:r>
+    </w:p>
+    <w:p>
+      <w:pPr>
+        <w:pStyle w:val="ListBullet"/>
+      </w:pPr>
+      <w:r>
+        <w:rPr>
+          <w:b/>
+        </w:rPr>
+        <w:t>Übersichtskarte</w:t>
+      </w:r>
+      <w:r>
+        <w:t xml:space="preserve"> oben:</w:t>
+      </w:r>
+    </w:p>
+    <w:p>
+      <w:pPr>
+        <w:pStyle w:val="ListBullet2"/>
+      </w:pPr>
+      <w:r>
+        <w:rPr>
+          <w:b/>
+        </w:rPr>
+        <w:t>„Zeit – aktueller Monat":</w:t>
+      </w:r>
+      <w:r>
+        <w:t xml:space="preserve"> Ist-Stunden, Soll-Stunden und Überstunden (grün = Plus, rot = Minus).</w:t>
+      </w:r>
+    </w:p>
+    <w:p>
+      <w:pPr>
+        <w:pStyle w:val="ListBullet2"/>
+      </w:pPr>
+      <w:r>
+        <w:rPr>
+          <w:b/>
+        </w:rPr>
+        <w:t>„Konten"</w:t>
+      </w:r>
+      <w:r>
+        <w:t xml:space="preserve"> mit Umschalter </w:t>
+      </w:r>
+      <w:r>
+        <w:rPr>
+          <w:b/>
+        </w:rPr>
+        <w:t>Monat / Laufzeit</w:t>
+      </w:r>
+      <w:r>
+        <w:t xml:space="preserve">: Resturlaub in Tagen (bei getrennter Führung zwei Werte: „Resturlaub Mo–Do" und „Resturlaub Fr"), </w:t>
+      </w:r>
+      <w:r>
+        <w:rPr>
+          <w:b/>
+        </w:rPr>
+        <w:t>Zeitausgleich</w:t>
+      </w:r>
+      <w:r>
+        <w:t xml:space="preserve"> in Stunden (Plus oder Minus) und </w:t>
+      </w:r>
+      <w:r>
+        <w:rPr>
+          <w:b/>
+        </w:rPr>
+        <w:t>Kranktage</w:t>
+      </w:r>
+      <w:r>
+        <w:t>. „Monat" zeigt nur den angezeigten Monat, „Laufzeit" den Gesamtstand.</w:t>
+      </w:r>
+    </w:p>
+    <w:p>
+      <w:pPr>
+        <w:pStyle w:val="ListBullet"/>
+      </w:pPr>
+      <w:r>
+        <w:rPr>
+          <w:b/>
+        </w:rPr>
+        <w:t>Tagesliste:</w:t>
+      </w:r>
+      <w:r>
+        <w:t xml:space="preserve"> eine Zeile pro Tag. Wochenenden und Feiertage sind farbig hervorgehoben, der heutige Tag ist markiert. Jede Zeile zeigt die Uhrzeiten, Pause und Ort (bzw. die Tagesart wie „Urlaub"), eine eventuelle Notiz sowie Ist/Soll und Überstunden des Tages.</w:t>
+      </w:r>
+    </w:p>
+    <w:p>
+      <w:pPr>
+        <w:pStyle w:val="ListBullet"/>
+      </w:pPr>
+      <w:r>
+        <w:rPr>
+          <w:b/>
+        </w:rPr>
+        <w:t>Pfeile</w:t>
+      </w:r>
+      <w:r>
+        <w:t xml:space="preserve"> links/rechts oben wechseln den Monat.</w:t>
+      </w:r>
+    </w:p>
+    <w:p>
+      <w:pPr>
+        <w:pStyle w:val="ListBullet"/>
+      </w:pPr>
+      <w:r>
+        <w:rPr>
+          <w:b/>
+        </w:rPr>
+        <w:t>„Heute"-Knopf:</w:t>
+      </w:r>
+      <w:r>
+        <w:t xml:space="preserve"> springt zurück zum aktuellen Monat und rollt die Liste zum heutigen Tag. Je nach Einstellung (Abschnitt 4.2) öffnet er zusätzlich gleich den heutigen Tageseintrag.</w:t>
+      </w:r>
+    </w:p>
+    <w:p>
+      <w:pPr>
+        <w:pStyle w:val="Heading3"/>
+      </w:pPr>
+      <w:r>
+        <w:t>3.2 Einen Tag eintragen</w:t>
+      </w:r>
+    </w:p>
+    <w:p>
+      <w:r>
+        <w:t xml:space="preserve">Einfach die gewünschte Tageszeile </w:t>
+      </w:r>
+      <w:r>
+        <w:rPr>
+          <w:b/>
+        </w:rPr>
+        <w:t>antippen</w:t>
+      </w:r>
+      <w:r>
+        <w:t xml:space="preserve"> – es öffnet sich der Tageseintrag:</w:t>
       </w:r>
     </w:p>
     <w:p>
@@ -751,21 +955,34 @@
         <w:pStyle w:val="ListNumber"/>
       </w:pPr>
       <w:r>
+        <w:t xml:space="preserve">Oben die </w:t>
+      </w:r>
+      <w:r>
         <w:rPr>
           <w:b/>
         </w:rPr>
-        <w:t>Adminpasswort</w:t>
-      </w:r>
-      <w:r>
-        <w:t xml:space="preserve"> festlegen (mit Wiederholung, mindestens 4 Zeichen). Es schützt den Chef-Bereich.</w:t>
-      </w:r>
-    </w:p>
-    <w:p>
+        <w:t>Tagesart</w:t>
+      </w:r>
+      <w:r>
+        <w:t xml:space="preserve"> wählen: </w:t>
+      </w:r>
       <w:r>
         <w:rPr>
           <w:b/>
         </w:rPr>
-        <w:t>Ganz wichtig: Dieses Passwort gut merken bzw. sicher notieren – es kann nachträglich nicht geändert werden!</w:t>
+        <w:t>Arbeit, Urlaub, Krank, Feiertag, Zeitausgleich, Sonderurlaub</w:t>
+      </w:r>
+      <w:r>
+        <w:t xml:space="preserve"> und – falls Sie das Konto führen – </w:t>
+      </w:r>
+      <w:r>
+        <w:rPr>
+          <w:b/>
+        </w:rPr>
+        <w:t>Zusatzurlaub</w:t>
+      </w:r>
+      <w:r>
+        <w:t>. (Feiertage schlägt die App bei österreichischen gesetzlichen Feiertagen automatisch vor.)</w:t>
       </w:r>
     </w:p>
     <w:p>
@@ -773,13 +990,84 @@
         <w:pStyle w:val="ListNumber"/>
       </w:pPr>
       <w:r>
+        <w:t xml:space="preserve">Bei </w:t>
+      </w:r>
+      <w:r>
         <w:rPr>
           <w:b/>
         </w:rPr>
-        <w:t>Eigenes Benutzerprofil des Chefs</w:t>
-      </w:r>
-      <w:r>
-        <w:t xml:space="preserve"> anlegen: Benutzername, Anzeigename und persönliches Passwort.</w:t>
+        <w:t>Arbeit</w:t>
+      </w:r>
+      <w:r>
+        <w:t>:</w:t>
+      </w:r>
+    </w:p>
+    <w:p>
+      <w:pPr>
+        <w:pStyle w:val="ListBullet2"/>
+      </w:pPr>
+      <w:r>
+        <w:rPr>
+          <w:b/>
+        </w:rPr>
+        <w:t>Ort</w:t>
+      </w:r>
+      <w:r>
+        <w:t xml:space="preserve"> eintragen (z. B. die Baustelle). Zuletzt verwendete Orte erscheinen als Schnellauswahl zum Antippen.</w:t>
+      </w:r>
+    </w:p>
+    <w:p>
+      <w:pPr>
+        <w:pStyle w:val="ListBullet2"/>
+      </w:pPr>
+      <w:r>
+        <w:rPr>
+          <w:b/>
+        </w:rPr>
+        <w:t>Beginn</w:t>
+      </w:r>
+      <w:r>
+        <w:t xml:space="preserve"> und </w:t>
+      </w:r>
+      <w:r>
+        <w:rPr>
+          <w:b/>
+        </w:rPr>
+        <w:t>Ende</w:t>
+      </w:r>
+      <w:r>
+        <w:t xml:space="preserve"> über die Uhr einstellen.</w:t>
+      </w:r>
+    </w:p>
+    <w:p>
+      <w:pPr>
+        <w:pStyle w:val="ListBullet2"/>
+      </w:pPr>
+      <w:r>
+        <w:rPr>
+          <w:b/>
+        </w:rPr>
+        <w:t>Pause</w:t>
+      </w:r>
+      <w:r>
+        <w:t xml:space="preserve"> über die runde Pausen-Uhr einstellen (in 5-Minuten-Schritten).</w:t>
+      </w:r>
+    </w:p>
+    <w:p>
+      <w:pPr>
+        <w:pStyle w:val="ListBullet2"/>
+      </w:pPr>
+      <w:r>
+        <w:t xml:space="preserve">Beginn, Ende und Pause sind mit Ihren Standardzeiten vorbelegt – meist muss man gar nichts ändern. Ist Ihr </w:t>
+      </w:r>
+      <w:r>
+        <w:rPr>
+          <w:b/>
+        </w:rPr>
+        <w:t>Freitag kürzer</w:t>
+      </w:r>
+      <w:r>
+        <w:t xml:space="preserve"> und sind eigene Freitagszeiten hinterlegt, verwendet die App am Freitag automatisch diese.</w:t>
       </w:r>
     </w:p>
     <w:p>
@@ -787,21 +1075,210 @@
         <w:pStyle w:val="ListNumber"/>
       </w:pPr>
       <w:r>
-        <w:t xml:space="preserve">Auf </w:t>
+        <w:t xml:space="preserve">Bei allen anderen Tagesarten kann man über </w:t>
       </w:r>
       <w:r>
         <w:rPr>
           <w:b/>
         </w:rPr>
-        <w:t>„Einrichten und starten"</w:t>
-      </w:r>
-      <w:r>
-        <w:t xml:space="preserve"> tippen – Sie sind sofort angemeldet und landen in der Monatsansicht.</w:t>
+        <w:t>„bis-Datum wählen"</w:t>
+      </w:r>
+      <w:r>
+        <w:t xml:space="preserve"> gleich einen ganzen Zeitraum eintragen (z. B. zwei Wochen Urlaub) – Samstage und Sonntage werden automatisch übersprungen.</w:t>
       </w:r>
     </w:p>
     <w:p>
-      <w:r>
-        <w:t>Alle weiteren Mitarbeiter legt der Chef anschließend im Chef-Bereich an (Abschnitt 5.1).</w:t>
+      <w:pPr>
+        <w:pStyle w:val="ListNumber"/>
+      </w:pPr>
+      <w:r>
+        <w:rPr>
+          <w:b/>
+        </w:rPr>
+        <w:t>Halbe und geteilte Urlaubstage:</w:t>
+      </w:r>
+      <w:r>
+        <w:t xml:space="preserve"> Bei einem einzelnen Urlaubs-, Sonderurlaubs- oder Zusatzurlaubstag steht im Feld </w:t>
+      </w:r>
+      <w:r>
+        <w:rPr>
+          <w:b/>
+        </w:rPr>
+        <w:t>„… (Stunden an diesem Tag)"</w:t>
+      </w:r>
+      <w:r>
+        <w:t xml:space="preserve"> zunächst Ihr volles Tagessoll. Tragen Sie </w:t>
+      </w:r>
+      <w:r>
+        <w:rPr>
+          <w:b/>
+        </w:rPr>
+        <w:t>weniger</w:t>
+      </w:r>
+      <w:r>
+        <w:t xml:space="preserve"> ein (z. B. </w:t>
+      </w:r>
+      <w:r>
+        <w:rPr>
+          <w:b/>
+        </w:rPr>
+        <w:t>6,25</w:t>
+      </w:r>
+      <w:r>
+        <w:t>), erscheinen darunter zusätzlich Ort, Beginn, Ende und Pause – so lässt sich ein Tag sauber aufteilen: ein Teil Urlaub, der Rest gearbeitet. Ein halber Tag ist also einfach die halbe Stundenzahl. Das Urlaubskonto wird entsprechend anteilig belastet.</w:t>
+      </w:r>
+    </w:p>
+    <w:p>
+      <w:pPr>
+        <w:pStyle w:val="ListNumber"/>
+      </w:pPr>
+      <w:r>
+        <w:t xml:space="preserve">Bei </w:t>
+      </w:r>
+      <w:r>
+        <w:rPr>
+          <w:b/>
+        </w:rPr>
+        <w:t>Sonderurlaub</w:t>
+      </w:r>
+      <w:r>
+        <w:t xml:space="preserve"> zusätzlich den </w:t>
+      </w:r>
+      <w:r>
+        <w:rPr>
+          <w:b/>
+        </w:rPr>
+        <w:t>Grund</w:t>
+      </w:r>
+      <w:r>
+        <w:t xml:space="preserve"> wählen: Pflegefreistellung, Umzug, Hochzeit, Geburt, Todesfall oder Sonstiges (bei „Sonstiges" den Anlass in die Notiz schreiben). Sonderurlaub wird </w:t>
+      </w:r>
+      <w:r>
+        <w:rPr>
+          <w:b/>
+        </w:rPr>
+        <w:t>gezählt, aber nicht vom Urlaubskonto abgezogen</w:t>
+      </w:r>
+      <w:r>
+        <w:t>.</w:t>
+      </w:r>
+    </w:p>
+    <w:p>
+      <w:pPr>
+        <w:pStyle w:val="ListNumber"/>
+      </w:pPr>
+      <w:r>
+        <w:t xml:space="preserve">Optional eine </w:t>
+      </w:r>
+      <w:r>
+        <w:rPr>
+          <w:b/>
+        </w:rPr>
+        <w:t>Notiz</w:t>
+      </w:r>
+      <w:r>
+        <w:t xml:space="preserve"> ergänzen (was/wie/wo/wer).</w:t>
+      </w:r>
+    </w:p>
+    <w:p>
+      <w:pPr>
+        <w:pStyle w:val="ListNumber"/>
+      </w:pPr>
+      <w:r>
+        <w:rPr>
+          <w:b/>
+        </w:rPr>
+        <w:t>Speichern.</w:t>
+      </w:r>
+      <w:r>
+        <w:t xml:space="preserve"> Über </w:t>
+      </w:r>
+      <w:r>
+        <w:rPr>
+          <w:b/>
+        </w:rPr>
+        <w:t>Löschen</w:t>
+      </w:r>
+      <w:r>
+        <w:t xml:space="preserve"> lässt sich ein bestehender Eintrag wieder entfernen.</w:t>
+      </w:r>
+    </w:p>
+    <w:p>
+      <w:pPr>
+        <w:pStyle w:val="Heading3"/>
+      </w:pPr>
+      <w:r>
+        <w:t>3.3 Monat weitergeben</w:t>
+      </w:r>
+    </w:p>
+    <w:p>
+      <w:r>
+        <w:t xml:space="preserve">Menü (⋮) → </w:t>
+      </w:r>
+      <w:r>
+        <w:rPr>
+          <w:b/>
+        </w:rPr>
+        <w:t>„Monat exportieren/senden"</w:t>
+      </w:r>
+      <w:r>
+        <w:t>. Der Bericht enthält immer eine Excel-Liste, ein PDF und eine Datendatei. Je nach Einrichtung stehen bis zu drei Wege zur Wahl:</w:t>
+      </w:r>
+    </w:p>
+    <w:p>
+      <w:pPr>
+        <w:pStyle w:val="ListBullet"/>
+      </w:pPr>
+      <w:r>
+        <w:rPr>
+          <w:b/>
+        </w:rPr>
+        <w:t>„Per Mail senden (automatisch)":</w:t>
+      </w:r>
+      <w:r>
+        <w:t xml:space="preserve"> verschickt den Bericht direkt an den hinterlegten Empfänger (nur wenn Sie den Mailversand eingerichtet haben; nicht in der Web-App).</w:t>
+      </w:r>
+    </w:p>
+    <w:p>
+      <w:pPr>
+        <w:pStyle w:val="ListBullet"/>
+      </w:pPr>
+      <w:r>
+        <w:rPr>
+          <w:b/>
+        </w:rPr>
+        <w:t>„Per Mail-App / Teilen weitergeben":</w:t>
+      </w:r>
+      <w:r>
+        <w:t xml:space="preserve"> öffnet das normale Teilen-Menü des Geräts (z. B. Mail-App).</w:t>
+      </w:r>
+    </w:p>
+    <w:p>
+      <w:pPr>
+        <w:pStyle w:val="ListBullet"/>
+      </w:pPr>
+      <w:r>
+        <w:rPr>
+          <w:b/>
+        </w:rPr>
+        <w:t>„Nur als Dateien speichern":</w:t>
+      </w:r>
+      <w:r>
+        <w:t xml:space="preserve"> legt die Dateien lokal ab (Windows: Ordner „Zeitexa-Exporte" in Dokumente; nicht in der Web-App).</w:t>
+      </w:r>
+    </w:p>
+    <w:p>
+      <w:r>
+        <w:t xml:space="preserve">Ist der </w:t>
+      </w:r>
+      <w:r>
+        <w:rPr>
+          <w:b/>
+        </w:rPr>
+        <w:t>automatische Versand</w:t>
+      </w:r>
+      <w:r>
+        <w:t xml:space="preserve"> eingeschaltet, verschickt Zeitexa den Vormonat beim ersten Start im neuen Monat von selbst und meldet das kurz.</w:t>
       </w:r>
     </w:p>
     <w:p>
@@ -817,7 +1294,34 @@
         <w:pStyle w:val="Heading2"/>
       </w:pPr>
       <w:r>
-        <w:t>3. Anmeldung</w:t>
+        <w:t>4. Verwaltung</w:t>
+      </w:r>
+    </w:p>
+    <w:p>
+      <w:r>
+        <w:t xml:space="preserve">Menü (⋮) → </w:t>
+      </w:r>
+      <w:r>
+        <w:rPr>
+          <w:b/>
+        </w:rPr>
+        <w:t>„Verwaltung"</w:t>
+      </w:r>
+      <w:r>
+        <w:t>. Drei Reiter:</w:t>
+      </w:r>
+    </w:p>
+    <w:p>
+      <w:pPr>
+        <w:pStyle w:val="Heading3"/>
+      </w:pPr>
+      <w:r>
+        <w:t>4.1 Reiter „Mein Profil"</w:t>
+      </w:r>
+    </w:p>
+    <w:p>
+      <w:r>
+        <w:t>Hier stehen alle Werte, mit denen Zeitexa rechnet:</w:t>
       </w:r>
     </w:p>
     <w:p>
@@ -825,16 +1329,22 @@
         <w:pStyle w:val="ListBullet"/>
       </w:pPr>
       <w:r>
-        <w:t xml:space="preserve">Beim Start meldet man sich mit </w:t>
-      </w:r>
-      <w:r>
         <w:rPr>
           <w:b/>
         </w:rPr>
-        <w:t>Benutzername und Passwort</w:t>
-      </w:r>
-      <w:r>
-        <w:t xml:space="preserve"> an.</w:t>
+        <w:t>Ihr Name</w:t>
+      </w:r>
+      <w:r>
+        <w:t xml:space="preserve"> und Ihre </w:t>
+      </w:r>
+      <w:r>
+        <w:rPr>
+          <w:b/>
+        </w:rPr>
+        <w:t>E-Mail-Adresse</w:t>
+      </w:r>
+      <w:r>
+        <w:t xml:space="preserve"> (für die eigene Kopie beim Mail-Export).</w:t>
       </w:r>
     </w:p>
     <w:p>
@@ -845,16 +1355,16 @@
         <w:rPr>
           <w:b/>
         </w:rPr>
-        <w:t>Erster Login:</w:t>
-      </w:r>
-      <w:r>
-        <w:t xml:space="preserve"> Neue Mitarbeiter bekommen vom Chef ein Start-Passwort und müssen beim ersten Anmelden ein </w:t>
+        <w:t>Sollstunden:</w:t>
+      </w:r>
+      <w:r>
+        <w:t xml:space="preserve"> entweder gleich für alle Tage (Mo–Fr) oder </w:t>
       </w:r>
       <w:r>
         <w:rPr>
           <w:b/>
         </w:rPr>
-        <w:t>eigenes neues Passwort festlegen</w:t>
+        <w:t>Mo–Do und Freitag getrennt</w:t>
       </w:r>
       <w:r>
         <w:t>.</w:t>
@@ -868,19 +1378,70 @@
         <w:rPr>
           <w:b/>
         </w:rPr>
-        <w:t>Anmeldung per Fingerabdruck/Gesicht</w:t>
-      </w:r>
-      <w:r>
-        <w:t xml:space="preserve"> (nur Windows/Android): Wenn der Chef die biometrische Anmeldung erlaubt hat und man sie in den eigenen Einstellungen aktiviert hat, erscheint am Anmeldebildschirm ein Knopf </w:t>
+        <w:t>Anfangsstand:</w:t>
+      </w:r>
+      <w:r>
+        <w:t xml:space="preserve"> Der </w:t>
       </w:r>
       <w:r>
         <w:rPr>
           <w:b/>
         </w:rPr>
-        <w:t>„Als ‚Name' anmelden"</w:t>
-      </w:r>
-      <w:r>
-        <w:t xml:space="preserve"> – ein Fingertipp genügt.</w:t>
+        <w:t>Stichtag</w:t>
+      </w:r>
+      <w:r>
+        <w:t xml:space="preserve"> ist der Tag, ab dem Zeitexa mitrechnet. Tragen Sie hier ein, wie viel Resturlaub und wie viele Plus-/Minusstunden Sie an diesem Tag hatten – alles Weitere schreibt die App selbst fort.</w:t>
+      </w:r>
+    </w:p>
+    <w:p>
+      <w:pPr>
+        <w:pStyle w:val="ListBullet2"/>
+      </w:pPr>
+      <w:r>
+        <w:rPr>
+          <w:b/>
+        </w:rPr>
+        <w:t>„Freitags-Urlaub getrennt führen":</w:t>
+      </w:r>
+      <w:r>
+        <w:t xml:space="preserve"> eigenes Urlaubskonto für Freitage.</w:t>
+      </w:r>
+    </w:p>
+    <w:p>
+      <w:pPr>
+        <w:pStyle w:val="ListBullet2"/>
+      </w:pPr>
+      <w:r>
+        <w:rPr>
+          <w:b/>
+        </w:rPr>
+        <w:t>„Zusatzurlaub führen":</w:t>
+      </w:r>
+      <w:r>
+        <w:t xml:space="preserve"> eigenes Konto für zusätzlichen Urlaub (z. B. eine Extra-Woche). Verfällt nicht; den Stand erhöhen Sie jährlich selbst.</w:t>
+      </w:r>
+    </w:p>
+    <w:p>
+      <w:pPr>
+        <w:pStyle w:val="ListBullet2"/>
+      </w:pPr>
+      <w:r>
+        <w:rPr>
+          <w:b/>
+        </w:rPr>
+        <w:t>Zeitausgleich-Anfangsstand:</w:t>
+      </w:r>
+      <w:r>
+        <w:t xml:space="preserve"> Dezimalstunden mit </w:t>
+      </w:r>
+      <w:r>
+        <w:rPr>
+          <w:b/>
+        </w:rPr>
+        <w:t>+/−</w:t>
+      </w:r>
+      <w:r>
+        <w:t>-Umschalter (z. B. 43,35 oder −5).</w:t>
       </w:r>
     </w:p>
     <w:p>
@@ -891,10 +1452,41 @@
         <w:rPr>
           <w:b/>
         </w:rPr>
-        <w:t>„Neu hier? Registrieren":</w:t>
-      </w:r>
-      <w:r>
-        <w:t xml:space="preserve"> Dieser Knopf erscheint nur, wenn der Chef die Selbst-Registrierung erlaubt hat. Damit können sich Mitarbeiter selbst ein Profil anlegen.</w:t>
+        <w:t>Standardzeiten</w:t>
+      </w:r>
+      <w:r>
+        <w:t xml:space="preserve"> für neue Arbeitstage (Beginn, Ende, Pause), auf Wunsch mit eigenen </w:t>
+      </w:r>
+      <w:r>
+        <w:rPr>
+          <w:b/>
+        </w:rPr>
+        <w:t>Freitagszeiten</w:t>
+      </w:r>
+      <w:r>
+        <w:t>.</w:t>
+      </w:r>
+    </w:p>
+    <w:p>
+      <w:r>
+        <w:t xml:space="preserve">Nicht vergessen: unten auf </w:t>
+      </w:r>
+      <w:r>
+        <w:rPr>
+          <w:b/>
+        </w:rPr>
+        <w:t>„Speichern"</w:t>
+      </w:r>
+      <w:r>
+        <w:t>. Damit verschwindet auch der Hinweisbalken aus Abschnitt 2.</w:t>
+      </w:r>
+    </w:p>
+    <w:p>
+      <w:pPr>
+        <w:pStyle w:val="Heading3"/>
+      </w:pPr>
+      <w:r>
+        <w:t>4.2 Reiter „Optionen"</w:t>
       </w:r>
     </w:p>
     <w:p>
@@ -905,10 +1497,184 @@
         <w:rPr>
           <w:b/>
         </w:rPr>
-        <w:t>Abmelden:</w:t>
-      </w:r>
-      <w:r>
-        <w:t xml:space="preserve"> oben rechts über das Menü (⋮) → „Abmelden".</w:t>
+        <w:t>Mailversand:</w:t>
+      </w:r>
+      <w:r>
+        <w:t xml:space="preserve"> Empfänger der Monatsberichte (z. B. Auftraggeber, Steuerberater oder die eigene Adresse) sowie die Zugangsdaten Ihres Postausgangsservers (SMTP-Server, Port, Benutzer, Passwort). Mit </w:t>
+      </w:r>
+      <w:r>
+        <w:rPr>
+          <w:b/>
+        </w:rPr>
+        <w:t>„Testmail senden"</w:t>
+      </w:r>
+      <w:r>
+        <w:t xml:space="preserve"> lässt sich das sofort prüfen. Optional: </w:t>
+      </w:r>
+      <w:r>
+        <w:rPr>
+          <w:b/>
+        </w:rPr>
+        <w:t>automatischer Versand am Monatsanfang</w:t>
+      </w:r>
+      <w:r>
+        <w:t>.</w:t>
+      </w:r>
+    </w:p>
+    <w:p>
+      <w:pPr>
+        <w:pStyle w:val="ListBullet"/>
+      </w:pPr>
+      <w:r>
+        <w:rPr>
+          <w:b/>
+        </w:rPr>
+        <w:t>Bedienung:</w:t>
+      </w:r>
+      <w:r>
+        <w:t xml:space="preserve"> „Heute-Knopf öffnet den Tageseintrag".</w:t>
+      </w:r>
+    </w:p>
+    <w:p>
+      <w:pPr>
+        <w:pStyle w:val="ListBullet"/>
+      </w:pPr>
+      <w:r>
+        <w:rPr>
+          <w:b/>
+        </w:rPr>
+        <w:t>Sicherheit – App-Sperre:</w:t>
+      </w:r>
+      <w:r>
+        <w:t xml:space="preserve"> Standardmäßig </w:t>
+      </w:r>
+      <w:r>
+        <w:rPr>
+          <w:b/>
+        </w:rPr>
+        <w:t>aus</w:t>
+      </w:r>
+      <w:r>
+        <w:t xml:space="preserve">. Eingeschaltet fragt Zeitexa beim Start nach einem Passwort, das Sie selbst vergeben. </w:t>
+      </w:r>
+      <w:r>
+        <w:rPr>
+          <w:b/>
+        </w:rPr>
+        <w:t>Dieses Passwort lässt sich nicht wiederherstellen – notieren Sie es.</w:t>
+      </w:r>
+      <w:r>
+        <w:t xml:space="preserve"> Zusätzlich kann (Windows/Android) das </w:t>
+      </w:r>
+      <w:r>
+        <w:rPr>
+          <w:b/>
+        </w:rPr>
+        <w:t>Entsperren per Fingerabdruck</w:t>
+      </w:r>
+      <w:r>
+        <w:t xml:space="preserve"> aktiviert werden. Hinweis: Das Gerät unterscheidet keine Personen – jeder dort hinterlegte Fingerabdruck kann entsperren.</w:t>
+      </w:r>
+    </w:p>
+    <w:p>
+      <w:pPr>
+        <w:pStyle w:val="ListBullet"/>
+      </w:pPr>
+      <w:r>
+        <w:rPr>
+          <w:b/>
+        </w:rPr>
+        <w:t>Darstellung:</w:t>
+      </w:r>
+      <w:r>
+        <w:t xml:space="preserve"> eigenes </w:t>
+      </w:r>
+      <w:r>
+        <w:rPr>
+          <w:b/>
+        </w:rPr>
+        <w:t>Logo</w:t>
+      </w:r>
+      <w:r>
+        <w:t xml:space="preserve"> und eine </w:t>
+      </w:r>
+      <w:r>
+        <w:rPr>
+          <w:b/>
+        </w:rPr>
+        <w:t>Akzentfarbe</w:t>
+      </w:r>
+      <w:r>
+        <w:t xml:space="preserve"> wählen. Beides erscheint in der App und auf dem PDF-Bericht.</w:t>
+      </w:r>
+    </w:p>
+    <w:p>
+      <w:pPr>
+        <w:pStyle w:val="ListBullet"/>
+      </w:pPr>
+      <w:r>
+        <w:rPr>
+          <w:b/>
+        </w:rPr>
+        <w:t>Datensicherung</w:t>
+      </w:r>
+      <w:r>
+        <w:t xml:space="preserve"> (nicht in der Web-App): </w:t>
+      </w:r>
+      <w:r>
+        <w:rPr>
+          <w:b/>
+        </w:rPr>
+        <w:t>„Sicherung erstellen…"</w:t>
+      </w:r>
+      <w:r>
+        <w:t xml:space="preserve"> schreibt alle Daten in eine Datei </w:t>
+      </w:r>
+      <w:r>
+        <w:rPr>
+          <w:rFonts w:ascii="Consolas" w:hAnsi="Consolas"/>
+          <w:sz w:val="20"/>
+        </w:rPr>
+        <w:t>Zeitexa_Sicherung_JJJJ-MM-TT.zeitexadb</w:t>
+      </w:r>
+      <w:r>
+        <w:t xml:space="preserve">, </w:t>
+      </w:r>
+      <w:r>
+        <w:rPr>
+          <w:b/>
+        </w:rPr>
+        <w:t>„Sicherung wiederherstellen…"</w:t>
+      </w:r>
+      <w:r>
+        <w:t xml:space="preserve"> spielt sie zurück. Beim Wiederherstellen wird der gesamte Bestand ersetzt. Sicherungen anderer Programme (etwa der Firmenversion Zeitrax) weist Zeitexa ab.</w:t>
+      </w:r>
+    </w:p>
+    <w:p>
+      <w:pPr>
+        <w:pStyle w:val="ListBullet"/>
+      </w:pPr>
+      <w:r>
+        <w:rPr>
+          <w:b/>
+        </w:rPr>
+        <w:t>Lizenz:</w:t>
+      </w:r>
+      <w:r>
+        <w:t xml:space="preserve"> eine neue Lizenzdatei des Entwicklers einspielen.</w:t>
+      </w:r>
+    </w:p>
+    <w:p>
+      <w:pPr>
+        <w:pStyle w:val="Heading3"/>
+      </w:pPr>
+      <w:r>
+        <w:t>4.3 Reiter „Auswertung"</w:t>
+      </w:r>
+    </w:p>
+    <w:p>
+      <w:r>
+        <w:t>Zeitraum wählen (von/bis) und Zeitexa zeigt eine Vorschau: eine Zeile je Monat mit Ist, Soll, Überstunden, Urlaub, Krank und Sonderurlaub, dazu ein Balkendiagramm Ist gegen Soll. Über den Export-Knopf lässt sich die Auswertung als Excel- oder PDF-Datei ausgeben – praktisch für den Jahresabschluss oder den Steuerberater.</w:t>
       </w:r>
     </w:p>
     <w:p>
@@ -924,1710 +1690,46 @@
         <w:pStyle w:val="Heading2"/>
       </w:pPr>
       <w:r>
-        <w:t>4. Tägliche Bedienung (für Mitarbeiter)</w:t>
+        <w:t>5. Häufige Fragen</w:t>
       </w:r>
     </w:p>
     <w:p>
-      <w:pPr>
-        <w:pStyle w:val="Heading3"/>
-      </w:pPr>
-      <w:r>
-        <w:t>4.1 Die Monatsansicht</w:t>
-      </w:r>
-    </w:p>
-    <w:p>
-      <w:r>
-        <w:t>Nach der Anmeldung sehen Sie den aktuellen Monat:</w:t>
-      </w:r>
-    </w:p>
-    <w:p>
-      <w:pPr>
-        <w:pStyle w:val="ListBullet"/>
-      </w:pPr>
       <w:r>
         <w:rPr>
           <w:b/>
         </w:rPr>
-        <w:t>Übersichtskarte</w:t>
-      </w:r>
-      <w:r>
-        <w:t xml:space="preserve"> oben:</w:t>
+        <w:t>Ich habe mein App-Sperre-Passwort vergessen.</w:t>
       </w:r>
     </w:p>
     <w:p>
-      <w:pPr>
-        <w:pStyle w:val="ListBullet2"/>
-      </w:pPr>
+      <w:r>
+        <w:t>Es lässt sich nicht zurücksetzen – es ist verschlüsselt gespeichert. Ohne Sicherung hilft nur eine Neuinstallation, dabei gehen die Daten verloren. Deshalb: Passwort notieren und regelmäßig eine Sicherung erstellen.</w:t>
+      </w:r>
+    </w:p>
+    <w:p>
       <w:r>
         <w:rPr>
           <w:b/>
         </w:rPr>
-        <w:t>„Zeit – aktueller Monat":</w:t>
-      </w:r>
-      <w:r>
-        <w:t xml:space="preserve"> Ist-Stunden, Soll-Stunden und Überstunden (grün = Plus, rot = Minus).</w:t>
+        <w:t>Ich habe mich beim Namen für die Lizenz vertippt.</w:t>
       </w:r>
     </w:p>
     <w:p>
-      <w:pPr>
-        <w:pStyle w:val="ListBullet2"/>
-      </w:pPr>
+      <w:r>
+        <w:t>Melden Sie sich beim Entwickler – er kann den hinterlegten Namen mit seinem Passwort direkt korrigieren.</w:t>
+      </w:r>
+    </w:p>
+    <w:p>
       <w:r>
         <w:rPr>
           <w:b/>
         </w:rPr>
-        <w:t>„Konten"</w:t>
-      </w:r>
-      <w:r>
-        <w:t xml:space="preserve"> mit Umschalter </w:t>
-      </w:r>
-      <w:r>
-        <w:rPr>
-          <w:b/>
-        </w:rPr>
-        <w:t>Monat / Laufzeit</w:t>
-      </w:r>
-      <w:r>
-        <w:t xml:space="preserve">: Resturlaub in Tagen (bei getrennter Führung zwei Werte: „Resturlaub Mo–Do" und „Resturlaub Fr"), </w:t>
-      </w:r>
-      <w:r>
-        <w:rPr>
-          <w:b/>
-        </w:rPr>
-        <w:t>Zeitausgleich</w:t>
-      </w:r>
-      <w:r>
-        <w:t xml:space="preserve"> in Stunden (Plus oder Minus) und </w:t>
-      </w:r>
-      <w:r>
-        <w:rPr>
-          <w:b/>
-        </w:rPr>
-        <w:t>Kranktage</w:t>
-      </w:r>
-      <w:r>
-        <w:t>. „Monat" zeigt nur den angezeigten Monat, „Laufzeit" den Gesamtstand.</w:t>
+        <w:t>Kann ich Zeitexa auf mehreren Geräten nutzen?</w:t>
       </w:r>
     </w:p>
     <w:p>
-      <w:pPr>
-        <w:pStyle w:val="ListBullet"/>
-      </w:pPr>
-      <w:r>
-        <w:rPr>
-          <w:b/>
-        </w:rPr>
-        <w:t>Tagesliste:</w:t>
-      </w:r>
-      <w:r>
-        <w:t xml:space="preserve"> eine Zeile pro Tag. Wochenenden und Feiertage sind farbig hervorgehoben, der heutige Tag ist markiert. Jede Zeile zeigt die Uhrzeiten, Pause und Ort (bzw. die Tagesart wie „Urlaub"), eine eventuelle Notiz sowie Ist/Soll und Überstunden des Tages.</w:t>
-      </w:r>
-    </w:p>
-    <w:p>
-      <w:pPr>
-        <w:pStyle w:val="ListBullet"/>
-      </w:pPr>
-      <w:r>
-        <w:rPr>
-          <w:b/>
-        </w:rPr>
-        <w:t>Pfeile</w:t>
-      </w:r>
-      <w:r>
-        <w:t xml:space="preserve"> links/rechts oben wechseln den Monat.</w:t>
-      </w:r>
-    </w:p>
-    <w:p>
-      <w:pPr>
-        <w:pStyle w:val="ListBullet"/>
-      </w:pPr>
-      <w:r>
-        <w:rPr>
-          <w:b/>
-        </w:rPr>
-        <w:t>„Heute"-Knopf:</w:t>
-      </w:r>
-      <w:r>
-        <w:t xml:space="preserve"> springt zurück zum aktuellen Monat und rollt die Liste zum heutigen Tag. Je nach Einstellung (siehe 4.4 bzw. 5.2) öffnet er zusätzlich gleich den heutigen Tageseintrag.</w:t>
-      </w:r>
-    </w:p>
-    <w:p>
-      <w:pPr>
-        <w:pStyle w:val="Heading3"/>
-      </w:pPr>
-      <w:r>
-        <w:t>4.2 Einen Tag eintragen</w:t>
-      </w:r>
-    </w:p>
-    <w:p>
-      <w:r>
-        <w:t xml:space="preserve">Einfach die gewünschte Tageszeile </w:t>
-      </w:r>
-      <w:r>
-        <w:rPr>
-          <w:b/>
-        </w:rPr>
-        <w:t>antippen</w:t>
-      </w:r>
-      <w:r>
-        <w:t xml:space="preserve"> – es öffnet sich der Tageseintrag:</w:t>
-      </w:r>
-    </w:p>
-    <w:p>
-      <w:pPr>
-        <w:pStyle w:val="ListNumber"/>
-      </w:pPr>
-      <w:r>
-        <w:t xml:space="preserve">Oben die </w:t>
-      </w:r>
-      <w:r>
-        <w:rPr>
-          <w:b/>
-        </w:rPr>
-        <w:t>Tagesart</w:t>
-      </w:r>
-      <w:r>
-        <w:t xml:space="preserve"> wählen: </w:t>
-      </w:r>
-      <w:r>
-        <w:rPr>
-          <w:b/>
-        </w:rPr>
-        <w:t>Arbeit, Urlaub, Krank, Feiertag, Zeitausgleich, Sonderurlaub</w:t>
-      </w:r>
-      <w:r>
-        <w:t xml:space="preserve"> und – falls der Chef das Konto für Sie führt – </w:t>
-      </w:r>
-      <w:r>
-        <w:rPr>
-          <w:b/>
-        </w:rPr>
-        <w:t>Firmenurlaub</w:t>
-      </w:r>
-      <w:r>
-        <w:t>. (Feiertage schlägt die App bei österreichischen gesetzlichen Feiertagen automatisch vor.)</w:t>
-      </w:r>
-    </w:p>
-    <w:p>
-      <w:pPr>
-        <w:pStyle w:val="ListNumber"/>
-      </w:pPr>
-      <w:r>
-        <w:t xml:space="preserve">Bei </w:t>
-      </w:r>
-      <w:r>
-        <w:rPr>
-          <w:b/>
-        </w:rPr>
-        <w:t>Arbeit</w:t>
-      </w:r>
-      <w:r>
-        <w:t>:</w:t>
-      </w:r>
-    </w:p>
-    <w:p>
-      <w:pPr>
-        <w:pStyle w:val="ListBullet2"/>
-      </w:pPr>
-      <w:r>
-        <w:rPr>
-          <w:b/>
-        </w:rPr>
-        <w:t>Ort</w:t>
-      </w:r>
-      <w:r>
-        <w:t xml:space="preserve"> eintragen (z. B. die Baustelle). Zuletzt verwendete Orte erscheinen als Schnellauswahl zum Antippen.</w:t>
-      </w:r>
-    </w:p>
-    <w:p>
-      <w:pPr>
-        <w:pStyle w:val="ListBullet2"/>
-      </w:pPr>
-      <w:r>
-        <w:rPr>
-          <w:b/>
-        </w:rPr>
-        <w:t>Beginn</w:t>
-      </w:r>
-      <w:r>
-        <w:t xml:space="preserve"> und </w:t>
-      </w:r>
-      <w:r>
-        <w:rPr>
-          <w:b/>
-        </w:rPr>
-        <w:t>Ende</w:t>
-      </w:r>
-      <w:r>
-        <w:t xml:space="preserve"> über die Uhr einstellen.</w:t>
-      </w:r>
-    </w:p>
-    <w:p>
-      <w:pPr>
-        <w:pStyle w:val="ListBullet2"/>
-      </w:pPr>
-      <w:r>
-        <w:rPr>
-          <w:b/>
-        </w:rPr>
-        <w:t>Pause</w:t>
-      </w:r>
-      <w:r>
-        <w:t xml:space="preserve"> über die runde Pausen-Uhr einstellen (in 5-Minuten-Schritten).</w:t>
-      </w:r>
-    </w:p>
-    <w:p>
-      <w:pPr>
-        <w:pStyle w:val="ListBullet2"/>
-      </w:pPr>
-      <w:r>
-        <w:t xml:space="preserve">Beginn, Ende und Pause sind mit Ihren Standardzeiten vorbelegt – meist muss man gar nichts ändern. Ist Ihr </w:t>
-      </w:r>
-      <w:r>
-        <w:rPr>
-          <w:b/>
-        </w:rPr>
-        <w:t>Freitag kürzer</w:t>
-      </w:r>
-      <w:r>
-        <w:t xml:space="preserve"> und sind eigene Freitagszeiten hinterlegt, verwendet die App am Freitag automatisch diese.</w:t>
-      </w:r>
-    </w:p>
-    <w:p>
-      <w:pPr>
-        <w:pStyle w:val="ListNumber"/>
-      </w:pPr>
-      <w:r>
-        <w:t xml:space="preserve">Bei allen anderen Tagesarten kann man über </w:t>
-      </w:r>
-      <w:r>
-        <w:rPr>
-          <w:b/>
-        </w:rPr>
-        <w:t>„bis-Datum wählen"</w:t>
-      </w:r>
-      <w:r>
-        <w:t xml:space="preserve"> gleich einen ganzen Zeitraum eintragen (z. B. zwei Wochen Urlaub) – Samstage und Sonntage werden automatisch übersprungen.</w:t>
-      </w:r>
-    </w:p>
-    <w:p>
-      <w:pPr>
-        <w:pStyle w:val="ListNumber"/>
-      </w:pPr>
-      <w:r>
-        <w:rPr>
-          <w:b/>
-        </w:rPr>
-        <w:t>Halbe und geteilte Urlaubstage:</w:t>
-      </w:r>
-      <w:r>
-        <w:t xml:space="preserve"> Bei einem einzelnen Urlaubs-, Sonderurlaubs- oder Firmenurlaubstag steht im Feld </w:t>
-      </w:r>
-      <w:r>
-        <w:rPr>
-          <w:b/>
-        </w:rPr>
-        <w:t>„… (Stunden an diesem Tag)"</w:t>
-      </w:r>
-      <w:r>
-        <w:t xml:space="preserve"> zunächst Ihr volles Tagessoll. Tragen Sie </w:t>
-      </w:r>
-      <w:r>
-        <w:rPr>
-          <w:b/>
-        </w:rPr>
-        <w:t>weniger</w:t>
-      </w:r>
-      <w:r>
-        <w:t xml:space="preserve"> ein (z. B. </w:t>
-      </w:r>
-      <w:r>
-        <w:rPr>
-          <w:b/>
-        </w:rPr>
-        <w:t>6,25</w:t>
-      </w:r>
-      <w:r>
-        <w:t>), erscheinen darunter zusätzlich Ort, Beginn, Ende und Pause – so lässt sich ein Tag sauber aufteilen: ein Teil Urlaub, der Rest gearbeitet. Ein halber Tag ist also einfach die halbe Stundenzahl. Das Urlaubskonto wird entsprechend anteilig belastet.</w:t>
-      </w:r>
-    </w:p>
-    <w:p>
-      <w:pPr>
-        <w:pStyle w:val="ListNumber"/>
-      </w:pPr>
-      <w:r>
-        <w:t xml:space="preserve">Bei </w:t>
-      </w:r>
-      <w:r>
-        <w:rPr>
-          <w:b/>
-        </w:rPr>
-        <w:t>Sonderurlaub</w:t>
-      </w:r>
-      <w:r>
-        <w:t xml:space="preserve"> zusätzlich den </w:t>
-      </w:r>
-      <w:r>
-        <w:rPr>
-          <w:b/>
-        </w:rPr>
-        <w:t>Grund</w:t>
-      </w:r>
-      <w:r>
-        <w:t xml:space="preserve"> wählen: Pflegefreistellung, Umzug, Hochzeit, Geburt, Todesfall oder Sonstiges (bei „Sonstiges" den Anlass in die Notiz schreiben). Sonderurlaub wird </w:t>
-      </w:r>
-      <w:r>
-        <w:rPr>
-          <w:b/>
-        </w:rPr>
-        <w:t>gezählt, aber nicht vom Urlaubskonto abgezogen</w:t>
-      </w:r>
-      <w:r>
-        <w:t>.</w:t>
-      </w:r>
-    </w:p>
-    <w:p>
-      <w:pPr>
-        <w:pStyle w:val="ListNumber"/>
-      </w:pPr>
-      <w:r>
-        <w:t xml:space="preserve">Optional eine </w:t>
-      </w:r>
-      <w:r>
-        <w:rPr>
-          <w:b/>
-        </w:rPr>
-        <w:t>Notiz</w:t>
-      </w:r>
-      <w:r>
-        <w:t xml:space="preserve"> ergänzen (was/wie/wo/wer).</w:t>
-      </w:r>
-    </w:p>
-    <w:p>
-      <w:pPr>
-        <w:pStyle w:val="ListNumber"/>
-      </w:pPr>
-      <w:r>
-        <w:rPr>
-          <w:b/>
-        </w:rPr>
-        <w:t>Speichern.</w:t>
-      </w:r>
-      <w:r>
-        <w:t xml:space="preserve"> Über </w:t>
-      </w:r>
-      <w:r>
-        <w:rPr>
-          <w:b/>
-        </w:rPr>
-        <w:t>Löschen</w:t>
-      </w:r>
-      <w:r>
-        <w:t xml:space="preserve"> lässt sich ein bestehender Eintrag wieder entfernen.</w:t>
-      </w:r>
-    </w:p>
-    <w:p>
-      <w:pPr>
-        <w:pStyle w:val="Heading3"/>
-      </w:pPr>
-      <w:r>
-        <w:t>4.3 Monat senden / exportieren</w:t>
-      </w:r>
-    </w:p>
-    <w:p>
-      <w:r>
-        <w:t xml:space="preserve">Am Monatsende (oder wann immer nötig) den Monatsbericht an die Firma übergeben: Menü (⋮) → </w:t>
-      </w:r>
-      <w:r>
-        <w:rPr>
-          <w:b/>
-        </w:rPr>
-        <w:t>„Monat exportieren/senden"</w:t>
-      </w:r>
-      <w:r>
-        <w:t>. Der Bericht enthält immer eine Excel-Liste, ein PDF und eine Datendatei für die Auswertung. Je nach Einrichtung stehen bis zu vier Wege zur Wahl:</w:t>
-      </w:r>
-    </w:p>
-    <w:p>
-      <w:pPr>
-        <w:pStyle w:val="ListBullet"/>
-      </w:pPr>
-      <w:r>
-        <w:rPr>
-          <w:b/>
-        </w:rPr>
-        <w:t>„Per Mail senden (automatisch)":</w:t>
-      </w:r>
-      <w:r>
-        <w:t xml:space="preserve"> verschickt den Bericht direkt an die Firmen-Mailadresse (nur wenn der Chef den Mailversand eingerichtet hat; nicht in der Web-App).</w:t>
-      </w:r>
-    </w:p>
-    <w:p>
-      <w:pPr>
-        <w:pStyle w:val="ListBullet"/>
-      </w:pPr>
-      <w:r>
-        <w:rPr>
-          <w:b/>
-        </w:rPr>
-        <w:t>„Kopie an Mitarbeiter":</w:t>
-      </w:r>
-      <w:r>
-        <w:t xml:space="preserve"> zusätzlicher Schalter – schickt Ihnen selbst die Excel-Liste an Ihre hinterlegte Mailadresse.</w:t>
-      </w:r>
-    </w:p>
-    <w:p>
-      <w:pPr>
-        <w:pStyle w:val="ListBullet"/>
-      </w:pPr>
-      <w:r>
-        <w:rPr>
-          <w:b/>
-        </w:rPr>
-        <w:t>„Per Mail-App / Teilen weitergeben":</w:t>
-      </w:r>
-      <w:r>
-        <w:t xml:space="preserve"> öffnet das normale Teilen-Menü des Geräts (z. B. Mail-App). Danach fragt Zeitrax nach, ob die Mail wirklich gesendet wurde.</w:t>
-      </w:r>
-    </w:p>
-    <w:p>
-      <w:pPr>
-        <w:pStyle w:val="ListBullet"/>
-      </w:pPr>
-      <w:r>
-        <w:rPr>
-          <w:b/>
-        </w:rPr>
-        <w:t>„Nur als Dateien speichern":</w:t>
-      </w:r>
-      <w:r>
-        <w:t xml:space="preserve"> legt die Dateien lokal ab (Windows: Ordner „Zeitrax-Exporte" in Dokumente; nicht in der Web-App).</w:t>
-      </w:r>
-    </w:p>
-    <w:p>
-      <w:r>
-        <w:rPr>
-          <w:b/>
-        </w:rPr>
-        <w:t>Automatik und Sende-Sperre</w:t>
-      </w:r>
-      <w:r>
-        <w:t xml:space="preserve"> (je nach Chef-Einstellung):</w:t>
-      </w:r>
-    </w:p>
-    <w:p>
-      <w:pPr>
-        <w:pStyle w:val="ListBullet"/>
-      </w:pPr>
-      <w:r>
-        <w:t xml:space="preserve">Ist der </w:t>
-      </w:r>
-      <w:r>
-        <w:rPr>
-          <w:b/>
-        </w:rPr>
-        <w:t>automatische Versand</w:t>
-      </w:r>
-      <w:r>
-        <w:t xml:space="preserve"> aktiv, verschickt Zeitrax den Vormonat beim ersten Start im neuen Monat von selbst und meldet das kurz.</w:t>
-      </w:r>
-    </w:p>
-    <w:p>
-      <w:pPr>
-        <w:pStyle w:val="ListBullet"/>
-      </w:pPr>
-      <w:r>
-        <w:t xml:space="preserve">Ist die </w:t>
-      </w:r>
-      <w:r>
-        <w:rPr>
-          <w:b/>
-        </w:rPr>
-        <w:t>Sende-Sperre</w:t>
-      </w:r>
-      <w:r>
-        <w:t xml:space="preserve"> aktiv, erscheint am Monatsanfang ein Hinweisbalken „Vormonat noch nicht gesendet" mit dem Knopf </w:t>
-      </w:r>
-      <w:r>
-        <w:rPr>
-          <w:b/>
-        </w:rPr>
-        <w:t>„Jetzt senden"</w:t>
-      </w:r>
-      <w:r>
-        <w:t>. Solange der Vormonat nicht versendet ist, lassen sich im neuen Monat keine Einträge anlegen.</w:t>
-      </w:r>
-    </w:p>
-    <w:p>
-      <w:pPr>
-        <w:pStyle w:val="Heading3"/>
-      </w:pPr>
-      <w:r>
-        <w:t>4.4 Persönliche Einstellungen</w:t>
-      </w:r>
-    </w:p>
-    <w:p>
-      <w:r>
-        <w:t xml:space="preserve">Menü (⋮) → </w:t>
-      </w:r>
-      <w:r>
-        <w:rPr>
-          <w:b/>
-        </w:rPr>
-        <w:t>„Einstellungen"</w:t>
-      </w:r>
-      <w:r>
-        <w:t>:</w:t>
-      </w:r>
-    </w:p>
-    <w:p>
-      <w:pPr>
-        <w:pStyle w:val="ListBullet"/>
-      </w:pPr>
-      <w:r>
-        <w:rPr>
-          <w:b/>
-        </w:rPr>
-        <w:t>Passwort ändern</w:t>
-      </w:r>
-      <w:r>
-        <w:t xml:space="preserve"> (aktuelles Passwort + neues Passwort mit Wiederholung).</w:t>
-      </w:r>
-    </w:p>
-    <w:p>
-      <w:pPr>
-        <w:pStyle w:val="ListBullet"/>
-      </w:pPr>
-      <w:r>
-        <w:rPr>
-          <w:b/>
-        </w:rPr>
-        <w:t>„Anmeldung per Fingerabdruck/Gesicht"</w:t>
-      </w:r>
-      <w:r>
-        <w:t xml:space="preserve"> ein-/ausschalten (nur Windows/Android, und nur wenn der Chef es erlaubt hat; beim Einschalten einmal per Fingerabdruck/Gesicht bestätigen).</w:t>
-      </w:r>
-    </w:p>
-    <w:p>
-      <w:pPr>
-        <w:pStyle w:val="ListBullet"/>
-      </w:pPr>
-      <w:r>
-        <w:rPr>
-          <w:b/>
-        </w:rPr>
-        <w:t>„Heute-Knopf öffnet den Tageseintrag":</w:t>
-      </w:r>
-      <w:r>
-        <w:t xml:space="preserve"> eigene Vorliebe einstellen – übersteuert die Vorgabe des Chefs.</w:t>
-      </w:r>
-    </w:p>
-    <w:p>
-      <w:pPr>
-        <w:pStyle w:val="ListBullet"/>
-      </w:pPr>
-      <w:r>
-        <w:rPr>
-          <w:b/>
-        </w:rPr>
-        <w:t>Deine Sollstunden:</w:t>
-      </w:r>
-      <w:r>
-        <w:t xml:space="preserve"> nur zur Ansicht (ändern kann sie nur der Chef).</w:t>
-      </w:r>
-    </w:p>
-    <w:p>
-      <w:pPr>
-        <w:pStyle w:val="ListBullet"/>
-      </w:pPr>
-      <w:r>
-        <w:rPr>
-          <w:b/>
-        </w:rPr>
-        <w:t>Standardzeiten für neue Einträge</w:t>
-      </w:r>
-      <w:r>
-        <w:t xml:space="preserve"> (Beginn/Ende/Pause) selbst anpassen – damit sind neue Arbeitstage gleich richtig vorbelegt.</w:t>
-      </w:r>
-    </w:p>
-    <w:p>
-      <w:pPr>
-        <w:pStyle w:val="ListBullet"/>
-      </w:pPr>
-      <w:r>
-        <w:rPr>
-          <w:b/>
-        </w:rPr>
-        <w:t>„Freitag hat andere Zeiten":</w:t>
-      </w:r>
-      <w:r>
-        <w:t xml:space="preserve"> Wenn Ihre Sollstunden Mo–Do und Freitag getrennt geführt werden, lässt sich hier ein eigener Freitag hinterlegen (z. B. 07:00–12:00 ohne Pause). Ausgeschaltet gilt am Freitag dieselbe Vorbelegung wie Mo–Do.</w:t>
-      </w:r>
-    </w:p>
-    <w:p>
-      <w:pPr>
-        <w:jc w:val="center"/>
-      </w:pPr>
-      <w:r>
-        <w:t>· · ·</w:t>
-      </w:r>
-    </w:p>
-    <w:p>
-      <w:pPr>
-        <w:pStyle w:val="Heading2"/>
-      </w:pPr>
-      <w:r>
-        <w:t>5. Der Chef-Bereich</w:t>
-      </w:r>
-    </w:p>
-    <w:p>
-      <w:r>
-        <w:t xml:space="preserve">Menü (⋮) → </w:t>
-      </w:r>
-      <w:r>
-        <w:rPr>
-          <w:b/>
-        </w:rPr>
-        <w:t>„Chef-Bereich"</w:t>
-      </w:r>
-      <w:r>
-        <w:t xml:space="preserve"> → </w:t>
-      </w:r>
-      <w:r>
-        <w:rPr>
-          <w:b/>
-        </w:rPr>
-        <w:t>Adminpasswort</w:t>
-      </w:r>
-      <w:r>
-        <w:t xml:space="preserve"> eingeben. Der Bereich hat drei Karteireiter: </w:t>
-      </w:r>
-      <w:r>
-        <w:rPr>
-          <w:b/>
-        </w:rPr>
-        <w:t>Benutzer</w:t>
-      </w:r>
-      <w:r>
-        <w:t xml:space="preserve">, </w:t>
-      </w:r>
-      <w:r>
-        <w:rPr>
-          <w:b/>
-        </w:rPr>
-        <w:t>Mail &amp; Optionen</w:t>
-      </w:r>
-      <w:r>
-        <w:t xml:space="preserve"> und </w:t>
-      </w:r>
-      <w:r>
-        <w:rPr>
-          <w:b/>
-        </w:rPr>
-        <w:t>Auswertung</w:t>
-      </w:r>
-      <w:r>
-        <w:t>.</w:t>
-      </w:r>
-    </w:p>
-    <w:p>
-      <w:pPr>
-        <w:pStyle w:val="Heading3"/>
-      </w:pPr>
-      <w:r>
-        <w:t>5.1 Reiter „Benutzer" – Mitarbeiter verwalten</w:t>
-      </w:r>
-    </w:p>
-    <w:p>
-      <w:r>
-        <w:rPr>
-          <w:b/>
-        </w:rPr>
-        <w:t>Mitarbeiter anlegen</w:t>
-      </w:r>
-      <w:r>
-        <w:t xml:space="preserve"> (Knopf unten rechts):</w:t>
-      </w:r>
-    </w:p>
-    <w:p>
-      <w:pPr>
-        <w:pStyle w:val="ListBullet"/>
-      </w:pPr>
-      <w:r>
-        <w:rPr>
-          <w:b/>
-        </w:rPr>
-        <w:t>Benutzername, Anzeigename</w:t>
-      </w:r>
-      <w:r>
-        <w:t xml:space="preserve"> und ein </w:t>
-      </w:r>
-      <w:r>
-        <w:rPr>
-          <w:b/>
-        </w:rPr>
-        <w:t>Start-Passwort</w:t>
-      </w:r>
-      <w:r>
-        <w:t xml:space="preserve"> (der Mitarbeiter muss es beim ersten Login ändern).</w:t>
-      </w:r>
-    </w:p>
-    <w:p>
-      <w:pPr>
-        <w:pStyle w:val="ListBullet"/>
-      </w:pPr>
-      <w:r>
-        <w:rPr>
-          <w:b/>
-        </w:rPr>
-        <w:t>E-Mail-Adresse des Mitarbeiters</w:t>
-      </w:r>
-      <w:r>
-        <w:t xml:space="preserve"> (optional): dorthin geht auf Wunsch die Excel-Kopie des Monatsberichts.</w:t>
-      </w:r>
-    </w:p>
-    <w:p>
-      <w:pPr>
-        <w:pStyle w:val="ListBullet"/>
-      </w:pPr>
-      <w:r>
-        <w:rPr>
-          <w:b/>
-        </w:rPr>
-        <w:t>Sollstunden:</w:t>
-      </w:r>
-      <w:r>
-        <w:t xml:space="preserve"> Modus „Gleich Mo–Fr" oder „Mo–Do und Freitag getrennt", jeweils mit Stundenwerten (Kommazahlen möglich, z. B. 7,5).</w:t>
-      </w:r>
-    </w:p>
-    <w:p>
-      <w:pPr>
-        <w:pStyle w:val="ListBullet"/>
-      </w:pPr>
-      <w:r>
-        <w:rPr>
-          <w:b/>
-        </w:rPr>
-        <w:t>Anfangsstand mit Stichtag:</w:t>
-      </w:r>
-      <w:r>
-        <w:t xml:space="preserve"> Überstunden-Übertrag aus der Zeit vor Zeitrax.</w:t>
-      </w:r>
-    </w:p>
-    <w:p>
-      <w:pPr>
-        <w:pStyle w:val="ListBullet"/>
-      </w:pPr>
-      <w:r>
-        <w:rPr>
-          <w:b/>
-        </w:rPr>
-        <w:t>„Freitags-Urlaub getrennt führen":</w:t>
-      </w:r>
-      <w:r>
-        <w:t xml:space="preserve"> wenn eingeschaltet, führt Zeitrax zwei Urlaubskonten (Mo–Do und Freitag) – passend zur getrennten Sollzeit.</w:t>
-      </w:r>
-    </w:p>
-    <w:p>
-      <w:pPr>
-        <w:pStyle w:val="ListBullet"/>
-      </w:pPr>
-      <w:r>
-        <w:rPr>
-          <w:b/>
-        </w:rPr>
-        <w:t>Resturlaub-Anfangsstand</w:t>
-      </w:r>
-      <w:r>
-        <w:t xml:space="preserve"> in Tagen (halbe Tage mit Komma, z. B. 12,5; bei getrennter Führung je Konto).</w:t>
-      </w:r>
-    </w:p>
-    <w:p>
-      <w:pPr>
-        <w:pStyle w:val="ListBullet"/>
-      </w:pPr>
-      <w:r>
-        <w:rPr>
-          <w:b/>
-        </w:rPr>
-        <w:t>„Firmenurlaub führen":</w:t>
-      </w:r>
-      <w:r>
-        <w:t xml:space="preserve"> eigenes Konto für internen Zusatzurlaub der Firma – z. B. eine Extra-Woche, die nicht jedem zusteht. Ist der Schalter an, erscheint das Feld </w:t>
-      </w:r>
-      <w:r>
-        <w:rPr>
-          <w:b/>
-        </w:rPr>
-        <w:t>„Firmenurlaub-Kontingent (Tage)"</w:t>
-      </w:r>
-      <w:r>
-        <w:t xml:space="preserve">. Dieses Konto </w:t>
-      </w:r>
-      <w:r>
-        <w:rPr>
-          <w:b/>
-        </w:rPr>
-        <w:t>verfällt nicht</w:t>
-      </w:r>
-      <w:r>
-        <w:t xml:space="preserve">; wenn im nächsten Jahr wieder Tage dazukommen, erhöhen Sie den Wert einfach selbst (aus 5 werden dann 10). Der Mitarbeiter bucht davon über die Tagesart </w:t>
-      </w:r>
-      <w:r>
-        <w:rPr>
-          <w:b/>
-        </w:rPr>
-        <w:t>Firmenurlaub</w:t>
-      </w:r>
-      <w:r>
-        <w:t xml:space="preserve"> ab – das normale Urlaubskonto bleibt unberührt.</w:t>
-      </w:r>
-    </w:p>
-    <w:p>
-      <w:pPr>
-        <w:pStyle w:val="ListBullet"/>
-      </w:pPr>
-      <w:r>
-        <w:rPr>
-          <w:b/>
-        </w:rPr>
-        <w:t>Zeitausgleich-Anfangsstand</w:t>
-      </w:r>
-      <w:r>
-        <w:t xml:space="preserve"> als Dezimalzahl in Stunden, z. B. </w:t>
-      </w:r>
-      <w:r>
-        <w:rPr>
-          <w:b/>
-        </w:rPr>
-        <w:t>43,35 = 43 Stunden 21 Minuten</w:t>
-      </w:r>
-      <w:r>
-        <w:t xml:space="preserve"> (Komma oder Punkt), mit </w:t>
-      </w:r>
-      <w:r>
-        <w:rPr>
-          <w:b/>
-        </w:rPr>
-        <w:t>+/−-Umschalter</w:t>
-      </w:r>
-      <w:r>
-        <w:t xml:space="preserve"> für Guthaben oder Schulden.</w:t>
-      </w:r>
-    </w:p>
-    <w:p>
-      <w:pPr>
-        <w:pStyle w:val="ListBullet"/>
-      </w:pPr>
-      <w:r>
-        <w:rPr>
-          <w:b/>
-        </w:rPr>
-        <w:t>Standardzeiten</w:t>
-      </w:r>
-      <w:r>
-        <w:t xml:space="preserve"> (Beginn/Ende/Pause) als Vorbelegung für neue Einträge; bei getrenntem Freitags-Soll zusätzlich der Schalter </w:t>
-      </w:r>
-      <w:r>
-        <w:rPr>
-          <w:b/>
-        </w:rPr>
-        <w:t>„Freitag hat andere Zeiten"</w:t>
-      </w:r>
-      <w:r>
-        <w:t xml:space="preserve"> für einen kürzeren Freitag.</w:t>
-      </w:r>
-    </w:p>
-    <w:p>
-      <w:r>
-        <w:rPr>
-          <w:b/>
-        </w:rPr>
-        <w:t>Pro Mitarbeiter</w:t>
-      </w:r>
-      <w:r>
-        <w:t xml:space="preserve"> gibt es außerdem im Menü der Zeile:</w:t>
-      </w:r>
-    </w:p>
-    <w:p>
-      <w:pPr>
-        <w:pStyle w:val="ListBullet"/>
-      </w:pPr>
-      <w:r>
-        <w:rPr>
-          <w:b/>
-        </w:rPr>
-        <w:t>Profil bearbeiten</w:t>
-      </w:r>
-      <w:r>
-        <w:t xml:space="preserve"> – alle obigen Felder nachträglich korrigierbar.</w:t>
-      </w:r>
-    </w:p>
-    <w:p>
-      <w:pPr>
-        <w:pStyle w:val="ListBullet"/>
-      </w:pPr>
-      <w:r>
-        <w:rPr>
-          <w:b/>
-        </w:rPr>
-        <w:t>Passwort zurücksetzen</w:t>
-      </w:r>
-      <w:r>
-        <w:t xml:space="preserve"> – neues Start-Passwort vergeben (Wechsel beim nächsten Login erzwungen). So hilft man Mitarbeitern, die ihr Passwort vergessen haben.</w:t>
-      </w:r>
-    </w:p>
-    <w:p>
-      <w:pPr>
-        <w:pStyle w:val="ListBullet"/>
-      </w:pPr>
-      <w:r>
-        <w:rPr>
-          <w:b/>
-        </w:rPr>
-        <w:t>Löschen</w:t>
-      </w:r>
-      <w:r>
-        <w:t xml:space="preserve"> – entfernt den Benutzer </w:t>
-      </w:r>
-      <w:r>
-        <w:rPr>
-          <w:b/>
-        </w:rPr>
-        <w:t>mitsamt allen Einträgen</w:t>
-      </w:r>
-      <w:r>
-        <w:t xml:space="preserve"> auf diesem Gerät (Warnung wird angezeigt).</w:t>
-      </w:r>
-    </w:p>
-    <w:p>
-      <w:r>
-        <w:rPr>
-          <w:b/>
-        </w:rPr>
-        <w:t>Benutzer übertragen</w:t>
-      </w:r>
-      <w:r>
-        <w:t xml:space="preserve"> (Karte oben im Reiter) – damit Sie die Mitarbeiter </w:t>
-      </w:r>
-      <w:r>
-        <w:rPr>
-          <w:b/>
-        </w:rPr>
-        <w:t>nur einmal anlegen</w:t>
-      </w:r>
-      <w:r>
-        <w:t xml:space="preserve"> und auf allen Geräten nutzen können (funktioniert auf </w:t>
-      </w:r>
-      <w:r>
-        <w:rPr>
-          <w:b/>
-        </w:rPr>
-        <w:t>allen</w:t>
-      </w:r>
-      <w:r>
-        <w:t xml:space="preserve"> Geräten, auch am iPhone):</w:t>
-      </w:r>
-    </w:p>
-    <w:p>
-      <w:pPr>
-        <w:pStyle w:val="ListBullet"/>
-      </w:pPr>
-      <w:r>
-        <w:rPr>
-          <w:b/>
-        </w:rPr>
-        <w:t>„Benutzer exportieren…":</w:t>
-      </w:r>
-      <w:r>
-        <w:t xml:space="preserve"> speichert alle Mitarbeiter mit ihrem vollständigen Profil und (verschlüsseltem) Passwort in einer Datei – seit Version 1.3.0 zusammen mit dem </w:t>
-      </w:r>
-      <w:r>
-        <w:rPr>
-          <w:b/>
-        </w:rPr>
-        <w:t>Adminpasswort</w:t>
-      </w:r>
-      <w:r>
-        <w:t xml:space="preserve">. Am Windows-PC per „Speichern unter", am Handy/iPhone über das Teilen-Menü. </w:t>
-      </w:r>
-      <w:r>
-        <w:rPr>
-          <w:b/>
-        </w:rPr>
-        <w:t>Die Datei enthält Zugangsdaten – vertraulich behandeln.</w:t>
-      </w:r>
-    </w:p>
-    <w:p>
-      <w:pPr>
-        <w:pStyle w:val="ListBullet"/>
-      </w:pPr>
-      <w:r>
-        <w:rPr>
-          <w:b/>
-        </w:rPr>
-        <w:t>„Benutzer importieren…":</w:t>
-      </w:r>
-      <w:r>
-        <w:t xml:space="preserve"> spielt diese Datei auf einem anderen Gerät ein. </w:t>
-      </w:r>
-      <w:r>
-        <w:rPr>
-          <w:b/>
-        </w:rPr>
-        <w:t>Neue</w:t>
-      </w:r>
-      <w:r>
-        <w:t xml:space="preserve"> Mitarbeiter werden angelegt, sodass sich alle sofort mit demselben Passwort anmelden können. </w:t>
-      </w:r>
-      <w:r>
-        <w:rPr>
-          <w:b/>
-        </w:rPr>
-        <w:t>Bereits vorhandene</w:t>
-      </w:r>
-      <w:r>
-        <w:t xml:space="preserve"> Mitarbeiter behalten ihr Passwort, ihre bisherigen Einträge und ihre Anfangsstände – nur die Stundeneinteilung (Sollstunden, Standardzeiten) und die E-Mail-Adresse werden aus der Datei aktualisiert. Das Adminpasswort dieses Geräts wird dabei </w:t>
-      </w:r>
-      <w:r>
-        <w:rPr>
-          <w:b/>
-        </w:rPr>
-        <w:t>nie</w:t>
-      </w:r>
-      <w:r>
-        <w:t xml:space="preserve"> überschrieben.</w:t>
-      </w:r>
-    </w:p>
-    <w:p>
-      <w:r>
-        <w:t>So richten Sie z. B. alle Mitarbeiter an Ihrem Rechner ein und verteilen die Datei anschließend an die einzelnen Geräte, statt überall alles neu einzutippen.</w:t>
-      </w:r>
-    </w:p>
-    <w:p>
-      <w:r>
-        <w:rPr>
-          <w:b/>
-        </w:rPr>
-        <w:t>Neues Gerät ohne Tipparbeit einrichten (ab 1.3.0):</w:t>
-      </w:r>
-      <w:r>
-        <w:t xml:space="preserve"> Auf einem frischen Gerät genügt es, nach der Lizenz-Freischaltung im Einrichtungs-Bildschirm auf </w:t>
-      </w:r>
-      <w:r>
-        <w:rPr>
-          <w:b/>
-        </w:rPr>
-        <w:t>„Benutzerdatei übernehmen…"</w:t>
-      </w:r>
-      <w:r>
-        <w:t xml:space="preserve"> zu tippen und die exportierte Datei zu wählen. Weil die Datei auch das Adminpasswort mitbringt, ist die Einrichtung damit </w:t>
-      </w:r>
-      <w:r>
-        <w:rPr>
-          <w:b/>
-        </w:rPr>
-        <w:t>fertig</w:t>
-      </w:r>
-      <w:r>
-        <w:t xml:space="preserve"> – es erscheint sofort der Anmeldebildschirm, und Sie melden sich mit Ihrem gewohnten Passwort an. Es muss kein einziges Feld mehr ausgefüllt werden. (Bei einer älteren Datei aus Version 1.2.5 werden die Mitarbeiter zwar übernommen, das Adminpasswort ist dann aber noch einmal zu vergeben.)</w:t>
-      </w:r>
-    </w:p>
-    <w:p>
-      <w:pPr>
-        <w:pStyle w:val="Heading3"/>
-      </w:pPr>
-      <w:r>
-        <w:t>5.2 Reiter „Mail &amp; Optionen"</w:t>
-      </w:r>
-    </w:p>
-    <w:p>
-      <w:r>
-        <w:rPr>
-          <w:b/>
-        </w:rPr>
-        <w:t>Mailversand</w:t>
-      </w:r>
-      <w:r>
-        <w:t xml:space="preserve"> (nur Windows/Android; in der Web-App erscheint stattdessen ein Hinweis):</w:t>
-      </w:r>
-    </w:p>
-    <w:p>
-      <w:pPr>
-        <w:pStyle w:val="ListBullet"/>
-      </w:pPr>
-      <w:r>
-        <w:rPr>
-          <w:b/>
-        </w:rPr>
-        <w:t>Ziel-Mailadresse</w:t>
-      </w:r>
-      <w:r>
-        <w:t xml:space="preserve"> (dorthin gehen die Monatsberichte, z. B. die Chef-Adresse).</w:t>
-      </w:r>
-    </w:p>
-    <w:p>
-      <w:pPr>
-        <w:pStyle w:val="ListBullet"/>
-      </w:pPr>
-      <w:r>
-        <w:t xml:space="preserve">Zugangsdaten des Mail-Anbieters: </w:t>
-      </w:r>
-      <w:r>
-        <w:rPr>
-          <w:b/>
-        </w:rPr>
-        <w:t>SMTP-Server, Port</w:t>
-      </w:r>
-      <w:r>
-        <w:t xml:space="preserve"> (465 = SSL), </w:t>
-      </w:r>
-      <w:r>
-        <w:rPr>
-          <w:b/>
-        </w:rPr>
-        <w:t>SSL-Schalter, SMTP-Benutzer, SMTP-Passwort</w:t>
-      </w:r>
-      <w:r>
-        <w:t>.</w:t>
-      </w:r>
-    </w:p>
-    <w:p>
-      <w:pPr>
-        <w:pStyle w:val="ListBullet"/>
-      </w:pPr>
-      <w:r>
-        <w:rPr>
-          <w:b/>
-        </w:rPr>
-        <w:t>„Testmail senden"</w:t>
-      </w:r>
-      <w:r>
-        <w:t xml:space="preserve"> prüft die Einstellungen sofort.</w:t>
-      </w:r>
-    </w:p>
-    <w:p>
-      <w:pPr>
-        <w:pStyle w:val="ListBullet"/>
-      </w:pPr>
-      <w:r>
-        <w:rPr>
-          <w:b/>
-        </w:rPr>
-        <w:t>„Automatischer Versand am Monatsanfang":</w:t>
-      </w:r>
-      <w:r>
-        <w:t xml:space="preserve"> wenn aktiv, verschickt jedes Gerät den Vormonat selbstständig.</w:t>
-      </w:r>
-    </w:p>
-    <w:p>
-      <w:r>
-        <w:rPr>
-          <w:b/>
-        </w:rPr>
-        <w:t>Regeln:</w:t>
-      </w:r>
-    </w:p>
-    <w:p>
-      <w:pPr>
-        <w:pStyle w:val="ListBullet"/>
-      </w:pPr>
-      <w:r>
-        <w:rPr>
-          <w:b/>
-        </w:rPr>
-        <w:t>„Sende-Sperre am Monatswechsel":</w:t>
-      </w:r>
-      <w:r>
-        <w:t xml:space="preserve"> neue Monatseinträge erst nach Versand des Vormonats (empfehlenswert, wenn Mitarbeiter die Web-App nutzen und selbst senden müssen).</w:t>
-      </w:r>
-    </w:p>
-    <w:p>
-      <w:pPr>
-        <w:pStyle w:val="ListBullet"/>
-      </w:pPr>
-      <w:r>
-        <w:rPr>
-          <w:b/>
-        </w:rPr>
-        <w:t>„Heute-Knopf öffnet den Tageseintrag":</w:t>
-      </w:r>
-      <w:r>
-        <w:t xml:space="preserve"> Vorgabe für alle Mitarbeiter (jeder kann sie in den eigenen Einstellungen übersteuern).</w:t>
-      </w:r>
-    </w:p>
-    <w:p>
-      <w:pPr>
-        <w:pStyle w:val="ListBullet"/>
-      </w:pPr>
-      <w:r>
-        <w:rPr>
-          <w:b/>
-        </w:rPr>
-        <w:t>„Selbst-Registrierung erlauben":</w:t>
-      </w:r>
-      <w:r>
-        <w:t xml:space="preserve"> Mitarbeiter dürfen sich am Anmeldebildschirm selbst ein Profil anlegen.</w:t>
-      </w:r>
-    </w:p>
-    <w:p>
-      <w:pPr>
-        <w:pStyle w:val="ListBullet"/>
-      </w:pPr>
-      <w:r>
-        <w:rPr>
-          <w:b/>
-        </w:rPr>
-        <w:t>„Biometrische Anmeldung erlauben":</w:t>
-      </w:r>
-      <w:r>
-        <w:t xml:space="preserve"> schaltet die Anmeldung per Fingerabdruck/Gesicht firmenweit frei.</w:t>
-      </w:r>
-    </w:p>
-    <w:p>
-      <w:r>
-        <w:t xml:space="preserve">Nach Änderungen unten auf </w:t>
-      </w:r>
-      <w:r>
-        <w:rPr>
-          <w:b/>
-        </w:rPr>
-        <w:t>Speichern</w:t>
-      </w:r>
-      <w:r>
-        <w:t xml:space="preserve"> tippen.</w:t>
-      </w:r>
-    </w:p>
-    <w:p>
-      <w:r>
-        <w:rPr>
-          <w:b/>
-        </w:rPr>
-        <w:t>Datensicherung</w:t>
-      </w:r>
-      <w:r>
-        <w:t xml:space="preserve"> (nur Windows/Android):</w:t>
-      </w:r>
-    </w:p>
-    <w:p>
-      <w:pPr>
-        <w:pStyle w:val="ListBullet"/>
-      </w:pPr>
-      <w:r>
-        <w:rPr>
-          <w:b/>
-        </w:rPr>
-        <w:t>„Sicherung erstellen…":</w:t>
-      </w:r>
-      <w:r>
-        <w:t xml:space="preserve"> speichert die komplette Datenbank (alle Benutzer, Einträge, Einstellungen und die Freischaltung) als eine Datei </w:t>
-      </w:r>
-      <w:r>
-        <w:rPr>
-          <w:rFonts w:ascii="Consolas" w:hAnsi="Consolas"/>
-          <w:sz w:val="20"/>
-        </w:rPr>
-        <w:t>Zeitrax_Sicherung_&lt;Datum&gt;.zeitraxdb</w:t>
-      </w:r>
-      <w:r>
-        <w:t xml:space="preserve"> an einen wählbaren Ort. Regelmäßig machen – z. B. auf einen USB-Stick!</w:t>
-      </w:r>
-    </w:p>
-    <w:p>
-      <w:pPr>
-        <w:pStyle w:val="ListBullet"/>
-      </w:pPr>
-      <w:r>
-        <w:rPr>
-          <w:b/>
-        </w:rPr>
-        <w:t>„Sicherung wiederherstellen…":</w:t>
-      </w:r>
-      <w:r>
-        <w:t xml:space="preserve"> spielt eine Sicherungsdatei zurück. </w:t>
-      </w:r>
-      <w:r>
-        <w:rPr>
-          <w:b/>
-        </w:rPr>
-        <w:t>Achtung:</w:t>
-      </w:r>
-      <w:r>
-        <w:t xml:space="preserve"> Ersetzt alle aktuellen Daten auf dem Gerät (Warnhinweis); danach startet die App neu. So zieht man auch auf einen neuen PC um.</w:t>
-      </w:r>
-    </w:p>
-    <w:p>
-      <w:r>
-        <w:rPr>
-          <w:b/>
-        </w:rPr>
-        <w:t>Lizenz:</w:t>
-      </w:r>
-    </w:p>
-    <w:p>
-      <w:pPr>
-        <w:pStyle w:val="ListBullet"/>
-      </w:pPr>
-      <w:r>
-        <w:rPr>
-          <w:b/>
-        </w:rPr>
-        <w:t>„Lizenzdatei importieren…":</w:t>
-      </w:r>
-      <w:r>
-        <w:t xml:space="preserve"> spielt eine neue Lizenzdatei vom Entwickler ein (z. B. eine aktualisierte Lizenz). Die bestehende Freischaltung und alle Daten bleiben erhalten.</w:t>
-      </w:r>
-    </w:p>
-    <w:p>
-      <w:pPr>
-        <w:pStyle w:val="Heading3"/>
-      </w:pPr>
-      <w:r>
-        <w:t>5.3 Reiter „Auswertung" – Monatsberichte der Mitarbeiter</w:t>
-      </w:r>
-    </w:p>
-    <w:p>
-      <w:r>
-        <w:t>Hier führt der Chef die Berichte aller Mitarbeiter zusammen (auch von fremden Geräten):</w:t>
-      </w:r>
-    </w:p>
-    <w:p>
-      <w:pPr>
-        <w:pStyle w:val="ListNumber"/>
-      </w:pPr>
-      <w:r>
-        <w:rPr>
-          <w:b/>
-        </w:rPr>
-        <w:t>„JSON-Dateien importieren":</w:t>
-      </w:r>
-      <w:r>
-        <w:t xml:space="preserve"> die Datendateien auswählen, die die Mitarbeiter per Mail geschickt haben (Mehrfachauswahl möglich).</w:t>
-      </w:r>
-    </w:p>
-    <w:p>
-      <w:pPr>
-        <w:pStyle w:val="ListNumber"/>
-      </w:pPr>
-      <w:r>
-        <w:t xml:space="preserve">Zeitrax zeigt eine </w:t>
-      </w:r>
-      <w:r>
-        <w:rPr>
-          <w:b/>
-        </w:rPr>
-        <w:t>Karte pro Mitarbeiter</w:t>
-      </w:r>
-      <w:r>
-        <w:t xml:space="preserve"> mit den Überstunden gesamt – zum Aufklappen. Beim Aufklappen erscheinen:</w:t>
-      </w:r>
-    </w:p>
-    <w:p>
-      <w:pPr>
-        <w:pStyle w:val="ListBullet2"/>
-      </w:pPr>
-      <w:r>
-        <w:t xml:space="preserve">ein </w:t>
-      </w:r>
-      <w:r>
-        <w:rPr>
-          <w:b/>
-        </w:rPr>
-        <w:t>Balkendiagramm der Überstunden je Monat</w:t>
-      </w:r>
-      <w:r>
-        <w:t xml:space="preserve"> (grün = Plus, rot = Minus),</w:t>
-      </w:r>
-    </w:p>
-    <w:p>
-      <w:pPr>
-        <w:pStyle w:val="ListBullet2"/>
-      </w:pPr>
-      <w:r>
-        <w:t xml:space="preserve">ein </w:t>
-      </w:r>
-      <w:r>
-        <w:rPr>
-          <w:b/>
-        </w:rPr>
-        <w:t>Ist/Soll-Diagramm</w:t>
-      </w:r>
-      <w:r>
-        <w:t>: ein Balken je Monat für die geleisteten Stunden, darüber eine waagrechte Marke für das Soll – wer darüber liegt, hat einen grünen Überstand, wer darunter bleibt, eine rote Lücke,</w:t>
-      </w:r>
-    </w:p>
-    <w:p>
-      <w:pPr>
-        <w:pStyle w:val="ListBullet2"/>
-      </w:pPr>
-      <w:r>
-        <w:t xml:space="preserve">und darunter eine </w:t>
-      </w:r>
-      <w:r>
-        <w:rPr>
-          <w:b/>
-        </w:rPr>
-        <w:t>kompakte Tabelle mit genau einer Zeile je Monat</w:t>
-      </w:r>
-      <w:r>
-        <w:t xml:space="preserve">: Monat, Ist, Soll, +/−, Urlaub, Sonderurlaub, Firmenurlaub, Krank, Zeitausgleich, Feiertage. Auf schmalen Bildschirmen lässt sich die Tabelle seitlich schieben, die Monatsspalte bleibt dabei stehen. Ein Strich („–") heißt: in diesem Monat gab es davon nichts. </w:t>
-      </w:r>
-      <w:r>
-        <w:rPr>
-          <w:b/>
-        </w:rPr>
-        <w:t>Halbe und geteilte Urlaubstage zählen korrekt mit Nachkommastelle</w:t>
-      </w:r>
-      <w:r>
-        <w:t xml:space="preserve"> (ein halber Tag ist 0,5, nicht mehr 1).</w:t>
-      </w:r>
-    </w:p>
-    <w:p>
-      <w:pPr>
-        <w:pStyle w:val="ListNumber"/>
-      </w:pPr>
-      <w:r>
-        <w:rPr>
-          <w:b/>
-        </w:rPr>
-        <w:t>Ein Mitarbeiter an mehreren Geräten:</w:t>
-      </w:r>
-      <w:r>
-        <w:t xml:space="preserve"> Schreibt dieselbe Person (gleicher Benutzername) auf mehreren Geräten Stunden, werden die importierten Berichte </w:t>
-      </w:r>
-      <w:r>
-        <w:rPr>
-          <w:b/>
-        </w:rPr>
-        <w:t>taggenau zusammengeführt</w:t>
-      </w:r>
-      <w:r>
-        <w:t xml:space="preserve"> – die Tage von allen Geräten ergeben zusammen den Monat, es geht nichts verloren. Schickt jemand denselben Monat korrigiert erneut, wird nur der geänderte Tag ersetzt.</w:t>
-      </w:r>
-    </w:p>
-    <w:p>
-      <w:pPr>
-        <w:pStyle w:val="ListNumber"/>
-      </w:pPr>
-      <w:r>
-        <w:rPr>
-          <w:b/>
-        </w:rPr>
-        <w:t>„Auswertung exportieren":</w:t>
-      </w:r>
-      <w:r>
-        <w:t xml:space="preserve"> erzeugt eine Gesamtübersicht als </w:t>
-      </w:r>
-      <w:r>
-        <w:rPr>
-          <w:b/>
-        </w:rPr>
-        <w:t>Excel und PDF</w:t>
-      </w:r>
-      <w:r>
-        <w:t>. Am Windows-PC per „Speichern unter", auf Handy/Tablet über das Teilen-Menü.</w:t>
-      </w:r>
-    </w:p>
-    <w:p>
-      <w:pPr>
-        <w:jc w:val="center"/>
-      </w:pPr>
-      <w:r>
-        <w:t>· · ·</w:t>
-      </w:r>
-    </w:p>
-    <w:p>
-      <w:pPr>
-        <w:pStyle w:val="Heading2"/>
-      </w:pPr>
-      <w:r>
-        <w:t>6. Firmen-Logo und Farben (versteckter Bereich)</w:t>
-      </w:r>
-    </w:p>
-    <w:p>
-      <w:r>
-        <w:t>Zeitrax kann mit dem eigenen Firmenauftritt versehen werden – Logo und Akzentfarbe erscheinen in der App und auf den Excel-/PDF-Berichten. Dieser Bereich ist bewusst versteckt und durch ein eigenes Passwort geschützt:</w:t>
-      </w:r>
-    </w:p>
-    <w:p>
-      <w:pPr>
-        <w:pStyle w:val="ListNumber"/>
-      </w:pPr>
-      <w:r>
-        <w:t xml:space="preserve">Menü (⋮) → </w:t>
-      </w:r>
-      <w:r>
-        <w:rPr>
-          <w:b/>
-        </w:rPr>
-        <w:t>„Über Zeitrax"</w:t>
-      </w:r>
-      <w:r>
-        <w:t>.</w:t>
-      </w:r>
-    </w:p>
-    <w:p>
-      <w:pPr>
-        <w:pStyle w:val="ListNumber"/>
-      </w:pPr>
-      <w:r>
-        <w:rPr>
-          <w:b/>
-        </w:rPr>
-        <w:t>7-mal auf die Versionsnummer tippen.</w:t>
-      </w:r>
-    </w:p>
-    <w:p>
-      <w:pPr>
-        <w:pStyle w:val="ListNumber"/>
-      </w:pPr>
-      <w:r>
-        <w:t xml:space="preserve">Das </w:t>
-      </w:r>
-      <w:r>
-        <w:rPr>
-          <w:b/>
-        </w:rPr>
-        <w:t>Entwickler-Passwort</w:t>
-      </w:r>
-      <w:r>
-        <w:t xml:space="preserve"> eingeben (steht in den Lizenzunterlagen vom Entwickler).</w:t>
-      </w:r>
-    </w:p>
-    <w:p>
-      <w:r>
-        <w:t>Im Bereich lassen sich einstellen:</w:t>
-      </w:r>
-    </w:p>
-    <w:p>
-      <w:pPr>
-        <w:pStyle w:val="ListBullet"/>
-      </w:pPr>
-      <w:r>
-        <w:rPr>
-          <w:b/>
-        </w:rPr>
-        <w:t>Firmendaten</w:t>
-      </w:r>
-      <w:r>
-        <w:t xml:space="preserve"> (Name, Adresse, Telefon, E-Mail – erscheinen auf den Berichten).</w:t>
-      </w:r>
-    </w:p>
-    <w:p>
-      <w:pPr>
-        <w:pStyle w:val="ListBullet"/>
-      </w:pPr>
-      <w:r>
-        <w:rPr>
-          <w:b/>
-        </w:rPr>
-        <w:t>Logo</w:t>
-      </w:r>
-      <w:r>
-        <w:t xml:space="preserve"> wählen, ändern oder entfernen.</w:t>
-      </w:r>
-    </w:p>
-    <w:p>
-      <w:pPr>
-        <w:pStyle w:val="ListBullet"/>
-      </w:pPr>
-      <w:r>
-        <w:rPr>
-          <w:b/>
-        </w:rPr>
-        <w:t>Akzentfarbe</w:t>
-      </w:r>
-      <w:r>
-        <w:t xml:space="preserve"> (8 Farben zur Auswahl) – färbt die ganze App und die Berichte.</w:t>
-      </w:r>
-    </w:p>
-    <w:p>
-      <w:pPr>
-        <w:pStyle w:val="ListBullet"/>
-      </w:pPr>
-      <w:r>
-        <w:rPr>
-          <w:b/>
-        </w:rPr>
-        <w:t>Vorlage für den Mail-Betreff</w:t>
-      </w:r>
-      <w:r>
-        <w:t xml:space="preserve"> mit Platzhaltern wie {Mitarbeiter}, {Monat}, {Jahr}, {Firma}.</w:t>
-      </w:r>
-    </w:p>
-    <w:p>
-      <w:pPr>
-        <w:pStyle w:val="ListBullet"/>
-      </w:pPr>
-      <w:r>
-        <w:rPr>
-          <w:b/>
-        </w:rPr>
-        <w:t>„Lizenzdatei exportieren":</w:t>
-      </w:r>
-      <w:r>
-        <w:t xml:space="preserve"> speichert die Lizenz dieses Geräts als Datei – praktisch, um ein weiteres Gerät der Firma per Datei-Import freizuschalten (Abschnitt 2, Schritt 1).</w:t>
-      </w:r>
-    </w:p>
-    <w:p>
-      <w:pPr>
-        <w:jc w:val="center"/>
-      </w:pPr>
-      <w:r>
-        <w:t>· · ·</w:t>
-      </w:r>
-    </w:p>
-    <w:p>
-      <w:pPr>
-        <w:pStyle w:val="Heading2"/>
-      </w:pPr>
-      <w:r>
-        <w:t>7. Häufige Fragen</w:t>
-      </w:r>
-    </w:p>
-    <w:p>
-      <w:r>
-        <w:rPr>
-          <w:b/>
-        </w:rPr>
-        <w:t>Wo sind meine Daten?</w:t>
-      </w:r>
-    </w:p>
-    <w:p>
-      <w:r>
-        <w:t xml:space="preserve">Immer nur lokal am jeweiligen Gerät. Windows: </w:t>
-      </w:r>
-      <w:r>
-        <w:rPr>
-          <w:rFonts w:ascii="Consolas" w:hAnsi="Consolas"/>
-          <w:sz w:val="20"/>
-        </w:rPr>
-        <w:t>zeitrax.sqlite</w:t>
-      </w:r>
-      <w:r>
-        <w:t xml:space="preserve"> im Dokumente-Ordner. Android: im App-Speicher. iPhone/Web-App: im Browser-Speicher.</w:t>
-      </w:r>
-    </w:p>
-    <w:p>
-      <w:r>
-        <w:rPr>
-          <w:b/>
-        </w:rPr>
-        <w:t>Ich habe mein Passwort vergessen.</w:t>
-      </w:r>
-    </w:p>
-    <w:p>
-      <w:r>
-        <w:t xml:space="preserve">Der Chef setzt es im Chef-Bereich zurück (Reiter „Benutzer" → „Passwort zurücksetzen"). </w:t>
-      </w:r>
-      <w:r>
-        <w:rPr>
-          <w:b/>
-        </w:rPr>
-        <w:t>Ausnahme Adminpasswort:</w:t>
-      </w:r>
-      <w:r>
-        <w:t xml:space="preserve"> Das Passwort für den Chef-Bereich kann </w:t>
+      <w:r>
+        <w:t xml:space="preserve">Ja. Freischalten mit demselben Code, danach den Namen eintragen. Die Geräte gleichen sich aber </w:t>
       </w:r>
       <w:r>
         <w:rPr>
@@ -2636,7 +1738,7 @@
         <w:t>nicht</w:t>
       </w:r>
       <w:r>
-        <w:t xml:space="preserve"> geändert oder zurückgesetzt werden – deshalb bei der Einrichtung gut aufbewahren.</w:t>
+        <w:t xml:space="preserve"> miteinander ab – jedes führt seinen eigenen Bestand. Um umzuziehen, verwenden Sie „Sicherung erstellen" und spielen die Datei am neuen Gerät ein.</w:t>
       </w:r>
     </w:p>
     <w:p>
@@ -2644,148 +1746,38 @@
         <w:rPr>
           <w:b/>
         </w:rPr>
-        <w:t>Neuer PC / neues Gerät – wie ziehe ich um?</w:t>
+        <w:t>Stimmen die Zahlen auch rückwirkend, wenn ich meine Sollstunden später ändere?</w:t>
       </w:r>
     </w:p>
     <w:p>
       <w:r>
-        <w:t xml:space="preserve">Windows/Android: Im Chef-Bereich eine </w:t>
-      </w:r>
+        <w:t>Ja. Zeitexa rechnet immer mit den aktuellen Einstellungen und schreibt die Konten ab dem Stichtag fort.</w:t>
+      </w:r>
+    </w:p>
+    <w:p>
       <w:r>
         <w:rPr>
           <w:b/>
         </w:rPr>
-        <w:t>Datensicherung erstellen</w:t>
-      </w:r>
-      <w:r>
-        <w:t xml:space="preserve">, am neuen Gerät Zeitrax installieren, freischalten und die </w:t>
-      </w:r>
+        <w:t>Werden Feiertage automatisch berücksichtigt?</w:t>
+      </w:r>
+    </w:p>
+    <w:p>
+      <w:r>
+        <w:t>Die österreichischen gesetzlichen Feiertage schlägt die App beim Eintragen vor.</w:t>
+      </w:r>
+    </w:p>
+    <w:p>
       <w:r>
         <w:rPr>
           <w:b/>
         </w:rPr>
-        <w:t>Sicherung wiederherstellen</w:t>
-      </w:r>
-      <w:r>
-        <w:t xml:space="preserve"> – alles ist wieder da. Am iPhone gibt es keine Sicherung; dort schützt der regelmäßige Monatsversand vor Datenverlust.</w:t>
+        <w:t>Wo bleiben meine Daten?</w:t>
       </w:r>
     </w:p>
     <w:p>
       <w:r>
-        <w:rPr>
-          <w:b/>
-        </w:rPr>
-        <w:t>Ich habe ein neues Handy – sind die Daten weg?</w:t>
-      </w:r>
-    </w:p>
-    <w:p>
-      <w:r>
-        <w:t>Die Daten bleiben am alten Gerät. Android: vorher eine Datensicherung erstellen und am neuen Handy wiederherstellen. Generell gilt: Monat für Monat den Bericht verschicken, dann ist nichts verloren.</w:t>
-      </w:r>
-    </w:p>
-    <w:p>
-      <w:r>
-        <w:rPr>
-          <w:b/>
-        </w:rPr>
-        <w:t>Wie richte ich viele Geräte ein, ohne die Mitarbeiter überall neu anzulegen?</w:t>
-      </w:r>
-    </w:p>
-    <w:p>
-      <w:r>
-        <w:t xml:space="preserve">Legen Sie alle Mitarbeiter einmal an einem Gerät an und exportieren Sie sie im Chef-Bereich (Reiter „Benutzer" → </w:t>
-      </w:r>
-      <w:r>
-        <w:rPr>
-          <w:b/>
-        </w:rPr>
-        <w:t>„Benutzer exportieren…"</w:t>
-      </w:r>
-      <w:r>
-        <w:t xml:space="preserve">). Auf jedem weiteren Gerät nach der Freischaltung und der kurzen Ersteinrichtung die Datei über </w:t>
-      </w:r>
-      <w:r>
-        <w:rPr>
-          <w:b/>
-        </w:rPr>
-        <w:t>„Benutzer importieren…"</w:t>
-      </w:r>
-      <w:r>
-        <w:t xml:space="preserve"> einspielen – schon können sich alle mit demselben Passwort anmelden (Abschnitt 5.1). Das funktioniert auch am iPhone.</w:t>
-      </w:r>
-    </w:p>
-    <w:p>
-      <w:r>
-        <w:rPr>
-          <w:b/>
-        </w:rPr>
-        <w:t>Der Freischaltcode wird nicht angenommen.</w:t>
-      </w:r>
-    </w:p>
-    <w:p>
-      <w:r>
-        <w:t xml:space="preserve">Prüfen, ob der </w:t>
-      </w:r>
-      <w:r>
-        <w:rPr>
-          <w:b/>
-        </w:rPr>
-        <w:t>Firmenname</w:t>
-      </w:r>
-      <w:r>
-        <w:t xml:space="preserve"> exakt zur Firma gehört, für die der Code ausgestellt wurde (Tippfehler?). Der Code selbst darf Leerzeichen und Zeilenumbrüche enthalten – das stört nicht.</w:t>
-      </w:r>
-    </w:p>
-    <w:p>
-      <w:r>
-        <w:rPr>
-          <w:b/>
-        </w:rPr>
-        <w:t>Die App zeigt eine alte Versionsnummer (iPhone/Web-App).</w:t>
-      </w:r>
-    </w:p>
-    <w:p>
-      <w:r>
-        <w:t>Das ist der Browser-Zwischenspeicher. Die App einmal komplett schließen und mit Internetverbindung neu öffnen – sie holt sich die neue Version dann selbst.</w:t>
-      </w:r>
-    </w:p>
-    <w:p>
-      <w:r>
-        <w:rPr>
-          <w:b/>
-        </w:rPr>
-        <w:t>Windows meldet einen Virus-/SmartScreen-Hinweis.</w:t>
-      </w:r>
-    </w:p>
-    <w:p>
-      <w:r>
-        <w:t>Siehe Abschnitt 1.1 – „Weitere Informationen" → „Trotzdem ausführen". Die Warnung kommt nur, weil die App nicht digital signiert ist.</w:t>
-      </w:r>
-    </w:p>
-    <w:p>
-      <w:r>
-        <w:rPr>
-          <w:b/>
-        </w:rPr>
-        <w:t>Verfällt mein Zeitausgleich am Jahresende?</w:t>
-      </w:r>
-    </w:p>
-    <w:p>
-      <w:r>
-        <w:t>Nein. Das Zeitausgleich-Konto läuft unbegrenzt weiter (Anfangsstand plus alle Überstunden) – es verfällt nichts.</w:t>
-      </w:r>
-    </w:p>
-    <w:p>
-      <w:r>
-        <w:rPr>
-          <w:b/>
-        </w:rPr>
-        <w:t>Woher kommen die Feiertage?</w:t>
-      </w:r>
-    </w:p>
-    <w:p>
-      <w:r>
-        <w:t>Die österreichischen gesetzlichen Feiertage sind fest eingebaut, werden in der Liste farbig markiert und beim Eintragen automatisch als „Feiertag" vorgeschlagen.</w:t>
+        <w:t>Ausschließlich auf Ihrem Gerät. Es gibt keinen Server, keine Anmeldung und keine Übertragung – außer wenn Sie selbst einen Monatsbericht versenden.</w:t>
       </w:r>
     </w:p>
     <w:sectPr>

</xml_diff>

<commit_message>
ANLEITUNG.docx fuer v1.1.0 neu erzeugt
</commit_message>
<xml_diff>
--- a/ANLEITUNG.docx
+++ b/ANLEITUNG.docx
@@ -634,7 +634,295 @@
         <w:t>„Zeitexa freischalten"</w:t>
       </w:r>
       <w:r>
-        <w:t>:</w:t>
+        <w:t>. Zwei Wege:</w:t>
+      </w:r>
+    </w:p>
+    <w:p>
+      <w:pPr>
+        <w:pStyle w:val="ListBullet"/>
+      </w:pPr>
+      <w:r>
+        <w:rPr>
+          <w:b/>
+        </w:rPr>
+        <w:t>Lizenzdatei (empfohlen):</w:t>
+      </w:r>
+      <w:r>
+        <w:t xml:space="preserve"> auf </w:t>
+      </w:r>
+      <w:r>
+        <w:rPr>
+          <w:b/>
+        </w:rPr>
+        <w:t>„Lizenzdatei importieren"</w:t>
+      </w:r>
+      <w:r>
+        <w:t xml:space="preserve"> tippen und die Datei (</w:t>
+      </w:r>
+      <w:r>
+        <w:rPr>
+          <w:rFonts w:ascii="Consolas" w:hAnsi="Consolas"/>
+          <w:sz w:val="20"/>
+        </w:rPr>
+        <w:t>….zeitexalizenz.json</w:t>
+      </w:r>
+      <w:r>
+        <w:t>) auswählen – fertig. Ihr Name steckt bereits in der Datei.</w:t>
+      </w:r>
+    </w:p>
+    <w:p>
+      <w:pPr>
+        <w:pStyle w:val="ListBullet"/>
+      </w:pPr>
+      <w:r>
+        <w:rPr>
+          <w:b/>
+        </w:rPr>
+        <w:t>Freischaltcode:</w:t>
+      </w:r>
+      <w:r>
+        <w:t xml:space="preserve"> zuerst den </w:t>
+      </w:r>
+      <w:r>
+        <w:rPr>
+          <w:b/>
+        </w:rPr>
+        <w:t>Namen des Lizenznehmers</w:t>
+      </w:r>
+      <w:r>
+        <w:t xml:space="preserve"> eingeben – genau der Name, für den die Freischaltung ausgestellt ist (Groß-/Kleinschreibung und Leerzeichen spielen keine Rolle) – und dann den Code eintippen bzw. hineinkopieren (langer Buchstaben-/Zahlencode; Leerzeichen und Zeilenumbrüche stören nicht). Auf </w:t>
+      </w:r>
+      <w:r>
+        <w:rPr>
+          <w:b/>
+        </w:rPr>
+        <w:t>„Code prüfen &amp; freischalten"</w:t>
+      </w:r>
+      <w:r>
+        <w:t xml:space="preserve"> tippen.</w:t>
+      </w:r>
+    </w:p>
+    <w:p>
+      <w:r>
+        <w:t>Dieselbe Freischaltung gilt für alle Ihre Geräte (PC, Handy, iPhone).</w:t>
+      </w:r>
+    </w:p>
+    <w:p>
+      <w:pPr>
+        <w:pStyle w:val="Heading3"/>
+      </w:pPr>
+      <w:r>
+        <w:t>Schritt 2: Willkommen</w:t>
+      </w:r>
+    </w:p>
+    <w:p>
+      <w:r>
+        <w:t xml:space="preserve">Danach erscheint </w:t>
+      </w:r>
+      <w:r>
+        <w:rPr>
+          <w:b/>
+        </w:rPr>
+        <w:t>„Willkommen bei Zeitexa"</w:t>
+      </w:r>
+      <w:r>
+        <w:t xml:space="preserve"> mit dem Namen, für den die Lizenz gilt. Dieser Name steht später auf allen Berichten; er kommt aus der Lizenz und lässt sich in der App nicht ändern. Auf </w:t>
+      </w:r>
+      <w:r>
+        <w:rPr>
+          <w:b/>
+        </w:rPr>
+        <w:t>„Los geht's"</w:t>
+      </w:r>
+      <w:r>
+        <w:t xml:space="preserve"> tippen, fertig.</w:t>
+      </w:r>
+    </w:p>
+    <w:p>
+      <w:r>
+        <w:rPr>
+          <w:b/>
+        </w:rPr>
+        <w:t>Danach unbedingt einmal die Verwaltung öffnen:</w:t>
+      </w:r>
+      <w:r>
+        <w:t xml:space="preserve"> Zeitexa rechnet zunächst mit Vorgabewerten (8 Stunden Mo–Do, 5 Stunden Freitag, Urlaubsstände auf 0). Solange Sie diese Werte nicht bestätigt haben, steht in der Monatsansicht ein Hinweisbalken mit dem Knopf </w:t>
+      </w:r>
+      <w:r>
+        <w:rPr>
+          <w:b/>
+        </w:rPr>
+        <w:t>„Jetzt einstellen"</w:t>
+      </w:r>
+      <w:r>
+        <w:t>. Ein Klick darauf führt direkt an die richtige Stelle (siehe Abschnitt 4.1). Der Balken verschwindet, sobald Sie dort einmal gespeichert haben.</w:t>
+      </w:r>
+    </w:p>
+    <w:p>
+      <w:r>
+        <w:t>Die Werte lassen sich jederzeit ändern – Zeitexa rechnet immer mit den aktuellen Einstellungen, auch rückwirkend.</w:t>
+      </w:r>
+    </w:p>
+    <w:p>
+      <w:pPr>
+        <w:jc w:val="center"/>
+      </w:pPr>
+      <w:r>
+        <w:t>· · ·</w:t>
+      </w:r>
+    </w:p>
+    <w:p>
+      <w:pPr>
+        <w:pStyle w:val="Heading2"/>
+      </w:pPr>
+      <w:r>
+        <w:t>3. Tägliche Bedienung</w:t>
+      </w:r>
+    </w:p>
+    <w:p>
+      <w:pPr>
+        <w:pStyle w:val="Heading3"/>
+      </w:pPr>
+      <w:r>
+        <w:t>3.1 Die Monatsansicht</w:t>
+      </w:r>
+    </w:p>
+    <w:p>
+      <w:r>
+        <w:t>Nach dem Start sehen Sie den aktuellen Monat:</w:t>
+      </w:r>
+    </w:p>
+    <w:p>
+      <w:pPr>
+        <w:pStyle w:val="ListBullet"/>
+      </w:pPr>
+      <w:r>
+        <w:rPr>
+          <w:b/>
+        </w:rPr>
+        <w:t>Übersichtskarte</w:t>
+      </w:r>
+      <w:r>
+        <w:t xml:space="preserve"> oben:</w:t>
+      </w:r>
+    </w:p>
+    <w:p>
+      <w:pPr>
+        <w:pStyle w:val="ListBullet2"/>
+      </w:pPr>
+      <w:r>
+        <w:rPr>
+          <w:b/>
+        </w:rPr>
+        <w:t>„Zeit – aktueller Monat":</w:t>
+      </w:r>
+      <w:r>
+        <w:t xml:space="preserve"> Ist-Stunden, Soll-Stunden und Überstunden (grün = Plus, rot = Minus).</w:t>
+      </w:r>
+    </w:p>
+    <w:p>
+      <w:pPr>
+        <w:pStyle w:val="ListBullet2"/>
+      </w:pPr>
+      <w:r>
+        <w:rPr>
+          <w:b/>
+        </w:rPr>
+        <w:t>„Konten"</w:t>
+      </w:r>
+      <w:r>
+        <w:t xml:space="preserve"> mit Umschalter </w:t>
+      </w:r>
+      <w:r>
+        <w:rPr>
+          <w:b/>
+        </w:rPr>
+        <w:t>Monat / Laufzeit</w:t>
+      </w:r>
+      <w:r>
+        <w:t xml:space="preserve">: Resturlaub in Tagen (bei getrennter Führung zwei Werte: „Resturlaub Mo–Do" und „Resturlaub Fr"), </w:t>
+      </w:r>
+      <w:r>
+        <w:rPr>
+          <w:b/>
+        </w:rPr>
+        <w:t>Zeitausgleich</w:t>
+      </w:r>
+      <w:r>
+        <w:t xml:space="preserve"> in Stunden (Plus oder Minus) und </w:t>
+      </w:r>
+      <w:r>
+        <w:rPr>
+          <w:b/>
+        </w:rPr>
+        <w:t>Kranktage</w:t>
+      </w:r>
+      <w:r>
+        <w:t>. „Monat" zeigt nur den angezeigten Monat, „Laufzeit" den Gesamtstand.</w:t>
+      </w:r>
+    </w:p>
+    <w:p>
+      <w:pPr>
+        <w:pStyle w:val="ListBullet"/>
+      </w:pPr>
+      <w:r>
+        <w:rPr>
+          <w:b/>
+        </w:rPr>
+        <w:t>Tagesliste:</w:t>
+      </w:r>
+      <w:r>
+        <w:t xml:space="preserve"> eine Zeile pro Tag. Wochenenden und Feiertage sind farbig hervorgehoben, der heutige Tag ist markiert. Jede Zeile zeigt die Uhrzeiten, Pause und Ort (bzw. die Tagesart wie „Urlaub"), eine eventuelle Notiz sowie Ist/Soll und Überstunden des Tages.</w:t>
+      </w:r>
+    </w:p>
+    <w:p>
+      <w:pPr>
+        <w:pStyle w:val="ListBullet"/>
+      </w:pPr>
+      <w:r>
+        <w:rPr>
+          <w:b/>
+        </w:rPr>
+        <w:t>Pfeile</w:t>
+      </w:r>
+      <w:r>
+        <w:t xml:space="preserve"> links/rechts oben wechseln den Monat.</w:t>
+      </w:r>
+    </w:p>
+    <w:p>
+      <w:pPr>
+        <w:pStyle w:val="ListBullet"/>
+      </w:pPr>
+      <w:r>
+        <w:rPr>
+          <w:b/>
+        </w:rPr>
+        <w:t>„Heute"-Knopf:</w:t>
+      </w:r>
+      <w:r>
+        <w:t xml:space="preserve"> springt zurück zum aktuellen Monat und rollt die Liste zum heutigen Tag. Je nach Einstellung (Abschnitt 4.2) öffnet er zusätzlich gleich den heutigen Tageseintrag.</w:t>
+      </w:r>
+    </w:p>
+    <w:p>
+      <w:pPr>
+        <w:pStyle w:val="Heading3"/>
+      </w:pPr>
+      <w:r>
+        <w:t>3.2 Einen Tag eintragen</w:t>
+      </w:r>
+    </w:p>
+    <w:p>
+      <w:r>
+        <w:t xml:space="preserve">Einfach die gewünschte Tageszeile </w:t>
+      </w:r>
+      <w:r>
+        <w:rPr>
+          <w:b/>
+        </w:rPr>
+        <w:t>antippen</w:t>
+      </w:r>
+      <w:r>
+        <w:t xml:space="preserve"> – es öffnet sich der Tageseintrag:</w:t>
       </w:r>
     </w:p>
     <w:p>
@@ -642,13 +930,34 @@
         <w:pStyle w:val="ListNumber"/>
       </w:pPr>
       <w:r>
+        <w:t xml:space="preserve">Oben die </w:t>
+      </w:r>
+      <w:r>
         <w:rPr>
           <w:b/>
         </w:rPr>
-        <w:t>Name des Lizenznehmers</w:t>
-      </w:r>
-      <w:r>
-        <w:t xml:space="preserve"> eingeben – genau der Name, für den die Freischaltung ausgestellt ist (Groß-/Kleinschreibung und Leerzeichen spielen keine Rolle).</w:t>
+        <w:t>Tagesart</w:t>
+      </w:r>
+      <w:r>
+        <w:t xml:space="preserve"> wählen: </w:t>
+      </w:r>
+      <w:r>
+        <w:rPr>
+          <w:b/>
+        </w:rPr>
+        <w:t>Arbeit, Urlaub, Krank, Feiertag, Zeitausgleich, Sonderurlaub</w:t>
+      </w:r>
+      <w:r>
+        <w:t xml:space="preserve"> und – falls Sie das Konto führen – </w:t>
+      </w:r>
+      <w:r>
+        <w:rPr>
+          <w:b/>
+        </w:rPr>
+        <w:t>Zusatzurlaub</w:t>
+      </w:r>
+      <w:r>
+        <w:t>. (Feiertage schlägt die App bei österreichischen gesetzlichen Feiertagen automatisch vor.)</w:t>
       </w:r>
     </w:p>
     <w:p>
@@ -656,7 +965,16 @@
         <w:pStyle w:val="ListNumber"/>
       </w:pPr>
       <w:r>
-        <w:t>Dann entweder:</w:t>
+        <w:t xml:space="preserve">Bei </w:t>
+      </w:r>
+      <w:r>
+        <w:rPr>
+          <w:b/>
+        </w:rPr>
+        <w:t>Arbeit</w:t>
+      </w:r>
+      <w:r>
+        <w:t>:</w:t>
       </w:r>
     </w:p>
     <w:p>
@@ -664,31 +982,13 @@
         <w:pStyle w:val="ListBullet2"/>
       </w:pPr>
       <w:r>
-        <w:t xml:space="preserve">den </w:t>
-      </w:r>
-      <w:r>
         <w:rPr>
           <w:b/>
         </w:rPr>
-        <w:t>Freischaltcode</w:t>
-      </w:r>
-      <w:r>
-        <w:t xml:space="preserve"> eintippen bzw. hineinkopieren (langer Buchstaben-/Zahlencode; Leerzeichen und Zeilenumbrüche stören nicht) und auf </w:t>
-      </w:r>
-      <w:r>
-        <w:rPr>
-          <w:b/>
-        </w:rPr>
-        <w:t>„Code prüfen &amp; freischalten"</w:t>
-      </w:r>
-      <w:r>
-        <w:t xml:space="preserve"> tippen, </w:t>
-      </w:r>
-      <w:r>
-        <w:rPr>
-          <w:b/>
-        </w:rPr>
-        <w:t>oder</w:t>
+        <w:t>Ort</w:t>
+      </w:r>
+      <w:r>
+        <w:t xml:space="preserve"> eintragen (z. B. die Baustelle). Zuletzt verwendete Orte erscheinen als Schnellauswahl zum Antippen.</w:t>
       </w:r>
     </w:p>
     <w:p>
@@ -696,31 +996,186 @@
         <w:pStyle w:val="ListBullet2"/>
       </w:pPr>
       <w:r>
-        <w:t xml:space="preserve">auf </w:t>
-      </w:r>
-      <w:r>
         <w:rPr>
           <w:b/>
         </w:rPr>
-        <w:t>„Lizenzdatei importieren"</w:t>
-      </w:r>
-      <w:r>
-        <w:t xml:space="preserve"> tippen und die Lizenzdatei (</w:t>
+        <w:t>Beginn</w:t>
+      </w:r>
+      <w:r>
+        <w:t xml:space="preserve"> und </w:t>
       </w:r>
       <w:r>
         <w:rPr>
-          <w:rFonts w:ascii="Consolas" w:hAnsi="Consolas"/>
-          <w:sz w:val="20"/>
+          <w:b/>
         </w:rPr>
-        <w:t>….zeitexalizenz.json</w:t>
-      </w:r>
-      <w:r>
-        <w:t>) auswählen.</w:t>
+        <w:t>Ende</w:t>
+      </w:r>
+      <w:r>
+        <w:t xml:space="preserve"> über die Uhr einstellen.</w:t>
       </w:r>
     </w:p>
     <w:p>
-      <w:r>
-        <w:t>Dieselbe Freischaltung gilt für alle Ihre Geräte (PC, Handy, iPhone).</w:t>
+      <w:pPr>
+        <w:pStyle w:val="ListBullet2"/>
+      </w:pPr>
+      <w:r>
+        <w:rPr>
+          <w:b/>
+        </w:rPr>
+        <w:t>Pause</w:t>
+      </w:r>
+      <w:r>
+        <w:t xml:space="preserve"> über die runde Pausen-Uhr einstellen (in 5-Minuten-Schritten).</w:t>
+      </w:r>
+    </w:p>
+    <w:p>
+      <w:pPr>
+        <w:pStyle w:val="ListBullet2"/>
+      </w:pPr>
+      <w:r>
+        <w:t xml:space="preserve">Beginn, Ende und Pause sind mit Ihren Standardzeiten vorbelegt – meist muss man gar nichts ändern. Ist Ihr </w:t>
+      </w:r>
+      <w:r>
+        <w:rPr>
+          <w:b/>
+        </w:rPr>
+        <w:t>Freitag kürzer</w:t>
+      </w:r>
+      <w:r>
+        <w:t xml:space="preserve"> und sind eigene Freitagszeiten hinterlegt, verwendet die App am Freitag automatisch diese.</w:t>
+      </w:r>
+    </w:p>
+    <w:p>
+      <w:pPr>
+        <w:pStyle w:val="ListNumber"/>
+      </w:pPr>
+      <w:r>
+        <w:t xml:space="preserve">Bei allen anderen Tagesarten kann man über </w:t>
+      </w:r>
+      <w:r>
+        <w:rPr>
+          <w:b/>
+        </w:rPr>
+        <w:t>„bis-Datum wählen"</w:t>
+      </w:r>
+      <w:r>
+        <w:t xml:space="preserve"> gleich einen ganzen Zeitraum eintragen (z. B. zwei Wochen Urlaub) – Samstage und Sonntage werden automatisch übersprungen.</w:t>
+      </w:r>
+    </w:p>
+    <w:p>
+      <w:pPr>
+        <w:pStyle w:val="ListNumber"/>
+      </w:pPr>
+      <w:r>
+        <w:rPr>
+          <w:b/>
+        </w:rPr>
+        <w:t>Halbe und geteilte Urlaubstage:</w:t>
+      </w:r>
+      <w:r>
+        <w:t xml:space="preserve"> Bei einem einzelnen Urlaubs-, Sonderurlaubs- oder Zusatzurlaubstag steht im Feld </w:t>
+      </w:r>
+      <w:r>
+        <w:rPr>
+          <w:b/>
+        </w:rPr>
+        <w:t>„… (Stunden an diesem Tag)"</w:t>
+      </w:r>
+      <w:r>
+        <w:t xml:space="preserve"> zunächst Ihr volles Tagessoll. Tragen Sie </w:t>
+      </w:r>
+      <w:r>
+        <w:rPr>
+          <w:b/>
+        </w:rPr>
+        <w:t>weniger</w:t>
+      </w:r>
+      <w:r>
+        <w:t xml:space="preserve"> ein (z. B. </w:t>
+      </w:r>
+      <w:r>
+        <w:rPr>
+          <w:b/>
+        </w:rPr>
+        <w:t>6,25</w:t>
+      </w:r>
+      <w:r>
+        <w:t>), erscheinen darunter zusätzlich Ort, Beginn, Ende und Pause – so lässt sich ein Tag sauber aufteilen: ein Teil Urlaub, der Rest gearbeitet. Ein halber Tag ist also einfach die halbe Stundenzahl. Das Urlaubskonto wird entsprechend anteilig belastet.</w:t>
+      </w:r>
+    </w:p>
+    <w:p>
+      <w:pPr>
+        <w:pStyle w:val="ListNumber"/>
+      </w:pPr>
+      <w:r>
+        <w:t xml:space="preserve">Bei </w:t>
+      </w:r>
+      <w:r>
+        <w:rPr>
+          <w:b/>
+        </w:rPr>
+        <w:t>Sonderurlaub</w:t>
+      </w:r>
+      <w:r>
+        <w:t xml:space="preserve"> zusätzlich den </w:t>
+      </w:r>
+      <w:r>
+        <w:rPr>
+          <w:b/>
+        </w:rPr>
+        <w:t>Grund</w:t>
+      </w:r>
+      <w:r>
+        <w:t xml:space="preserve"> wählen: Pflegefreistellung, Umzug, Hochzeit, Geburt, Todesfall oder Sonstiges (bei „Sonstiges" den Anlass in die Notiz schreiben). Sonderurlaub wird </w:t>
+      </w:r>
+      <w:r>
+        <w:rPr>
+          <w:b/>
+        </w:rPr>
+        <w:t>gezählt, aber nicht vom Urlaubskonto abgezogen</w:t>
+      </w:r>
+      <w:r>
+        <w:t>.</w:t>
+      </w:r>
+    </w:p>
+    <w:p>
+      <w:pPr>
+        <w:pStyle w:val="ListNumber"/>
+      </w:pPr>
+      <w:r>
+        <w:t xml:space="preserve">Optional eine </w:t>
+      </w:r>
+      <w:r>
+        <w:rPr>
+          <w:b/>
+        </w:rPr>
+        <w:t>Notiz</w:t>
+      </w:r>
+      <w:r>
+        <w:t xml:space="preserve"> ergänzen (was/wie/wo/wer).</w:t>
+      </w:r>
+    </w:p>
+    <w:p>
+      <w:pPr>
+        <w:pStyle w:val="ListNumber"/>
+      </w:pPr>
+      <w:r>
+        <w:rPr>
+          <w:b/>
+        </w:rPr>
+        <w:t>Speichern.</w:t>
+      </w:r>
+      <w:r>
+        <w:t xml:space="preserve"> Über </w:t>
+      </w:r>
+      <w:r>
+        <w:rPr>
+          <w:b/>
+        </w:rPr>
+        <w:t>Löschen</w:t>
+      </w:r>
+      <w:r>
+        <w:t xml:space="preserve"> lässt sich ein bestehender Eintrag wieder entfernen.</w:t>
       </w:r>
     </w:p>
     <w:p>
@@ -728,64 +1183,77 @@
         <w:pStyle w:val="Heading3"/>
       </w:pPr>
       <w:r>
-        <w:t>Schritt 2: Namen eintragen</w:t>
+        <w:t>3.3 Monat weitergeben</w:t>
       </w:r>
     </w:p>
     <w:p>
       <w:r>
-        <w:t xml:space="preserve">Danach erscheint </w:t>
+        <w:t xml:space="preserve">Menü (⋮) → </w:t>
       </w:r>
       <w:r>
         <w:rPr>
           <w:b/>
         </w:rPr>
-        <w:t>„Willkommen bei Zeitexa"</w:t>
-      </w:r>
-      <w:r>
-        <w:t xml:space="preserve">. Gefragt wird nur </w:t>
-      </w:r>
+        <w:t>„Monat exportieren/senden"</w:t>
+      </w:r>
+      <w:r>
+        <w:t>. Der Bericht enthält immer eine Excel-Liste, ein PDF und eine Datendatei. Je nach Einrichtung stehen bis zu drei Wege zur Wahl:</w:t>
+      </w:r>
+    </w:p>
+    <w:p>
+      <w:pPr>
+        <w:pStyle w:val="ListBullet"/>
+      </w:pPr>
       <w:r>
         <w:rPr>
           <w:b/>
         </w:rPr>
-        <w:t>Ihr Name</w:t>
-      </w:r>
-      <w:r>
-        <w:t xml:space="preserve"> – er steht später auf Auswertungen und Exporten. Auf </w:t>
-      </w:r>
+        <w:t>„Per Mail senden (automatisch)":</w:t>
+      </w:r>
+      <w:r>
+        <w:t xml:space="preserve"> verschickt den Bericht direkt an den hinterlegten Empfänger (nur wenn Sie den Mailversand eingerichtet haben; nicht in der Web-App).</w:t>
+      </w:r>
+    </w:p>
+    <w:p>
+      <w:pPr>
+        <w:pStyle w:val="ListBullet"/>
+      </w:pPr>
       <w:r>
         <w:rPr>
           <w:b/>
         </w:rPr>
-        <w:t>„Los geht's"</w:t>
-      </w:r>
-      <w:r>
-        <w:t xml:space="preserve"> tippen, fertig.</w:t>
+        <w:t>„Per Mail-App / Teilen weitergeben":</w:t>
+      </w:r>
+      <w:r>
+        <w:t xml:space="preserve"> öffnet das normale Teilen-Menü des Geräts (z. B. Mail-App).</w:t>
       </w:r>
     </w:p>
     <w:p>
+      <w:pPr>
+        <w:pStyle w:val="ListBullet"/>
+      </w:pPr>
       <w:r>
         <w:rPr>
           <w:b/>
         </w:rPr>
-        <w:t>Danach unbedingt einmal die Verwaltung öffnen:</w:t>
-      </w:r>
-      <w:r>
-        <w:t xml:space="preserve"> Zeitexa rechnet zunächst mit Vorgabewerten (8 Stunden Mo–Do, 5 Stunden Freitag, Urlaubsstände auf 0). Solange Sie diese Werte nicht bestätigt haben, steht in der Monatsansicht ein Hinweisbalken mit dem Knopf </w:t>
+        <w:t>„Nur als Dateien speichern":</w:t>
+      </w:r>
+      <w:r>
+        <w:t xml:space="preserve"> legt die Dateien lokal ab (Windows: Ordner „Zeitexa-Exporte" in Dokumente; nicht in der Web-App).</w:t>
+      </w:r>
+    </w:p>
+    <w:p>
+      <w:r>
+        <w:t xml:space="preserve">Ist der </w:t>
       </w:r>
       <w:r>
         <w:rPr>
           <w:b/>
         </w:rPr>
-        <w:t>„Jetzt einstellen"</w:t>
-      </w:r>
-      <w:r>
-        <w:t>. Ein Klick darauf führt direkt an die richtige Stelle (siehe Abschnitt 4.1). Der Balken verschwindet, sobald Sie dort einmal gespeichert haben.</w:t>
-      </w:r>
-    </w:p>
-    <w:p>
-      <w:r>
-        <w:t>Die Werte lassen sich jederzeit ändern – Zeitexa rechnet immer mit den aktuellen Einstellungen, auch rückwirkend.</w:t>
+        <w:t>automatische Versand</w:t>
+      </w:r>
+      <w:r>
+        <w:t xml:space="preserve"> eingeschaltet, verschickt Zeitexa den Vormonat beim ersten Start im neuen Monat von selbst und meldet das kurz.</w:t>
       </w:r>
     </w:p>
     <w:p>
@@ -801,7 +1269,21 @@
         <w:pStyle w:val="Heading2"/>
       </w:pPr>
       <w:r>
-        <w:t>3. Tägliche Bedienung</w:t>
+        <w:t>4. Verwaltung</w:t>
+      </w:r>
+    </w:p>
+    <w:p>
+      <w:r>
+        <w:t xml:space="preserve">Menü (⋮) → </w:t>
+      </w:r>
+      <w:r>
+        <w:rPr>
+          <w:b/>
+        </w:rPr>
+        <w:t>„Verwaltung"</w:t>
+      </w:r>
+      <w:r>
+        <w:t>. Drei Reiter:</w:t>
       </w:r>
     </w:p>
     <w:p>
@@ -809,12 +1291,12 @@
         <w:pStyle w:val="Heading3"/>
       </w:pPr>
       <w:r>
-        <w:t>3.1 Die Monatsansicht</w:t>
+        <w:t>4.1 Reiter „Mein Profil"</w:t>
       </w:r>
     </w:p>
     <w:p>
       <w:r>
-        <w:t>Nach dem Start sehen Sie den aktuellen Monat:</w:t>
+        <w:t>Hier stehen alle Werte, mit denen Zeitexa rechnet:</w:t>
       </w:r>
     </w:p>
     <w:p>
@@ -825,10 +1307,79 @@
         <w:rPr>
           <w:b/>
         </w:rPr>
-        <w:t>Übersichtskarte</w:t>
-      </w:r>
-      <w:r>
-        <w:t xml:space="preserve"> oben:</w:t>
+        <w:t>Ihr Name (aus der Lizenz):</w:t>
+      </w:r>
+      <w:r>
+        <w:t xml:space="preserve"> wird nur angezeigt – er ist an die Lizenz gebunden und lässt sich nur über eine neue Lizenzdatei des Entwicklers ändern. Dazu Ihre </w:t>
+      </w:r>
+      <w:r>
+        <w:rPr>
+          <w:b/>
+        </w:rPr>
+        <w:t>E-Mail-Adresse</w:t>
+      </w:r>
+      <w:r>
+        <w:t xml:space="preserve"> (für die eigene Kopie beim Mail-Export).</w:t>
+      </w:r>
+    </w:p>
+    <w:p>
+      <w:pPr>
+        <w:pStyle w:val="ListBullet"/>
+      </w:pPr>
+      <w:r>
+        <w:rPr>
+          <w:b/>
+        </w:rPr>
+        <w:t>Briefkopf der Berichte:</w:t>
+      </w:r>
+      <w:r>
+        <w:t xml:space="preserve"> Adresse, Telefon und E-Mail, die unter Ihrem Namen im Kopf der PDF-Berichte erscheinen. Leere Felder werden weggelassen.</w:t>
+      </w:r>
+    </w:p>
+    <w:p>
+      <w:pPr>
+        <w:pStyle w:val="ListBullet"/>
+      </w:pPr>
+      <w:r>
+        <w:rPr>
+          <w:b/>
+        </w:rPr>
+        <w:t>Sollstunden:</w:t>
+      </w:r>
+      <w:r>
+        <w:t xml:space="preserve"> entweder gleich für alle Tage (Mo–Fr) oder </w:t>
+      </w:r>
+      <w:r>
+        <w:rPr>
+          <w:b/>
+        </w:rPr>
+        <w:t>Mo–Do und Freitag getrennt</w:t>
+      </w:r>
+      <w:r>
+        <w:t>.</w:t>
+      </w:r>
+    </w:p>
+    <w:p>
+      <w:pPr>
+        <w:pStyle w:val="ListBullet"/>
+      </w:pPr>
+      <w:r>
+        <w:rPr>
+          <w:b/>
+        </w:rPr>
+        <w:t>Anfangsstand:</w:t>
+      </w:r>
+      <w:r>
+        <w:t xml:space="preserve"> Der </w:t>
+      </w:r>
+      <w:r>
+        <w:rPr>
+          <w:b/>
+        </w:rPr>
+        <w:t>Stichtag</w:t>
+      </w:r>
+      <w:r>
+        <w:t xml:space="preserve"> ist der Tag, ab dem Zeitexa mitrechnet. Tragen Sie hier ein, wie viel Resturlaub und wie viele Plus-/Minusstunden Sie an diesem Tag hatten – alles Weitere schreibt die App selbst fort.</w:t>
       </w:r>
     </w:p>
     <w:p>
@@ -839,10 +1390,10 @@
         <w:rPr>
           <w:b/>
         </w:rPr>
-        <w:t>„Zeit – aktueller Monat":</w:t>
-      </w:r>
-      <w:r>
-        <w:t xml:space="preserve"> Ist-Stunden, Soll-Stunden und Überstunden (grün = Plus, rot = Minus).</w:t>
+        <w:t>„Freitags-Urlaub getrennt führen":</w:t>
+      </w:r>
+      <w:r>
+        <w:t xml:space="preserve"> eigenes Urlaubskonto für Freitage.</w:t>
       </w:r>
     </w:p>
     <w:p>
@@ -853,37 +1404,33 @@
         <w:rPr>
           <w:b/>
         </w:rPr>
-        <w:t>„Konten"</w:t>
-      </w:r>
-      <w:r>
-        <w:t xml:space="preserve"> mit Umschalter </w:t>
-      </w:r>
+        <w:t>„Zusatzurlaub führen":</w:t>
+      </w:r>
+      <w:r>
+        <w:t xml:space="preserve"> eigenes Konto für zusätzlichen Urlaub (z. B. eine Extra-Woche). Verfällt nicht; den Stand erhöhen Sie jährlich selbst.</w:t>
+      </w:r>
+    </w:p>
+    <w:p>
+      <w:pPr>
+        <w:pStyle w:val="ListBullet2"/>
+      </w:pPr>
       <w:r>
         <w:rPr>
           <w:b/>
         </w:rPr>
-        <w:t>Monat / Laufzeit</w:t>
-      </w:r>
-      <w:r>
-        <w:t xml:space="preserve">: Resturlaub in Tagen (bei getrennter Führung zwei Werte: „Resturlaub Mo–Do" und „Resturlaub Fr"), </w:t>
+        <w:t>Zeitausgleich-Anfangsstand:</w:t>
+      </w:r>
+      <w:r>
+        <w:t xml:space="preserve"> Dezimalstunden mit </w:t>
       </w:r>
       <w:r>
         <w:rPr>
           <w:b/>
         </w:rPr>
-        <w:t>Zeitausgleich</w:t>
-      </w:r>
-      <w:r>
-        <w:t xml:space="preserve"> in Stunden (Plus oder Minus) und </w:t>
-      </w:r>
-      <w:r>
-        <w:rPr>
-          <w:b/>
-        </w:rPr>
-        <w:t>Kranktage</w:t>
-      </w:r>
-      <w:r>
-        <w:t>. „Monat" zeigt nur den angezeigten Monat, „Laufzeit" den Gesamtstand.</w:t>
+        <w:t>+/−</w:t>
+      </w:r>
+      <w:r>
+        <w:t>-Umschalter (z. B. 43,35 oder −5).</w:t>
       </w:r>
     </w:p>
     <w:p>
@@ -894,10 +1441,41 @@
         <w:rPr>
           <w:b/>
         </w:rPr>
-        <w:t>Tagesliste:</w:t>
-      </w:r>
-      <w:r>
-        <w:t xml:space="preserve"> eine Zeile pro Tag. Wochenenden und Feiertage sind farbig hervorgehoben, der heutige Tag ist markiert. Jede Zeile zeigt die Uhrzeiten, Pause und Ort (bzw. die Tagesart wie „Urlaub"), eine eventuelle Notiz sowie Ist/Soll und Überstunden des Tages.</w:t>
+        <w:t>Standardzeiten</w:t>
+      </w:r>
+      <w:r>
+        <w:t xml:space="preserve"> für neue Arbeitstage (Beginn, Ende, Pause), auf Wunsch mit eigenen </w:t>
+      </w:r>
+      <w:r>
+        <w:rPr>
+          <w:b/>
+        </w:rPr>
+        <w:t>Freitagszeiten</w:t>
+      </w:r>
+      <w:r>
+        <w:t>.</w:t>
+      </w:r>
+    </w:p>
+    <w:p>
+      <w:r>
+        <w:t xml:space="preserve">Nicht vergessen: unten auf </w:t>
+      </w:r>
+      <w:r>
+        <w:rPr>
+          <w:b/>
+        </w:rPr>
+        <w:t>„Speichern"</w:t>
+      </w:r>
+      <w:r>
+        <w:t>. Damit verschwindet auch der Hinweisbalken aus Abschnitt 2.</w:t>
+      </w:r>
+    </w:p>
+    <w:p>
+      <w:pPr>
+        <w:pStyle w:val="Heading3"/>
+      </w:pPr>
+      <w:r>
+        <w:t>4.2 Reiter „Optionen"</w:t>
       </w:r>
     </w:p>
     <w:p>
@@ -908,10 +1486,37 @@
         <w:rPr>
           <w:b/>
         </w:rPr>
-        <w:t>Pfeile</w:t>
-      </w:r>
-      <w:r>
-        <w:t xml:space="preserve"> links/rechts oben wechseln den Monat.</w:t>
+        <w:t>Mailversand:</w:t>
+      </w:r>
+      <w:r>
+        <w:t xml:space="preserve"> Empfänger der Monatsberichte (z. B. Auftraggeber, Steuerberater oder die eigene Adresse), der </w:t>
+      </w:r>
+      <w:r>
+        <w:rPr>
+          <w:b/>
+        </w:rPr>
+        <w:t>Betreff der Export-Mails</w:t>
+      </w:r>
+      <w:r>
+        <w:t xml:space="preserve"> (mit Platzhaltern wie {Monat} und {Jahr}) sowie die Zugangsdaten Ihres Postausgangsservers (SMTP-Server, Port, Benutzer, Passwort). Mit </w:t>
+      </w:r>
+      <w:r>
+        <w:rPr>
+          <w:b/>
+        </w:rPr>
+        <w:t>„Testmail senden"</w:t>
+      </w:r>
+      <w:r>
+        <w:t xml:space="preserve"> lässt sich das sofort prüfen. Optional: </w:t>
+      </w:r>
+      <w:r>
+        <w:rPr>
+          <w:b/>
+        </w:rPr>
+        <w:t>automatischer Versand am Monatsanfang</w:t>
+      </w:r>
+      <w:r>
+        <w:t>.</w:t>
       </w:r>
     </w:p>
     <w:p>
@@ -922,10 +1527,148 @@
         <w:rPr>
           <w:b/>
         </w:rPr>
-        <w:t>„Heute"-Knopf:</w:t>
-      </w:r>
-      <w:r>
-        <w:t xml:space="preserve"> springt zurück zum aktuellen Monat und rollt die Liste zum heutigen Tag. Je nach Einstellung (Abschnitt 4.2) öffnet er zusätzlich gleich den heutigen Tageseintrag.</w:t>
+        <w:t>Bedienung:</w:t>
+      </w:r>
+      <w:r>
+        <w:t xml:space="preserve"> „Heute-Knopf öffnet den Tageseintrag".</w:t>
+      </w:r>
+    </w:p>
+    <w:p>
+      <w:pPr>
+        <w:pStyle w:val="ListBullet"/>
+      </w:pPr>
+      <w:r>
+        <w:rPr>
+          <w:b/>
+        </w:rPr>
+        <w:t>Sicherheit – App-Sperre:</w:t>
+      </w:r>
+      <w:r>
+        <w:t xml:space="preserve"> Standardmäßig </w:t>
+      </w:r>
+      <w:r>
+        <w:rPr>
+          <w:b/>
+        </w:rPr>
+        <w:t>aus</w:t>
+      </w:r>
+      <w:r>
+        <w:t xml:space="preserve">. Eingeschaltet fragt Zeitexa beim Start nach einem Passwort, das Sie selbst vergeben. </w:t>
+      </w:r>
+      <w:r>
+        <w:rPr>
+          <w:b/>
+        </w:rPr>
+        <w:t>Dieses Passwort lässt sich nicht wiederherstellen – notieren Sie es.</w:t>
+      </w:r>
+      <w:r>
+        <w:t xml:space="preserve"> Zusätzlich kann (Windows/Android) das </w:t>
+      </w:r>
+      <w:r>
+        <w:rPr>
+          <w:b/>
+        </w:rPr>
+        <w:t>Entsperren per Fingerabdruck</w:t>
+      </w:r>
+      <w:r>
+        <w:t xml:space="preserve"> aktiviert werden. Hinweis: Das Gerät unterscheidet keine Personen – jeder dort hinterlegte Fingerabdruck kann entsperren.</w:t>
+      </w:r>
+    </w:p>
+    <w:p>
+      <w:pPr>
+        <w:pStyle w:val="ListBullet"/>
+      </w:pPr>
+      <w:r>
+        <w:rPr>
+          <w:b/>
+        </w:rPr>
+        <w:t>Darstellung:</w:t>
+      </w:r>
+      <w:r>
+        <w:t xml:space="preserve"> eine </w:t>
+      </w:r>
+      <w:r>
+        <w:rPr>
+          <w:b/>
+        </w:rPr>
+        <w:t>Akzentfarbe</w:t>
+      </w:r>
+      <w:r>
+        <w:t xml:space="preserve"> wählen. Sie erscheint in der App und auf dem PDF-Bericht.</w:t>
+      </w:r>
+    </w:p>
+    <w:p>
+      <w:pPr>
+        <w:pStyle w:val="ListBullet"/>
+      </w:pPr>
+      <w:r>
+        <w:rPr>
+          <w:b/>
+        </w:rPr>
+        <w:t>Datensicherung</w:t>
+      </w:r>
+      <w:r>
+        <w:t xml:space="preserve"> (nicht in der Web-App): </w:t>
+      </w:r>
+      <w:r>
+        <w:rPr>
+          <w:b/>
+        </w:rPr>
+        <w:t>„Sicherung erstellen…"</w:t>
+      </w:r>
+      <w:r>
+        <w:t xml:space="preserve"> schreibt alle Daten in eine Datei </w:t>
+      </w:r>
+      <w:r>
+        <w:rPr>
+          <w:rFonts w:ascii="Consolas" w:hAnsi="Consolas"/>
+          <w:sz w:val="20"/>
+        </w:rPr>
+        <w:t>Zeitexa_Sicherung_JJJJ-MM-TT.zeitexadb</w:t>
+      </w:r>
+      <w:r>
+        <w:t xml:space="preserve">, </w:t>
+      </w:r>
+      <w:r>
+        <w:rPr>
+          <w:b/>
+        </w:rPr>
+        <w:t>„Sicherung wiederherstellen…"</w:t>
+      </w:r>
+      <w:r>
+        <w:t xml:space="preserve"> spielt sie zurück. Beim Wiederherstellen wird der gesamte Bestand ersetzt. Sicherungen anderer Programme (etwa der Firmenversion Zeitrax) weist Zeitexa ab.</w:t>
+      </w:r>
+    </w:p>
+    <w:p>
+      <w:pPr>
+        <w:pStyle w:val="ListBullet"/>
+      </w:pPr>
+      <w:r>
+        <w:rPr>
+          <w:b/>
+        </w:rPr>
+        <w:t>Lizenz:</w:t>
+      </w:r>
+      <w:r>
+        <w:t xml:space="preserve"> zeigt, für wen die App freigeschaltet ist. </w:t>
+      </w:r>
+      <w:r>
+        <w:rPr>
+          <w:b/>
+        </w:rPr>
+        <w:t>„Lizenzdatei importieren…"</w:t>
+      </w:r>
+      <w:r>
+        <w:t xml:space="preserve"> spielt eine neue Datei des Entwicklers ein (z. B. bei einer Namenskorrektur – der neue Name gilt dann sofort überall). </w:t>
+      </w:r>
+      <w:r>
+        <w:rPr>
+          <w:b/>
+        </w:rPr>
+        <w:t>„Lizenzdatei exportieren…"</w:t>
+      </w:r>
+      <w:r>
+        <w:t xml:space="preserve"> speichert Ihre Lizenz als Datei, um sie auf einem anderen Gerät zu importieren.</w:t>
       </w:r>
     </w:p>
     <w:p>
@@ -933,352 +1676,12 @@
         <w:pStyle w:val="Heading3"/>
       </w:pPr>
       <w:r>
-        <w:t>3.2 Einen Tag eintragen</w:t>
+        <w:t>4.3 Reiter „Auswertung"</w:t>
       </w:r>
     </w:p>
     <w:p>
       <w:r>
-        <w:t xml:space="preserve">Einfach die gewünschte Tageszeile </w:t>
-      </w:r>
-      <w:r>
-        <w:rPr>
-          <w:b/>
-        </w:rPr>
-        <w:t>antippen</w:t>
-      </w:r>
-      <w:r>
-        <w:t xml:space="preserve"> – es öffnet sich der Tageseintrag:</w:t>
-      </w:r>
-    </w:p>
-    <w:p>
-      <w:pPr>
-        <w:pStyle w:val="ListNumber"/>
-      </w:pPr>
-      <w:r>
-        <w:t xml:space="preserve">Oben die </w:t>
-      </w:r>
-      <w:r>
-        <w:rPr>
-          <w:b/>
-        </w:rPr>
-        <w:t>Tagesart</w:t>
-      </w:r>
-      <w:r>
-        <w:t xml:space="preserve"> wählen: </w:t>
-      </w:r>
-      <w:r>
-        <w:rPr>
-          <w:b/>
-        </w:rPr>
-        <w:t>Arbeit, Urlaub, Krank, Feiertag, Zeitausgleich, Sonderurlaub</w:t>
-      </w:r>
-      <w:r>
-        <w:t xml:space="preserve"> und – falls Sie das Konto führen – </w:t>
-      </w:r>
-      <w:r>
-        <w:rPr>
-          <w:b/>
-        </w:rPr>
-        <w:t>Zusatzurlaub</w:t>
-      </w:r>
-      <w:r>
-        <w:t>. (Feiertage schlägt die App bei österreichischen gesetzlichen Feiertagen automatisch vor.)</w:t>
-      </w:r>
-    </w:p>
-    <w:p>
-      <w:pPr>
-        <w:pStyle w:val="ListNumber"/>
-      </w:pPr>
-      <w:r>
-        <w:t xml:space="preserve">Bei </w:t>
-      </w:r>
-      <w:r>
-        <w:rPr>
-          <w:b/>
-        </w:rPr>
-        <w:t>Arbeit</w:t>
-      </w:r>
-      <w:r>
-        <w:t>:</w:t>
-      </w:r>
-    </w:p>
-    <w:p>
-      <w:pPr>
-        <w:pStyle w:val="ListBullet2"/>
-      </w:pPr>
-      <w:r>
-        <w:rPr>
-          <w:b/>
-        </w:rPr>
-        <w:t>Ort</w:t>
-      </w:r>
-      <w:r>
-        <w:t xml:space="preserve"> eintragen (z. B. die Baustelle). Zuletzt verwendete Orte erscheinen als Schnellauswahl zum Antippen.</w:t>
-      </w:r>
-    </w:p>
-    <w:p>
-      <w:pPr>
-        <w:pStyle w:val="ListBullet2"/>
-      </w:pPr>
-      <w:r>
-        <w:rPr>
-          <w:b/>
-        </w:rPr>
-        <w:t>Beginn</w:t>
-      </w:r>
-      <w:r>
-        <w:t xml:space="preserve"> und </w:t>
-      </w:r>
-      <w:r>
-        <w:rPr>
-          <w:b/>
-        </w:rPr>
-        <w:t>Ende</w:t>
-      </w:r>
-      <w:r>
-        <w:t xml:space="preserve"> über die Uhr einstellen.</w:t>
-      </w:r>
-    </w:p>
-    <w:p>
-      <w:pPr>
-        <w:pStyle w:val="ListBullet2"/>
-      </w:pPr>
-      <w:r>
-        <w:rPr>
-          <w:b/>
-        </w:rPr>
-        <w:t>Pause</w:t>
-      </w:r>
-      <w:r>
-        <w:t xml:space="preserve"> über die runde Pausen-Uhr einstellen (in 5-Minuten-Schritten).</w:t>
-      </w:r>
-    </w:p>
-    <w:p>
-      <w:pPr>
-        <w:pStyle w:val="ListBullet2"/>
-      </w:pPr>
-      <w:r>
-        <w:t xml:space="preserve">Beginn, Ende und Pause sind mit Ihren Standardzeiten vorbelegt – meist muss man gar nichts ändern. Ist Ihr </w:t>
-      </w:r>
-      <w:r>
-        <w:rPr>
-          <w:b/>
-        </w:rPr>
-        <w:t>Freitag kürzer</w:t>
-      </w:r>
-      <w:r>
-        <w:t xml:space="preserve"> und sind eigene Freitagszeiten hinterlegt, verwendet die App am Freitag automatisch diese.</w:t>
-      </w:r>
-    </w:p>
-    <w:p>
-      <w:pPr>
-        <w:pStyle w:val="ListNumber"/>
-      </w:pPr>
-      <w:r>
-        <w:t xml:space="preserve">Bei allen anderen Tagesarten kann man über </w:t>
-      </w:r>
-      <w:r>
-        <w:rPr>
-          <w:b/>
-        </w:rPr>
-        <w:t>„bis-Datum wählen"</w:t>
-      </w:r>
-      <w:r>
-        <w:t xml:space="preserve"> gleich einen ganzen Zeitraum eintragen (z. B. zwei Wochen Urlaub) – Samstage und Sonntage werden automatisch übersprungen.</w:t>
-      </w:r>
-    </w:p>
-    <w:p>
-      <w:pPr>
-        <w:pStyle w:val="ListNumber"/>
-      </w:pPr>
-      <w:r>
-        <w:rPr>
-          <w:b/>
-        </w:rPr>
-        <w:t>Halbe und geteilte Urlaubstage:</w:t>
-      </w:r>
-      <w:r>
-        <w:t xml:space="preserve"> Bei einem einzelnen Urlaubs-, Sonderurlaubs- oder Zusatzurlaubstag steht im Feld </w:t>
-      </w:r>
-      <w:r>
-        <w:rPr>
-          <w:b/>
-        </w:rPr>
-        <w:t>„… (Stunden an diesem Tag)"</w:t>
-      </w:r>
-      <w:r>
-        <w:t xml:space="preserve"> zunächst Ihr volles Tagessoll. Tragen Sie </w:t>
-      </w:r>
-      <w:r>
-        <w:rPr>
-          <w:b/>
-        </w:rPr>
-        <w:t>weniger</w:t>
-      </w:r>
-      <w:r>
-        <w:t xml:space="preserve"> ein (z. B. </w:t>
-      </w:r>
-      <w:r>
-        <w:rPr>
-          <w:b/>
-        </w:rPr>
-        <w:t>6,25</w:t>
-      </w:r>
-      <w:r>
-        <w:t>), erscheinen darunter zusätzlich Ort, Beginn, Ende und Pause – so lässt sich ein Tag sauber aufteilen: ein Teil Urlaub, der Rest gearbeitet. Ein halber Tag ist also einfach die halbe Stundenzahl. Das Urlaubskonto wird entsprechend anteilig belastet.</w:t>
-      </w:r>
-    </w:p>
-    <w:p>
-      <w:pPr>
-        <w:pStyle w:val="ListNumber"/>
-      </w:pPr>
-      <w:r>
-        <w:t xml:space="preserve">Bei </w:t>
-      </w:r>
-      <w:r>
-        <w:rPr>
-          <w:b/>
-        </w:rPr>
-        <w:t>Sonderurlaub</w:t>
-      </w:r>
-      <w:r>
-        <w:t xml:space="preserve"> zusätzlich den </w:t>
-      </w:r>
-      <w:r>
-        <w:rPr>
-          <w:b/>
-        </w:rPr>
-        <w:t>Grund</w:t>
-      </w:r>
-      <w:r>
-        <w:t xml:space="preserve"> wählen: Pflegefreistellung, Umzug, Hochzeit, Geburt, Todesfall oder Sonstiges (bei „Sonstiges" den Anlass in die Notiz schreiben). Sonderurlaub wird </w:t>
-      </w:r>
-      <w:r>
-        <w:rPr>
-          <w:b/>
-        </w:rPr>
-        <w:t>gezählt, aber nicht vom Urlaubskonto abgezogen</w:t>
-      </w:r>
-      <w:r>
-        <w:t>.</w:t>
-      </w:r>
-    </w:p>
-    <w:p>
-      <w:pPr>
-        <w:pStyle w:val="ListNumber"/>
-      </w:pPr>
-      <w:r>
-        <w:t xml:space="preserve">Optional eine </w:t>
-      </w:r>
-      <w:r>
-        <w:rPr>
-          <w:b/>
-        </w:rPr>
-        <w:t>Notiz</w:t>
-      </w:r>
-      <w:r>
-        <w:t xml:space="preserve"> ergänzen (was/wie/wo/wer).</w:t>
-      </w:r>
-    </w:p>
-    <w:p>
-      <w:pPr>
-        <w:pStyle w:val="ListNumber"/>
-      </w:pPr>
-      <w:r>
-        <w:rPr>
-          <w:b/>
-        </w:rPr>
-        <w:t>Speichern.</w:t>
-      </w:r>
-      <w:r>
-        <w:t xml:space="preserve"> Über </w:t>
-      </w:r>
-      <w:r>
-        <w:rPr>
-          <w:b/>
-        </w:rPr>
-        <w:t>Löschen</w:t>
-      </w:r>
-      <w:r>
-        <w:t xml:space="preserve"> lässt sich ein bestehender Eintrag wieder entfernen.</w:t>
-      </w:r>
-    </w:p>
-    <w:p>
-      <w:pPr>
-        <w:pStyle w:val="Heading3"/>
-      </w:pPr>
-      <w:r>
-        <w:t>3.3 Monat weitergeben</w:t>
-      </w:r>
-    </w:p>
-    <w:p>
-      <w:r>
-        <w:t xml:space="preserve">Menü (⋮) → </w:t>
-      </w:r>
-      <w:r>
-        <w:rPr>
-          <w:b/>
-        </w:rPr>
-        <w:t>„Monat exportieren/senden"</w:t>
-      </w:r>
-      <w:r>
-        <w:t>. Der Bericht enthält immer eine Excel-Liste, ein PDF und eine Datendatei. Je nach Einrichtung stehen bis zu drei Wege zur Wahl:</w:t>
-      </w:r>
-    </w:p>
-    <w:p>
-      <w:pPr>
-        <w:pStyle w:val="ListBullet"/>
-      </w:pPr>
-      <w:r>
-        <w:rPr>
-          <w:b/>
-        </w:rPr>
-        <w:t>„Per Mail senden (automatisch)":</w:t>
-      </w:r>
-      <w:r>
-        <w:t xml:space="preserve"> verschickt den Bericht direkt an den hinterlegten Empfänger (nur wenn Sie den Mailversand eingerichtet haben; nicht in der Web-App).</w:t>
-      </w:r>
-    </w:p>
-    <w:p>
-      <w:pPr>
-        <w:pStyle w:val="ListBullet"/>
-      </w:pPr>
-      <w:r>
-        <w:rPr>
-          <w:b/>
-        </w:rPr>
-        <w:t>„Per Mail-App / Teilen weitergeben":</w:t>
-      </w:r>
-      <w:r>
-        <w:t xml:space="preserve"> öffnet das normale Teilen-Menü des Geräts (z. B. Mail-App).</w:t>
-      </w:r>
-    </w:p>
-    <w:p>
-      <w:pPr>
-        <w:pStyle w:val="ListBullet"/>
-      </w:pPr>
-      <w:r>
-        <w:rPr>
-          <w:b/>
-        </w:rPr>
-        <w:t>„Nur als Dateien speichern":</w:t>
-      </w:r>
-      <w:r>
-        <w:t xml:space="preserve"> legt die Dateien lokal ab (Windows: Ordner „Zeitexa-Exporte" in Dokumente; nicht in der Web-App).</w:t>
-      </w:r>
-    </w:p>
-    <w:p>
-      <w:r>
-        <w:t xml:space="preserve">Ist der </w:t>
-      </w:r>
-      <w:r>
-        <w:rPr>
-          <w:b/>
-        </w:rPr>
-        <w:t>automatische Versand</w:t>
-      </w:r>
-      <w:r>
-        <w:t xml:space="preserve"> eingeschaltet, verschickt Zeitexa den Vormonat beim ersten Start im neuen Monat von selbst und meldet das kurz.</w:t>
+        <w:t>Zeitraum wählen (von/bis) und Zeitexa zeigt eine Vorschau: eine Zeile je Monat mit Ist, Soll, Überstunden, Urlaub, Krank und Sonderurlaub, dazu ein Balkendiagramm Ist gegen Soll. Über den Export-Knopf lässt sich die Auswertung als Excel- oder PDF-Datei ausgeben – praktisch für den Jahresabschluss oder den Steuerberater.</w:t>
       </w:r>
     </w:p>
     <w:p>
@@ -1294,402 +1697,6 @@
         <w:pStyle w:val="Heading2"/>
       </w:pPr>
       <w:r>
-        <w:t>4. Verwaltung</w:t>
-      </w:r>
-    </w:p>
-    <w:p>
-      <w:r>
-        <w:t xml:space="preserve">Menü (⋮) → </w:t>
-      </w:r>
-      <w:r>
-        <w:rPr>
-          <w:b/>
-        </w:rPr>
-        <w:t>„Verwaltung"</w:t>
-      </w:r>
-      <w:r>
-        <w:t>. Drei Reiter:</w:t>
-      </w:r>
-    </w:p>
-    <w:p>
-      <w:pPr>
-        <w:pStyle w:val="Heading3"/>
-      </w:pPr>
-      <w:r>
-        <w:t>4.1 Reiter „Mein Profil"</w:t>
-      </w:r>
-    </w:p>
-    <w:p>
-      <w:r>
-        <w:t>Hier stehen alle Werte, mit denen Zeitexa rechnet:</w:t>
-      </w:r>
-    </w:p>
-    <w:p>
-      <w:pPr>
-        <w:pStyle w:val="ListBullet"/>
-      </w:pPr>
-      <w:r>
-        <w:rPr>
-          <w:b/>
-        </w:rPr>
-        <w:t>Ihr Name</w:t>
-      </w:r>
-      <w:r>
-        <w:t xml:space="preserve"> und Ihre </w:t>
-      </w:r>
-      <w:r>
-        <w:rPr>
-          <w:b/>
-        </w:rPr>
-        <w:t>E-Mail-Adresse</w:t>
-      </w:r>
-      <w:r>
-        <w:t xml:space="preserve"> (für die eigene Kopie beim Mail-Export).</w:t>
-      </w:r>
-    </w:p>
-    <w:p>
-      <w:pPr>
-        <w:pStyle w:val="ListBullet"/>
-      </w:pPr>
-      <w:r>
-        <w:rPr>
-          <w:b/>
-        </w:rPr>
-        <w:t>Sollstunden:</w:t>
-      </w:r>
-      <w:r>
-        <w:t xml:space="preserve"> entweder gleich für alle Tage (Mo–Fr) oder </w:t>
-      </w:r>
-      <w:r>
-        <w:rPr>
-          <w:b/>
-        </w:rPr>
-        <w:t>Mo–Do und Freitag getrennt</w:t>
-      </w:r>
-      <w:r>
-        <w:t>.</w:t>
-      </w:r>
-    </w:p>
-    <w:p>
-      <w:pPr>
-        <w:pStyle w:val="ListBullet"/>
-      </w:pPr>
-      <w:r>
-        <w:rPr>
-          <w:b/>
-        </w:rPr>
-        <w:t>Anfangsstand:</w:t>
-      </w:r>
-      <w:r>
-        <w:t xml:space="preserve"> Der </w:t>
-      </w:r>
-      <w:r>
-        <w:rPr>
-          <w:b/>
-        </w:rPr>
-        <w:t>Stichtag</w:t>
-      </w:r>
-      <w:r>
-        <w:t xml:space="preserve"> ist der Tag, ab dem Zeitexa mitrechnet. Tragen Sie hier ein, wie viel Resturlaub und wie viele Plus-/Minusstunden Sie an diesem Tag hatten – alles Weitere schreibt die App selbst fort.</w:t>
-      </w:r>
-    </w:p>
-    <w:p>
-      <w:pPr>
-        <w:pStyle w:val="ListBullet2"/>
-      </w:pPr>
-      <w:r>
-        <w:rPr>
-          <w:b/>
-        </w:rPr>
-        <w:t>„Freitags-Urlaub getrennt führen":</w:t>
-      </w:r>
-      <w:r>
-        <w:t xml:space="preserve"> eigenes Urlaubskonto für Freitage.</w:t>
-      </w:r>
-    </w:p>
-    <w:p>
-      <w:pPr>
-        <w:pStyle w:val="ListBullet2"/>
-      </w:pPr>
-      <w:r>
-        <w:rPr>
-          <w:b/>
-        </w:rPr>
-        <w:t>„Zusatzurlaub führen":</w:t>
-      </w:r>
-      <w:r>
-        <w:t xml:space="preserve"> eigenes Konto für zusätzlichen Urlaub (z. B. eine Extra-Woche). Verfällt nicht; den Stand erhöhen Sie jährlich selbst.</w:t>
-      </w:r>
-    </w:p>
-    <w:p>
-      <w:pPr>
-        <w:pStyle w:val="ListBullet2"/>
-      </w:pPr>
-      <w:r>
-        <w:rPr>
-          <w:b/>
-        </w:rPr>
-        <w:t>Zeitausgleich-Anfangsstand:</w:t>
-      </w:r>
-      <w:r>
-        <w:t xml:space="preserve"> Dezimalstunden mit </w:t>
-      </w:r>
-      <w:r>
-        <w:rPr>
-          <w:b/>
-        </w:rPr>
-        <w:t>+/−</w:t>
-      </w:r>
-      <w:r>
-        <w:t>-Umschalter (z. B. 43,35 oder −5).</w:t>
-      </w:r>
-    </w:p>
-    <w:p>
-      <w:pPr>
-        <w:pStyle w:val="ListBullet"/>
-      </w:pPr>
-      <w:r>
-        <w:rPr>
-          <w:b/>
-        </w:rPr>
-        <w:t>Standardzeiten</w:t>
-      </w:r>
-      <w:r>
-        <w:t xml:space="preserve"> für neue Arbeitstage (Beginn, Ende, Pause), auf Wunsch mit eigenen </w:t>
-      </w:r>
-      <w:r>
-        <w:rPr>
-          <w:b/>
-        </w:rPr>
-        <w:t>Freitagszeiten</w:t>
-      </w:r>
-      <w:r>
-        <w:t>.</w:t>
-      </w:r>
-    </w:p>
-    <w:p>
-      <w:r>
-        <w:t xml:space="preserve">Nicht vergessen: unten auf </w:t>
-      </w:r>
-      <w:r>
-        <w:rPr>
-          <w:b/>
-        </w:rPr>
-        <w:t>„Speichern"</w:t>
-      </w:r>
-      <w:r>
-        <w:t>. Damit verschwindet auch der Hinweisbalken aus Abschnitt 2.</w:t>
-      </w:r>
-    </w:p>
-    <w:p>
-      <w:pPr>
-        <w:pStyle w:val="Heading3"/>
-      </w:pPr>
-      <w:r>
-        <w:t>4.2 Reiter „Optionen"</w:t>
-      </w:r>
-    </w:p>
-    <w:p>
-      <w:pPr>
-        <w:pStyle w:val="ListBullet"/>
-      </w:pPr>
-      <w:r>
-        <w:rPr>
-          <w:b/>
-        </w:rPr>
-        <w:t>Mailversand:</w:t>
-      </w:r>
-      <w:r>
-        <w:t xml:space="preserve"> Empfänger der Monatsberichte (z. B. Auftraggeber, Steuerberater oder die eigene Adresse) sowie die Zugangsdaten Ihres Postausgangsservers (SMTP-Server, Port, Benutzer, Passwort). Mit </w:t>
-      </w:r>
-      <w:r>
-        <w:rPr>
-          <w:b/>
-        </w:rPr>
-        <w:t>„Testmail senden"</w:t>
-      </w:r>
-      <w:r>
-        <w:t xml:space="preserve"> lässt sich das sofort prüfen. Optional: </w:t>
-      </w:r>
-      <w:r>
-        <w:rPr>
-          <w:b/>
-        </w:rPr>
-        <w:t>automatischer Versand am Monatsanfang</w:t>
-      </w:r>
-      <w:r>
-        <w:t>.</w:t>
-      </w:r>
-    </w:p>
-    <w:p>
-      <w:pPr>
-        <w:pStyle w:val="ListBullet"/>
-      </w:pPr>
-      <w:r>
-        <w:rPr>
-          <w:b/>
-        </w:rPr>
-        <w:t>Bedienung:</w:t>
-      </w:r>
-      <w:r>
-        <w:t xml:space="preserve"> „Heute-Knopf öffnet den Tageseintrag".</w:t>
-      </w:r>
-    </w:p>
-    <w:p>
-      <w:pPr>
-        <w:pStyle w:val="ListBullet"/>
-      </w:pPr>
-      <w:r>
-        <w:rPr>
-          <w:b/>
-        </w:rPr>
-        <w:t>Sicherheit – App-Sperre:</w:t>
-      </w:r>
-      <w:r>
-        <w:t xml:space="preserve"> Standardmäßig </w:t>
-      </w:r>
-      <w:r>
-        <w:rPr>
-          <w:b/>
-        </w:rPr>
-        <w:t>aus</w:t>
-      </w:r>
-      <w:r>
-        <w:t xml:space="preserve">. Eingeschaltet fragt Zeitexa beim Start nach einem Passwort, das Sie selbst vergeben. </w:t>
-      </w:r>
-      <w:r>
-        <w:rPr>
-          <w:b/>
-        </w:rPr>
-        <w:t>Dieses Passwort lässt sich nicht wiederherstellen – notieren Sie es.</w:t>
-      </w:r>
-      <w:r>
-        <w:t xml:space="preserve"> Zusätzlich kann (Windows/Android) das </w:t>
-      </w:r>
-      <w:r>
-        <w:rPr>
-          <w:b/>
-        </w:rPr>
-        <w:t>Entsperren per Fingerabdruck</w:t>
-      </w:r>
-      <w:r>
-        <w:t xml:space="preserve"> aktiviert werden. Hinweis: Das Gerät unterscheidet keine Personen – jeder dort hinterlegte Fingerabdruck kann entsperren.</w:t>
-      </w:r>
-    </w:p>
-    <w:p>
-      <w:pPr>
-        <w:pStyle w:val="ListBullet"/>
-      </w:pPr>
-      <w:r>
-        <w:rPr>
-          <w:b/>
-        </w:rPr>
-        <w:t>Darstellung:</w:t>
-      </w:r>
-      <w:r>
-        <w:t xml:space="preserve"> eigenes </w:t>
-      </w:r>
-      <w:r>
-        <w:rPr>
-          <w:b/>
-        </w:rPr>
-        <w:t>Logo</w:t>
-      </w:r>
-      <w:r>
-        <w:t xml:space="preserve"> und eine </w:t>
-      </w:r>
-      <w:r>
-        <w:rPr>
-          <w:b/>
-        </w:rPr>
-        <w:t>Akzentfarbe</w:t>
-      </w:r>
-      <w:r>
-        <w:t xml:space="preserve"> wählen. Beides erscheint in der App und auf dem PDF-Bericht.</w:t>
-      </w:r>
-    </w:p>
-    <w:p>
-      <w:pPr>
-        <w:pStyle w:val="ListBullet"/>
-      </w:pPr>
-      <w:r>
-        <w:rPr>
-          <w:b/>
-        </w:rPr>
-        <w:t>Datensicherung</w:t>
-      </w:r>
-      <w:r>
-        <w:t xml:space="preserve"> (nicht in der Web-App): </w:t>
-      </w:r>
-      <w:r>
-        <w:rPr>
-          <w:b/>
-        </w:rPr>
-        <w:t>„Sicherung erstellen…"</w:t>
-      </w:r>
-      <w:r>
-        <w:t xml:space="preserve"> schreibt alle Daten in eine Datei </w:t>
-      </w:r>
-      <w:r>
-        <w:rPr>
-          <w:rFonts w:ascii="Consolas" w:hAnsi="Consolas"/>
-          <w:sz w:val="20"/>
-        </w:rPr>
-        <w:t>Zeitexa_Sicherung_JJJJ-MM-TT.zeitexadb</w:t>
-      </w:r>
-      <w:r>
-        <w:t xml:space="preserve">, </w:t>
-      </w:r>
-      <w:r>
-        <w:rPr>
-          <w:b/>
-        </w:rPr>
-        <w:t>„Sicherung wiederherstellen…"</w:t>
-      </w:r>
-      <w:r>
-        <w:t xml:space="preserve"> spielt sie zurück. Beim Wiederherstellen wird der gesamte Bestand ersetzt. Sicherungen anderer Programme (etwa der Firmenversion Zeitrax) weist Zeitexa ab.</w:t>
-      </w:r>
-    </w:p>
-    <w:p>
-      <w:pPr>
-        <w:pStyle w:val="ListBullet"/>
-      </w:pPr>
-      <w:r>
-        <w:rPr>
-          <w:b/>
-        </w:rPr>
-        <w:t>Lizenz:</w:t>
-      </w:r>
-      <w:r>
-        <w:t xml:space="preserve"> eine neue Lizenzdatei des Entwicklers einspielen.</w:t>
-      </w:r>
-    </w:p>
-    <w:p>
-      <w:pPr>
-        <w:pStyle w:val="Heading3"/>
-      </w:pPr>
-      <w:r>
-        <w:t>4.3 Reiter „Auswertung"</w:t>
-      </w:r>
-    </w:p>
-    <w:p>
-      <w:r>
-        <w:t>Zeitraum wählen (von/bis) und Zeitexa zeigt eine Vorschau: eine Zeile je Monat mit Ist, Soll, Überstunden, Urlaub, Krank und Sonderurlaub, dazu ein Balkendiagramm Ist gegen Soll. Über den Export-Knopf lässt sich die Auswertung als Excel- oder PDF-Datei ausgeben – praktisch für den Jahresabschluss oder den Steuerberater.</w:t>
-      </w:r>
-    </w:p>
-    <w:p>
-      <w:pPr>
-        <w:jc w:val="center"/>
-      </w:pPr>
-      <w:r>
-        <w:t>· · ·</w:t>
-      </w:r>
-    </w:p>
-    <w:p>
-      <w:pPr>
-        <w:pStyle w:val="Heading2"/>
-      </w:pPr>
-      <w:r>
         <w:t>5. Häufige Fragen</w:t>
       </w:r>
     </w:p>
@@ -1711,12 +1718,21 @@
         <w:rPr>
           <w:b/>
         </w:rPr>
-        <w:t>Ich habe mich beim Namen für die Lizenz vertippt.</w:t>
+        <w:t>Mein Name ist in der Lizenz falsch geschrieben (oder hat sich geändert).</w:t>
       </w:r>
     </w:p>
     <w:p>
       <w:r>
-        <w:t>Melden Sie sich beim Entwickler – er kann den hinterlegten Namen mit seinem Passwort direkt korrigieren.</w:t>
+        <w:t xml:space="preserve">Melden Sie sich beim Entwickler – er stellt eine korrigierte Lizenzdatei aus. Diese unter Verwaltung → Optionen → </w:t>
+      </w:r>
+      <w:r>
+        <w:rPr>
+          <w:b/>
+        </w:rPr>
+        <w:t>„Lizenzdatei importieren…"</w:t>
+      </w:r>
+      <w:r>
+        <w:t xml:space="preserve"> einspielen; der neue Name gilt sofort überall (auch auf den Berichten).</w:t>
       </w:r>
     </w:p>
     <w:p>
@@ -1729,7 +1745,16 @@
     </w:p>
     <w:p>
       <w:r>
-        <w:t xml:space="preserve">Ja. Freischalten mit demselben Code, danach den Namen eintragen. Die Geräte gleichen sich aber </w:t>
+        <w:t xml:space="preserve">Ja. Am einfachsten unter Verwaltung → Optionen die </w:t>
+      </w:r>
+      <w:r>
+        <w:rPr>
+          <w:b/>
+        </w:rPr>
+        <w:t>Lizenzdatei exportieren</w:t>
+      </w:r>
+      <w:r>
+        <w:t xml:space="preserve"> und am neuen Gerät importieren (oder dort denselben Freischaltcode eingeben). Die Geräte gleichen sich aber </w:t>
       </w:r>
       <w:r>
         <w:rPr>
@@ -1738,7 +1763,7 @@
         <w:t>nicht</w:t>
       </w:r>
       <w:r>
-        <w:t xml:space="preserve"> miteinander ab – jedes führt seinen eigenen Bestand. Um umzuziehen, verwenden Sie „Sicherung erstellen" und spielen die Datei am neuen Gerät ein.</w:t>
+        <w:t xml:space="preserve"> miteinander ab – jedes führt seinen eigenen Bestand. Um komplett umzuziehen, verwenden Sie „Sicherung erstellen" und spielen die Datei am neuen Gerät ein.</w:t>
       </w:r>
     </w:p>
     <w:p>

</xml_diff>

<commit_message>
v1.2.0: Windows-Lieferpaket, Jetzt-Buttons in der Anleitung, -NurWindows-Schalter
- ANLEITUNG erwaehnt die Jetzt-Beginn/Jetzt-Ende-Buttons, DOCX neu erzeugt
- erstelle_paket.ps1 kann mit -NurWindows die Android-APK weglassen
</commit_message>
<xml_diff>
--- a/ANLEITUNG.docx
+++ b/ANLEITUNG.docx
@@ -1011,7 +1011,25 @@
         <w:t>Ende</w:t>
       </w:r>
       <w:r>
-        <w:t xml:space="preserve"> über die Uhr einstellen.</w:t>
+        <w:t xml:space="preserve"> über die Uhr einstellen. Mit </w:t>
+      </w:r>
+      <w:r>
+        <w:rPr>
+          <w:b/>
+        </w:rPr>
+        <w:t>„Jetzt Beginn"</w:t>
+      </w:r>
+      <w:r>
+        <w:t xml:space="preserve"> bzw. </w:t>
+      </w:r>
+      <w:r>
+        <w:rPr>
+          <w:b/>
+        </w:rPr>
+        <w:t>„Jetzt Ende"</w:t>
+      </w:r>
+      <w:r>
+        <w:t xml:space="preserve"> übernimmt die App die aktuelle Uhrzeit mit einem Tipp – praktisch, wenn man direkt beim Kommen oder Gehen stempelt.</w:t>
       </w:r>
     </w:p>
     <w:p>

</xml_diff>

<commit_message>
v1.3.0: JSON-Vollsicherung auf allen Geraeten, automatische Auswertung, Sicherung optional an der Monats-Mail
- Sicherung als JSON-Vollsicherung (lib/logic/backup_json.dart): erstellen
  und wiederherstellen jetzt auch in der Web-App; alte SQLite-Sicherungen
  bleiben auf Windows/Android einspielbar
- Auswertungs-Reiter fasst die eigenen Eintraege automatisch pro Monat
  zusammen (lib/logic/auswertung.dart, Live-Stream) - kein JSON-Import
  per Mail mehr
- Neuer Schalter "Sicherung an die Export-Mail anhaengen"
  (SettingsKeys.sicherungMitMail): haengt die Vollsicherung an SMTP- und
  Teilen-Versand, auch beim automatischen Monatsversand
- ANLEITUNG.md/.docx nachgezogen; Tests: auswertung_test,
  backup_json_test, auswertung_view_test umgeschrieben (85 gruen)
</commit_message>
<xml_diff>
--- a/ANLEITUNG.docx
+++ b/ANLEITUNG.docx
@@ -540,7 +540,16 @@
         <w:t>Browser-Speicher</w:t>
       </w:r>
       <w:r>
-        <w:t xml:space="preserve"> des Geräts. Achtung: Wer in Safari „Verlauf und Websitedaten löschen" ausführt, löscht auch die Zeitexa-Daten. Deshalb den Monatsbericht regelmäßig versenden.</w:t>
+        <w:t xml:space="preserve"> des Geräts. Achtung: Wer in Safari „Verlauf und Websitedaten löschen" ausführt, löscht auch die Zeitexa-Daten. Deshalb regelmäßig eine </w:t>
+      </w:r>
+      <w:r>
+        <w:rPr>
+          <w:b/>
+        </w:rPr>
+        <w:t>Sicherung erstellen</w:t>
+      </w:r>
+      <w:r>
+        <w:t xml:space="preserve"> (Verwaltung → Optionen → Datensicherung) und den Monatsbericht versenden.</w:t>
       </w:r>
     </w:p>
     <w:p>
@@ -563,7 +572,7 @@
         <w:t>Teilen-Menü</w:t>
       </w:r>
       <w:r>
-        <w:t xml:space="preserve"> weitergegeben (z. B. an die Mail-App).</w:t>
+        <w:t xml:space="preserve"> weitergegeben (z. B. an die Mail-App). Auch die Sicherungsdatei geht über das Teilen-Menü hinaus (z. B. „In Dateien sichern" oder per Mail an sich selbst).</w:t>
       </w:r>
     </w:p>
     <w:p>
@@ -574,10 +583,10 @@
         <w:rPr>
           <w:b/>
         </w:rPr>
-        <w:t>Keine Datensicherung und kein Entsperren per Fingerabdruck</w:t>
-      </w:r>
-      <w:r>
-        <w:t xml:space="preserve"> – diese Funktionen gibt es nur in der Windows- und Android-Version.</w:t>
+        <w:t>Kein Entsperren per Fingerabdruck</w:t>
+      </w:r>
+      <w:r>
+        <w:t xml:space="preserve"> – diese Funktion gibt es nur in der Windows- und Android-Version.</w:t>
       </w:r>
     </w:p>
     <w:p>
@@ -1534,7 +1543,16 @@
         <w:t>automatischer Versand am Monatsanfang</w:t>
       </w:r>
       <w:r>
-        <w:t>.</w:t>
+        <w:t xml:space="preserve">. Mit </w:t>
+      </w:r>
+      <w:r>
+        <w:rPr>
+          <w:b/>
+        </w:rPr>
+        <w:t>„Sicherung an die Export-Mail anhängen"</w:t>
+      </w:r>
+      <w:r>
+        <w:t xml:space="preserve"> bekommt jede Monats-Mail (auch die automatische) zusätzlich eine komplette Datensicherung als Anhang – so liegt jeden Monat ein aktueller Stand im Postfach, ohne dass Sie daran denken müssen. Standardmäßig ist der Schalter aus.</w:t>
       </w:r>
     </w:p>
     <w:p>
@@ -1623,10 +1641,10 @@
         <w:rPr>
           <w:b/>
         </w:rPr>
-        <w:t>Datensicherung</w:t>
-      </w:r>
-      <w:r>
-        <w:t xml:space="preserve"> (nicht in der Web-App): </w:t>
+        <w:t>Datensicherung:</w:t>
+      </w:r>
+      <w:r>
+        <w:t xml:space="preserve"> </w:t>
       </w:r>
       <w:r>
         <w:rPr>
@@ -1654,7 +1672,34 @@
         <w:t>„Sicherung wiederherstellen…"</w:t>
       </w:r>
       <w:r>
-        <w:t xml:space="preserve"> spielt sie zurück. Beim Wiederherstellen wird der gesamte Bestand ersetzt. Sicherungen anderer Programme (etwa der Firmenversion Zeitrax) weist Zeitexa ab.</w:t>
+        <w:t xml:space="preserve"> spielt sie zurück. Das funktioniert auf </w:t>
+      </w:r>
+      <w:r>
+        <w:rPr>
+          <w:b/>
+        </w:rPr>
+        <w:t>allen Geräten</w:t>
+      </w:r>
+      <w:r>
+        <w:t xml:space="preserve"> – auch in der Web-App (dort geht die Datei über das Teilen-Menü hinaus bzw. wird heruntergeladen, z. B. „In Dateien sichern") – und die Datei lässt sich </w:t>
+      </w:r>
+      <w:r>
+        <w:rPr>
+          <w:b/>
+        </w:rPr>
+        <w:t>geräteübergreifend</w:t>
+      </w:r>
+      <w:r>
+        <w:t xml:space="preserve"> einspielen, etwa vom alten Handy am neuen oder vom PC am iPhone. Beim Wiederherstellen wird der gesamte Bestand ersetzt. Sicherungen anderer Programme (etwa der Firmenversion Zeitrax) weist Zeitexa ab. Hinweis: Sicherungen aus Zeitexa-Versionen </w:t>
+      </w:r>
+      <w:r>
+        <w:rPr>
+          <w:b/>
+        </w:rPr>
+        <w:t>vor 1.3</w:t>
+      </w:r>
+      <w:r>
+        <w:t xml:space="preserve"> lassen sich nur in der Windows- und Android-App einspielen, nicht in der Web-App – bei Bedarf einfach dort eine neue Sicherung erstellen.</w:t>
       </w:r>
     </w:p>
     <w:p>
@@ -1699,7 +1744,25 @@
     </w:p>
     <w:p>
       <w:r>
-        <w:t>Zeitraum wählen (von/bis) und Zeitexa zeigt eine Vorschau: eine Zeile je Monat mit Ist, Soll, Überstunden, Urlaub, Krank und Sonderurlaub, dazu ein Balkendiagramm Ist gegen Soll. Über den Export-Knopf lässt sich die Auswertung als Excel- oder PDF-Datei ausgeben – praktisch für den Jahresabschluss oder den Steuerberater.</w:t>
+        <w:t xml:space="preserve">Die Auswertung entsteht </w:t>
+      </w:r>
+      <w:r>
+        <w:rPr>
+          <w:b/>
+        </w:rPr>
+        <w:t>automatisch</w:t>
+      </w:r>
+      <w:r>
+        <w:t xml:space="preserve"> aus Ihren Einträgen – nichts importieren, nichts anstoßen: Jeder erfasste Monat erscheint hier von selbst als eine Zeile mit Ist, Soll, Überstunden, Urlaub, Sonder- und Zusatzurlaub, Krank, Zeitausgleich und Feiertagen, dazu zwei Diagramme (Überstunden je Monat sowie Ist gegen Soll). Über </w:t>
+      </w:r>
+      <w:r>
+        <w:rPr>
+          <w:b/>
+        </w:rPr>
+        <w:t>„Auswertung exportieren"</w:t>
+      </w:r>
+      <w:r>
+        <w:t xml:space="preserve"> lässt sich das Ganze als Excel- und PDF-Datei ausgeben – praktisch für den Jahresabschluss oder den Steuerberater.</w:t>
       </w:r>
     </w:p>
     <w:p>
@@ -1781,7 +1844,7 @@
         <w:t>nicht</w:t>
       </w:r>
       <w:r>
-        <w:t xml:space="preserve"> miteinander ab – jedes führt seinen eigenen Bestand. Um komplett umzuziehen, verwenden Sie „Sicherung erstellen" und spielen die Datei am neuen Gerät ein.</w:t>
+        <w:t xml:space="preserve"> miteinander ab – jedes führt seinen eigenen Bestand. Um komplett umzuziehen (z. B. auf ein neues Handy), verwenden Sie „Sicherung erstellen" und spielen die Datei am neuen Gerät ein – das geht auf allen Geräten, auch in der Web-App am iPhone.</w:t>
       </w:r>
     </w:p>
     <w:p>

</xml_diff>

<commit_message>
v1.4.0: Mehrfaches Stempeln, Wochentags-Soll, 12h-Pausenregel, Ansicht & Stabilitaet
- Zeitbloecke: mehrmaliges An-/Abstempeln pro Tag (neue Tabelle, Migration v5);
  Luecken zaehlen als Pause, offener Block bleibt offen mit Warnhinweis
- Sollstunden pro Wochentag (Mo-So) als dritter Modus, mit Live-Wochensumme
- Optionale automatische Pausenregel (Mindestpause auffuellen, einstellbar, Standard aus)
- Monatsansicht: Streams in Provider ausgelagert (behebt Haenger/weissen Bildschirm),
  Monats-Dropdown + Kalender-Icon, Spaltenkoepfe Tag/Zeiten/Ist/Soll/+-, Heute-Autoscroll
- Eintragsmaske: Doppeltipp-Sperre auf Speichern/Loeschen (behebt weissen Bildschirm)
- Deutsche Lokalisierung (flutter_localizations) fuer Kalender/Zeitwaehler
- Stilles Fehlerprotokoll (Datei im App-Ordner, Oberflaeche unveraendert)
- Tests fuer Bloecke, Pausenregel, Wochentags-Soll, Backup-Roundtrip
</commit_message>
<xml_diff>
--- a/ANLEITUNG.docx
+++ b/ANLEITUNG.docx
@@ -878,10 +878,19 @@
         <w:rPr>
           <w:b/>
         </w:rPr>
-        <w:t>Tagesliste:</w:t>
-      </w:r>
-      <w:r>
-        <w:t xml:space="preserve"> eine Zeile pro Tag. Wochenenden und Feiertage sind farbig hervorgehoben, der heutige Tag ist markiert. Jede Zeile zeigt die Uhrzeiten, Pause und Ort (bzw. die Tagesart wie „Urlaub"), eine eventuelle Notiz sowie Ist/Soll und Überstunden des Tages.</w:t>
+        <w:t>Spaltenköpfe:</w:t>
+      </w:r>
+      <w:r>
+        <w:t xml:space="preserve"> Direkt über der Liste steht fest, welche Zahl was bedeutet: </w:t>
+      </w:r>
+      <w:r>
+        <w:rPr>
+          <w:b/>
+        </w:rPr>
+        <w:t>Tag · Zeiten · Ist · Soll · ±</w:t>
+      </w:r>
+      <w:r>
+        <w:t xml:space="preserve"> (± = Differenz Ist minus Soll, grün Plus / rot Minus).</w:t>
       </w:r>
     </w:p>
     <w:p>
@@ -892,10 +901,19 @@
         <w:rPr>
           <w:b/>
         </w:rPr>
-        <w:t>Pfeile</w:t>
-      </w:r>
-      <w:r>
-        <w:t xml:space="preserve"> links/rechts oben wechseln den Monat.</w:t>
+        <w:t>Tagesliste:</w:t>
+      </w:r>
+      <w:r>
+        <w:t xml:space="preserve"> eine Zeile pro Tag. Wochenenden und Feiertage sind farbig hervorgehoben, der heutige Tag ist farbig hinterlegt und mit einem Punkt markiert – beim Öffnen rollt die Liste automatisch dorthin. Jede Zeile zeigt die Uhrzeiten, Pause und Ort (bzw. die Tagesart wie „Urlaub"), eine eventuelle Notiz sowie Ist, Soll und die Differenz. Wurde an einem Tag </w:t>
+      </w:r>
+      <w:r>
+        <w:rPr>
+          <w:b/>
+        </w:rPr>
+        <w:t>mehrmals gestempelt</w:t>
+      </w:r>
+      <w:r>
+        <w:t>, steht dort z. B. „07:00–17:30 · 2 Blöcke · 45 min Pause".</w:t>
       </w:r>
     </w:p>
     <w:p>
@@ -906,6 +924,47 @@
         <w:rPr>
           <w:b/>
         </w:rPr>
+        <w:t>Monat wählen:</w:t>
+      </w:r>
+      <w:r>
+        <w:t xml:space="preserve"> Oben links auf den </w:t>
+      </w:r>
+      <w:r>
+        <w:rPr>
+          <w:b/>
+        </w:rPr>
+        <w:t>Monatsnamen</w:t>
+      </w:r>
+      <w:r>
+        <w:t xml:space="preserve"> tippen öffnet eine Liste zum direkten Anspringen. Das </w:t>
+      </w:r>
+      <w:r>
+        <w:rPr>
+          <w:b/>
+        </w:rPr>
+        <w:t>Kalender-Symbol</w:t>
+      </w:r>
+      <w:r>
+        <w:t xml:space="preserve"> daneben öffnet einen (deutschen) Kalender zum Springen in einen beliebigen Monat. Die </w:t>
+      </w:r>
+      <w:r>
+        <w:rPr>
+          <w:b/>
+        </w:rPr>
+        <w:t>Pfeile</w:t>
+      </w:r>
+      <w:r>
+        <w:t xml:space="preserve"> rechts wechseln zum Nachbarmonat.</w:t>
+      </w:r>
+    </w:p>
+    <w:p>
+      <w:pPr>
+        <w:pStyle w:val="ListBullet"/>
+      </w:pPr>
+      <w:r>
+        <w:rPr>
+          <w:b/>
+        </w:rPr>
         <w:t>„Heute"-Knopf:</w:t>
       </w:r>
       <w:r>
@@ -1049,10 +1108,28 @@
         <w:rPr>
           <w:b/>
         </w:rPr>
-        <w:t>Pause</w:t>
-      </w:r>
-      <w:r>
-        <w:t xml:space="preserve"> über die runde Pausen-Uhr einstellen (in 5-Minuten-Schritten).</w:t>
+        <w:t>Mehrmals am Tag stempeln:</w:t>
+      </w:r>
+      <w:r>
+        <w:t xml:space="preserve"> Mit </w:t>
+      </w:r>
+      <w:r>
+        <w:rPr>
+          <w:b/>
+        </w:rPr>
+        <w:t>„Block hinzufügen"</w:t>
+      </w:r>
+      <w:r>
+        <w:t xml:space="preserve"> lassen sich beliebig viele Zeitblöcke am selben Tag erfassen (z. B. Vormittag, Nachmittag, Abend). Bei mehreren Blöcken zählen die </w:t>
+      </w:r>
+      <w:r>
+        <w:rPr>
+          <w:b/>
+        </w:rPr>
+        <w:t>Lücken automatisch als Pause</w:t>
+      </w:r>
+      <w:r>
+        <w:t xml:space="preserve"> – das Pausenfeld entfällt dann. Wer nur einstempelt und das Ende offen lässt, sieht den Tag in der Liste als „läuft seit … · noch nicht ausgestempelt"; er zählt 0 Stunden, bis das Ende nachgetragen wird.</w:t>
       </w:r>
     </w:p>
     <w:p>
@@ -1060,6 +1137,20 @@
         <w:pStyle w:val="ListBullet2"/>
       </w:pPr>
       <w:r>
+        <w:rPr>
+          <w:b/>
+        </w:rPr>
+        <w:t>Pause</w:t>
+      </w:r>
+      <w:r>
+        <w:t xml:space="preserve"> (bei nur einem Block) über die runde Pausen-Uhr einstellen (in 5-Minuten-Schritten).</w:t>
+      </w:r>
+    </w:p>
+    <w:p>
+      <w:pPr>
+        <w:pStyle w:val="ListBullet2"/>
+      </w:pPr>
+      <w:r>
         <w:t xml:space="preserve">Beginn, Ende und Pause sind mit Ihren Standardzeiten vorbelegt – meist muss man gar nichts ändern. Ist Ihr </w:t>
       </w:r>
       <w:r>
@@ -1374,7 +1465,7 @@
         <w:t>Sollstunden:</w:t>
       </w:r>
       <w:r>
-        <w:t xml:space="preserve"> entweder gleich für alle Tage (Mo–Fr) oder </w:t>
+        <w:t xml:space="preserve"> drei Möglichkeiten – gleich für alle Tage (Mo–Fr), </w:t>
       </w:r>
       <w:r>
         <w:rPr>
@@ -1383,7 +1474,48 @@
         <w:t>Mo–Do und Freitag getrennt</w:t>
       </w:r>
       <w:r>
-        <w:t>.</w:t>
+        <w:t xml:space="preserve">, oder </w:t>
+      </w:r>
+      <w:r>
+        <w:rPr>
+          <w:b/>
+        </w:rPr>
+        <w:t>Pro Wochentag</w:t>
+      </w:r>
+      <w:r>
+        <w:t xml:space="preserve"> (jeder Tag Mo–So einzeln). Der letzte Modus eignet sich z. B. für eine 25-Stunden-Woche oder einen freien Mittwoch; darunter wird die </w:t>
+      </w:r>
+      <w:r>
+        <w:rPr>
+          <w:b/>
+        </w:rPr>
+        <w:t>Wochensumme</w:t>
+      </w:r>
+      <w:r>
+        <w:t xml:space="preserve"> laufend angezeigt, damit man sofort sieht, ob es aufgeht.</w:t>
+      </w:r>
+    </w:p>
+    <w:p>
+      <w:pPr>
+        <w:pStyle w:val="ListBullet"/>
+      </w:pPr>
+      <w:r>
+        <w:rPr>
+          <w:b/>
+        </w:rPr>
+        <w:t>Automatische Pause:</w:t>
+      </w:r>
+      <w:r>
+        <w:t xml:space="preserve"> Optional (standardmäßig aus). Eingeschaltet muss die Pause ab einer einstellbaren Anwesenheit (Vorschlag 12 Stunden) mindestens eine einstellbare Dauer (Vorschlag 60 Minuten) betragen. Eine bereits erfasste oder aus Blocklücken errechnete Pause wird dabei nur </w:t>
+      </w:r>
+      <w:r>
+        <w:rPr>
+          <w:b/>
+        </w:rPr>
+        <w:t>aufgefüllt</w:t>
+      </w:r>
+      <w:r>
+        <w:t>, nie doppelt abgezogen.</w:t>
       </w:r>
     </w:p>
     <w:p>

</xml_diff>

<commit_message>
v1.4.1: Mehrere Bloecke = Summe der Bloecke (Luecke zaehlt nicht), Pause pro Block
- Zeitbloecke.pauseMin (Migration v6): jeder Stempel-Block hat eine eigene Pause
- IST-Zeit = Summe der Bloecke; die Luecke zwischen Bloecken zaehlt NICHT
  (weder Arbeit noch Pause). istStunden ist jetzt block-genau; die
  Auto-Pausenregel greift auf die Brutto-Arbeitszeit (ohne Luecken).
- Bloecke werden in Berechnung/Konten/Auswertung/Export durchgereicht
  (monatBloeckeProvider/alleBloeckeProvider bzw. Future im Export/Auswertung)
- Eintragsmaske: Pausenfeld pro Block statt Tagespause
- Anzeige: Luecke wird nie als Pause dargestellt
- Tests fuer Summenlogik, Pause pro Block, Auto-Pause auf Brutto; 100 gruen
</commit_message>
<xml_diff>
--- a/ANLEITUNG.docx
+++ b/ANLEITUNG.docx
@@ -1120,16 +1120,34 @@
         <w:t>„Block hinzufügen"</w:t>
       </w:r>
       <w:r>
-        <w:t xml:space="preserve"> lassen sich beliebig viele Zeitblöcke am selben Tag erfassen (z. B. Vormittag, Nachmittag, Abend). Bei mehreren Blöcken zählen die </w:t>
+        <w:t xml:space="preserve"> lassen sich beliebig viele Zeitblöcke am selben Tag erfassen (z. B. Vormittag, Nachmittag, Abend). Die </w:t>
       </w:r>
       <w:r>
         <w:rPr>
           <w:b/>
         </w:rPr>
-        <w:t>Lücken automatisch als Pause</w:t>
-      </w:r>
-      <w:r>
-        <w:t xml:space="preserve"> – das Pausenfeld entfällt dann. Wer nur einstempelt und das Ende offen lässt, sieht den Tag in der Liste als „läuft seit … · noch nicht ausgestempelt"; er zählt 0 Stunden, bis das Ende nachgetragen wird.</w:t>
+        <w:t>IST-Zeit ist die Summe der Blöcke</w:t>
+      </w:r>
+      <w:r>
+        <w:t xml:space="preserve">; die Zeit </w:t>
+      </w:r>
+      <w:r>
+        <w:rPr>
+          <w:b/>
+        </w:rPr>
+        <w:t>zwischen</w:t>
+      </w:r>
+      <w:r>
+        <w:t xml:space="preserve"> zwei Blöcken zählt </w:t>
+      </w:r>
+      <w:r>
+        <w:rPr>
+          <w:b/>
+        </w:rPr>
+        <w:t>nicht</w:t>
+      </w:r>
+      <w:r>
+        <w:t xml:space="preserve"> – weder als Arbeit noch als Pause. Wer nur einstempelt und das Ende offen lässt, sieht den Tag in der Liste als „läuft seit … · noch nicht ausgestempelt"; er zählt 0 Stunden, bis das Ende nachgetragen wird.</w:t>
       </w:r>
     </w:p>
     <w:p>
@@ -1140,10 +1158,10 @@
         <w:rPr>
           <w:b/>
         </w:rPr>
-        <w:t>Pause</w:t>
-      </w:r>
-      <w:r>
-        <w:t xml:space="preserve"> (bei nur einem Block) über die runde Pausen-Uhr einstellen (in 5-Minuten-Schritten).</w:t>
+        <w:t>Pause pro Block</w:t>
+      </w:r>
+      <w:r>
+        <w:t xml:space="preserve"> über die runde Pausen-Uhr einstellen (in 5-Minuten-Schritten) – jeder Block hat seine eigene Pause. Zusätzlich kann die automatische Pausenregel (Abschnitt 4.1) greifen.</w:t>
       </w:r>
     </w:p>
     <w:p>

</xml_diff>